<commit_message>
Deploying to gh-pages from @ Morrison-Lab/mds@3ff2f4573fd55e9fd1877c7fb2097d7a6e880444 🚀
</commit_message>
<xml_diff>
--- a/expressions-algorithms.docx
+++ b/expressions-algorithms.docx
@@ -15,7 +15,7 @@
         <w:pStyle w:val="Date"/>
       </w:pPr>
       <w:r>
-        <w:t xml:space="preserve">Last modified: 2026-10-26 12:55:55 (PDT)</w:t>
+        <w:t xml:space="preserve">Last modified: 2026-10-26 14:36:46 (PDT)</w:t>
       </w:r>
     </w:p>
     <w:p>
@@ -65,7 +65,7 @@
         <w:t xml:space="preserve">the parse trees of expressions, and algorithms, which compute those functions.</w:t>
       </w:r>
     </w:p>
-    <w:bookmarkStart w:id="16" w:name="expressions"/>
+    <w:bookmarkStart w:id="26" w:name="expressions"/>
     <w:p>
       <w:pPr>
         <w:pStyle w:val="Heading2"/>
@@ -74,7 +74,7 @@
         <w:t xml:space="preserve">1 Expressions</w:t>
       </w:r>
     </w:p>
-    <w:bookmarkStart w:id="11" w:name="def-expression"/>
+    <w:bookmarkStart w:id="10" w:name="def-expression"/>
     <w:p>
       <w:pPr>
         <w:pStyle w:val="FirstParagraph"/>
@@ -120,25 +120,44 @@
       <w:r>
         <w:t xml:space="preserve">operations and function names according to the rules of the notation.</w:t>
       </w:r>
-      <w:r>
-        <w:t xml:space="preserve"> </w:t>
-      </w:r>
-      <w:r>
-        <w:t xml:space="preserve">When its variables are read as inputs,</w:t>
-      </w:r>
-      <w:r>
-        <w:t xml:space="preserve"> </w:t>
-      </w:r>
-      <w:r>
-        <w:t xml:space="preserve">an expression</w:t>
-      </w:r>
-      <w:r>
-        <w:t xml:space="preserve"> </w:t>
-      </w:r>
+    </w:p>
+    <w:bookmarkEnd w:id="10"/>
+    <w:bookmarkStart w:id="14" w:name="def-denotes"/>
+    <w:p>
+      <w:pPr>
+        <w:pStyle w:val="BodyText"/>
+      </w:pPr>
       <w:r>
         <w:rPr>
-          <w:i/>
-          <w:iCs/>
+          <w:b/>
+          <w:bCs/>
+        </w:rPr>
+        <w:t xml:space="preserve">Definition 2 (Denotes)</w:t>
+      </w:r>
+      <w:r>
+        <w:t xml:space="preserve"> </w:t>
+      </w:r>
+      <w:r>
+        <w:t xml:space="preserve">An</w:t>
+      </w:r>
+      <w:r>
+        <w:t xml:space="preserve"> </w:t>
+      </w:r>
+      <w:hyperlink w:anchor="def-expression">
+        <w:r>
+          <w:rPr>
+            <w:rStyle w:val="Hyperlink"/>
+          </w:rPr>
+          <w:t xml:space="preserve">expression</w:t>
+        </w:r>
+      </w:hyperlink>
+      <w:r>
+        <w:t xml:space="preserve"> </w:t>
+      </w:r>
+      <w:r>
+        <w:rPr>
+          <w:b/>
+          <w:bCs/>
         </w:rPr>
         <w:t xml:space="preserve">denotes</w:t>
       </w:r>
@@ -151,7 +170,7 @@
       <w:r>
         <w:t xml:space="preserve"> </w:t>
       </w:r>
-      <w:hyperlink r:id="rId10">
+      <w:hyperlink r:id="rId11">
         <w:r>
           <w:rPr>
             <w:rStyle w:val="Hyperlink"/>
@@ -160,17 +179,60 @@
         </w:r>
       </w:hyperlink>
       <w:r>
-        <w:t xml:space="preserve">:</w:t>
-      </w:r>
-      <w:r>
-        <w:t xml:space="preserve"> </w:t>
-      </w:r>
-      <w:r>
-        <w:t xml:space="preserve">it fixes the output for each input.</w:t>
+        <w:t xml:space="preserve"> </w:t>
+      </w:r>
+      <w:r>
+        <w:t xml:space="preserve">when evaluating the expression at each</w:t>
+      </w:r>
+      <w:r>
+        <w:t xml:space="preserve"> </w:t>
+      </w:r>
+      <w:hyperlink r:id="rId12">
+        <w:r>
+          <w:rPr>
+            <w:rStyle w:val="Hyperlink"/>
+          </w:rPr>
+          <w:t xml:space="preserve">input</w:t>
+        </w:r>
+      </w:hyperlink>
+      <w:r>
+        <w:t xml:space="preserve"> </w:t>
+      </w:r>
+      <w:r>
+        <w:t xml:space="preserve">of the function,</w:t>
+      </w:r>
+      <w:r>
+        <w:t xml:space="preserve"> </w:t>
+      </w:r>
+      <w:r>
+        <w:t xml:space="preserve">with the expression’s variables taking that input,</w:t>
+      </w:r>
+      <w:r>
+        <w:t xml:space="preserve"> </w:t>
+      </w:r>
+      <w:r>
+        <w:t xml:space="preserve">gives the function’s</w:t>
+      </w:r>
+      <w:r>
+        <w:t xml:space="preserve"> </w:t>
+      </w:r>
+      <w:hyperlink r:id="rId13">
+        <w:r>
+          <w:rPr>
+            <w:rStyle w:val="Hyperlink"/>
+          </w:rPr>
+          <w:t xml:space="preserve">value</w:t>
+        </w:r>
+      </w:hyperlink>
+      <w:r>
+        <w:t xml:space="preserve"> </w:t>
+      </w:r>
+      <w:r>
+        <w:t xml:space="preserve">at that input.</w:t>
       </w:r>
     </w:p>
-    <w:bookmarkEnd w:id="11"/>
-    <w:bookmarkStart w:id="12" w:name="exm-expression"/>
+    <w:bookmarkEnd w:id="14"/>
+    <w:bookmarkStart w:id="15" w:name="exm-expression"/>
     <w:p>
       <w:pPr>
         <w:pStyle w:val="BodyText"/>
@@ -186,8 +248,19 @@
         <w:t xml:space="preserve"> </w:t>
       </w:r>
       <w:r>
-        <w:t xml:space="preserve">The expressions</w:t>
-      </w:r>
+        <w:t xml:space="preserve">The</w:t>
+      </w:r>
+      <w:r>
+        <w:t xml:space="preserve"> </w:t>
+      </w:r>
+      <w:hyperlink w:anchor="def-expression">
+        <w:r>
+          <w:rPr>
+            <w:rStyle w:val="Hyperlink"/>
+          </w:rPr>
+          <w:t xml:space="preserve">expressions</w:t>
+        </w:r>
+      </w:hyperlink>
       <w:r>
         <w:t xml:space="preserve"> </w:t>
       </w:r>
@@ -285,8 +358,36 @@
       <w:r>
         <w:t xml:space="preserve"> </w:t>
       </w:r>
-      <w:r>
-        <w:t xml:space="preserve">denote the same function of</w:t>
+      <w:hyperlink w:anchor="def-denotes">
+        <w:r>
+          <w:rPr>
+            <w:rStyle w:val="Hyperlink"/>
+          </w:rPr>
+          <w:t xml:space="preserve">denote</w:t>
+        </w:r>
+      </w:hyperlink>
+      <w:r>
+        <w:t xml:space="preserve"> </w:t>
+      </w:r>
+      <w:r>
+        <w:t xml:space="preserve">the same</w:t>
+      </w:r>
+      <w:r>
+        <w:t xml:space="preserve"> </w:t>
+      </w:r>
+      <w:hyperlink r:id="rId11">
+        <w:r>
+          <w:rPr>
+            <w:rStyle w:val="Hyperlink"/>
+          </w:rPr>
+          <w:t xml:space="preserve">function</w:t>
+        </w:r>
+      </w:hyperlink>
+      <w:r>
+        <w:t xml:space="preserve"> </w:t>
+      </w:r>
+      <w:r>
+        <w:t xml:space="preserve">of</w:t>
       </w:r>
       <w:r>
         <w:t xml:space="preserve"> </w:t>
@@ -643,8 +744,8 @@
         <w:t xml:space="preserve">is added.</w:t>
       </w:r>
     </w:p>
-    <w:bookmarkEnd w:id="12"/>
-    <w:bookmarkStart w:id="13" w:name="def-parse-tree"/>
+    <w:bookmarkEnd w:id="15"/>
+    <w:bookmarkStart w:id="16" w:name="def-parse-tree"/>
     <w:p>
       <w:pPr>
         <w:pStyle w:val="BodyText"/>
@@ -654,7 +755,7 @@
           <w:b/>
           <w:bCs/>
         </w:rPr>
-        <w:t xml:space="preserve">Definition 2 (Parse tree)</w:t>
+        <w:t xml:space="preserve">Definition 3 (Parse tree)</w:t>
       </w:r>
       <w:r>
         <w:t xml:space="preserve"> </w:t>
@@ -720,8 +821,8 @@
         <w:t xml:space="preserve">and each internal node is an operation applied to the nodes below it.</w:t>
       </w:r>
     </w:p>
-    <w:bookmarkEnd w:id="13"/>
-    <w:bookmarkStart w:id="14" w:name="exm-parse-tree"/>
+    <w:bookmarkEnd w:id="16"/>
+    <w:bookmarkStart w:id="17" w:name="exm-parse-tree"/>
     <w:p>
       <w:pPr>
         <w:pStyle w:val="BodyText"/>
@@ -737,7 +838,24 @@
         <w:t xml:space="preserve"> </w:t>
       </w:r>
       <w:r>
-        <w:t xml:space="preserve">The parse tree of</w:t>
+        <w:t xml:space="preserve">The</w:t>
+      </w:r>
+      <w:r>
+        <w:t xml:space="preserve"> </w:t>
+      </w:r>
+      <w:hyperlink w:anchor="def-parse-tree">
+        <w:r>
+          <w:rPr>
+            <w:rStyle w:val="Hyperlink"/>
+          </w:rPr>
+          <w:t xml:space="preserve">parse tree</w:t>
+        </w:r>
+      </w:hyperlink>
+      <w:r>
+        <w:t xml:space="preserve"> </w:t>
+      </w:r>
+      <w:r>
+        <w:t xml:space="preserve">of</w:t>
       </w:r>
       <w:r>
         <w:t xml:space="preserve"> </w:t>
@@ -787,7 +905,30 @@
         </m:r>
       </m:oMath>
       <w:r>
-        <w:t xml:space="preserve">, with each operation having two children, is:</w:t>
+        <w:t xml:space="preserve">, with each operation having two children, is drawn in</w:t>
+      </w:r>
+      <w:r>
+        <w:t xml:space="preserve"> </w:t>
+      </w:r>
+      <w:hyperlink w:anchor="fig-parse-trees">
+        <w:r>
+          <w:rPr>
+            <w:rStyle w:val="Hyperlink"/>
+          </w:rPr>
+          <w:t xml:space="preserve">Figure 1</w:t>
+        </w:r>
+      </w:hyperlink>
+      <w:r>
+        <w:t xml:space="preserve"> </w:t>
+      </w:r>
+      <w:r>
+        <w:t xml:space="preserve">(left)</w:t>
+      </w:r>
+      <w:r>
+        <w:t xml:space="preserve"> </w:t>
+      </w:r>
+      <w:r>
+        <w:t xml:space="preserve">and written out as a list here:</w:t>
       </w:r>
     </w:p>
     <w:p>
@@ -1063,8 +1204,19 @@
         <w:t xml:space="preserve"> </w:t>
       </w:r>
       <w:r>
-        <w:t xml:space="preserve">The expression</w:t>
-      </w:r>
+        <w:t xml:space="preserve">The</w:t>
+      </w:r>
+      <w:r>
+        <w:t xml:space="preserve"> </w:t>
+      </w:r>
+      <w:hyperlink w:anchor="def-expression">
+        <w:r>
+          <w:rPr>
+            <w:rStyle w:val="Hyperlink"/>
+          </w:rPr>
+          <w:t xml:space="preserve">expression</w:t>
+        </w:r>
+      </w:hyperlink>
       <w:r>
         <w:t xml:space="preserve"> </w:t>
       </w:r>
@@ -1110,7 +1262,18 @@
         <w:t xml:space="preserve"> </w:t>
       </w:r>
       <w:r>
-        <w:t xml:space="preserve">has a different tree.</w:t>
+        <w:t xml:space="preserve">has a different tree (</w:t>
+      </w:r>
+      <w:hyperlink w:anchor="fig-parse-trees">
+        <w:r>
+          <w:rPr>
+            <w:rStyle w:val="Hyperlink"/>
+          </w:rPr>
+          <w:t xml:space="preserve">Figure 1</w:t>
+        </w:r>
+      </w:hyperlink>
+      <w:r>
+        <w:t xml:space="preserve">, right).</w:t>
       </w:r>
       <w:r>
         <w:t xml:space="preserve"> </w:t>
@@ -1248,8 +1411,3595 @@
         <w:t xml:space="preserve">.</w:t>
       </w:r>
     </w:p>
-    <w:bookmarkEnd w:id="14"/>
-    <w:bookmarkStart w:id="15" w:name="rem-expression-parse-tree"/>
+    <w:bookmarkEnd w:id="17"/>
+    <w:tbl>
+      <w:tblPr>
+        <w:tblStyle w:val="Table"/>
+        <w:tblW w:type="pct" w:w="5000"/>
+        <w:tblLayout w:type="fixed"/>
+        <w:tblLook w:firstRow="0" w:lastRow="0" w:firstColumn="0" w:lastColumn="0" w:noHBand="0" w:noVBand="0" w:val="0000"/>
+      </w:tblPr>
+      <w:tblGrid>
+        <w:gridCol w:w="7920"/>
+      </w:tblGrid>
+      <w:tr>
+        <w:tc>
+          <w:tcPr/>
+          <w:bookmarkStart w:id="24" w:name="fig-parse-trees"/>
+          <w:p>
+            <w:pPr>
+              <w:pStyle w:val="SourceCode"/>
+              <w:jc w:val="center"/>
+            </w:pPr>
+            <w:r>
+              <w:rPr>
+                <w:rStyle w:val="CommentTok"/>
+              </w:rPr>
+              <w:t xml:space="preserve"># Each tree is a nested list: the first element is the node's label,</w:t>
+            </w:r>
+            <w:r>
+              <w:br/>
+            </w:r>
+            <w:r>
+              <w:rPr>
+                <w:rStyle w:val="CommentTok"/>
+              </w:rPr>
+              <w:t xml:space="preserve"># and the remaining elements are its children.</w:t>
+            </w:r>
+            <w:r>
+              <w:br/>
+            </w:r>
+            <w:r>
+              <w:rPr>
+                <w:rStyle w:val="NormalTok"/>
+              </w:rPr>
+              <w:t xml:space="preserve">times </w:t>
+            </w:r>
+            <w:r>
+              <w:rPr>
+                <w:rStyle w:val="OtherTok"/>
+              </w:rPr>
+              <w:t xml:space="preserve">&lt;-</w:t>
+            </w:r>
+            <w:r>
+              <w:rPr>
+                <w:rStyle w:val="NormalTok"/>
+              </w:rPr>
+              <w:t xml:space="preserve"> </w:t>
+            </w:r>
+            <w:r>
+              <w:rPr>
+                <w:rStyle w:val="FunctionTok"/>
+              </w:rPr>
+              <w:t xml:space="preserve">intToUtf8</w:t>
+            </w:r>
+            <w:r>
+              <w:rPr>
+                <w:rStyle w:val="NormalTok"/>
+              </w:rPr>
+              <w:t xml:space="preserve">(</w:t>
+            </w:r>
+            <w:r>
+              <w:rPr>
+                <w:rStyle w:val="DecValTok"/>
+              </w:rPr>
+              <w:t xml:space="preserve">215</w:t>
+            </w:r>
+            <w:r>
+              <w:rPr>
+                <w:rStyle w:val="NormalTok"/>
+              </w:rPr>
+              <w:t xml:space="preserve">)</w:t>
+            </w:r>
+            <w:r>
+              <w:br/>
+            </w:r>
+            <w:r>
+              <w:rPr>
+                <w:rStyle w:val="NormalTok"/>
+              </w:rPr>
+              <w:t xml:space="preserve">trees </w:t>
+            </w:r>
+            <w:r>
+              <w:rPr>
+                <w:rStyle w:val="OtherTok"/>
+              </w:rPr>
+              <w:t xml:space="preserve">&lt;-</w:t>
+            </w:r>
+            <w:r>
+              <w:rPr>
+                <w:rStyle w:val="NormalTok"/>
+              </w:rPr>
+              <w:t xml:space="preserve"> </w:t>
+            </w:r>
+            <w:r>
+              <w:rPr>
+                <w:rStyle w:val="FunctionTok"/>
+              </w:rPr>
+              <w:t xml:space="preserve">list</w:t>
+            </w:r>
+            <w:r>
+              <w:rPr>
+                <w:rStyle w:val="NormalTok"/>
+              </w:rPr>
+              <w:t xml:space="preserve">(</w:t>
+            </w:r>
+            <w:r>
+              <w:br/>
+            </w:r>
+            <w:r>
+              <w:rPr>
+                <w:rStyle w:val="NormalTok"/>
+              </w:rPr>
+              <w:t xml:space="preserve">  </w:t>
+            </w:r>
+            <w:r>
+              <w:rPr>
+                <w:rStyle w:val="StringTok"/>
+              </w:rPr>
+              <w:t xml:space="preserve">"(a * x + b) * x + c"</w:t>
+            </w:r>
+            <w:r>
+              <w:rPr>
+                <w:rStyle w:val="NormalTok"/>
+              </w:rPr>
+              <w:t xml:space="preserve"> </w:t>
+            </w:r>
+            <w:r>
+              <w:rPr>
+                <w:rStyle w:val="OtherTok"/>
+              </w:rPr>
+              <w:t xml:space="preserve">=</w:t>
+            </w:r>
+            <w:r>
+              <w:rPr>
+                <w:rStyle w:val="NormalTok"/>
+              </w:rPr>
+              <w:t xml:space="preserve"> </w:t>
+            </w:r>
+            <w:r>
+              <w:rPr>
+                <w:rStyle w:val="FunctionTok"/>
+              </w:rPr>
+              <w:t xml:space="preserve">list</w:t>
+            </w:r>
+            <w:r>
+              <w:rPr>
+                <w:rStyle w:val="NormalTok"/>
+              </w:rPr>
+              <w:t xml:space="preserve">(</w:t>
+            </w:r>
+            <w:r>
+              <w:br/>
+            </w:r>
+            <w:r>
+              <w:rPr>
+                <w:rStyle w:val="NormalTok"/>
+              </w:rPr>
+              <w:t xml:space="preserve">    </w:t>
+            </w:r>
+            <w:r>
+              <w:rPr>
+                <w:rStyle w:val="StringTok"/>
+              </w:rPr>
+              <w:t xml:space="preserve">"+"</w:t>
+            </w:r>
+            <w:r>
+              <w:rPr>
+                <w:rStyle w:val="NormalTok"/>
+              </w:rPr>
+              <w:t xml:space="preserve">,</w:t>
+            </w:r>
+            <w:r>
+              <w:br/>
+            </w:r>
+            <w:r>
+              <w:rPr>
+                <w:rStyle w:val="NormalTok"/>
+              </w:rPr>
+              <w:t xml:space="preserve">    </w:t>
+            </w:r>
+            <w:r>
+              <w:rPr>
+                <w:rStyle w:val="FunctionTok"/>
+              </w:rPr>
+              <w:t xml:space="preserve">list</w:t>
+            </w:r>
+            <w:r>
+              <w:rPr>
+                <w:rStyle w:val="NormalTok"/>
+              </w:rPr>
+              <w:t xml:space="preserve">(times, </w:t>
+            </w:r>
+            <w:r>
+              <w:rPr>
+                <w:rStyle w:val="FunctionTok"/>
+              </w:rPr>
+              <w:t xml:space="preserve">list</w:t>
+            </w:r>
+            <w:r>
+              <w:rPr>
+                <w:rStyle w:val="NormalTok"/>
+              </w:rPr>
+              <w:t xml:space="preserve">(</w:t>
+            </w:r>
+            <w:r>
+              <w:rPr>
+                <w:rStyle w:val="StringTok"/>
+              </w:rPr>
+              <w:t xml:space="preserve">"+"</w:t>
+            </w:r>
+            <w:r>
+              <w:rPr>
+                <w:rStyle w:val="NormalTok"/>
+              </w:rPr>
+              <w:t xml:space="preserve">, </w:t>
+            </w:r>
+            <w:r>
+              <w:rPr>
+                <w:rStyle w:val="FunctionTok"/>
+              </w:rPr>
+              <w:t xml:space="preserve">list</w:t>
+            </w:r>
+            <w:r>
+              <w:rPr>
+                <w:rStyle w:val="NormalTok"/>
+              </w:rPr>
+              <w:t xml:space="preserve">(times, </w:t>
+            </w:r>
+            <w:r>
+              <w:rPr>
+                <w:rStyle w:val="StringTok"/>
+              </w:rPr>
+              <w:t xml:space="preserve">"a"</w:t>
+            </w:r>
+            <w:r>
+              <w:rPr>
+                <w:rStyle w:val="NormalTok"/>
+              </w:rPr>
+              <w:t xml:space="preserve">, </w:t>
+            </w:r>
+            <w:r>
+              <w:rPr>
+                <w:rStyle w:val="StringTok"/>
+              </w:rPr>
+              <w:t xml:space="preserve">"x"</w:t>
+            </w:r>
+            <w:r>
+              <w:rPr>
+                <w:rStyle w:val="NormalTok"/>
+              </w:rPr>
+              <w:t xml:space="preserve">), </w:t>
+            </w:r>
+            <w:r>
+              <w:rPr>
+                <w:rStyle w:val="StringTok"/>
+              </w:rPr>
+              <w:t xml:space="preserve">"b"</w:t>
+            </w:r>
+            <w:r>
+              <w:rPr>
+                <w:rStyle w:val="NormalTok"/>
+              </w:rPr>
+              <w:t xml:space="preserve">), </w:t>
+            </w:r>
+            <w:r>
+              <w:rPr>
+                <w:rStyle w:val="StringTok"/>
+              </w:rPr>
+              <w:t xml:space="preserve">"x"</w:t>
+            </w:r>
+            <w:r>
+              <w:rPr>
+                <w:rStyle w:val="NormalTok"/>
+              </w:rPr>
+              <w:t xml:space="preserve">),</w:t>
+            </w:r>
+            <w:r>
+              <w:br/>
+            </w:r>
+            <w:r>
+              <w:rPr>
+                <w:rStyle w:val="NormalTok"/>
+              </w:rPr>
+              <w:t xml:space="preserve">    </w:t>
+            </w:r>
+            <w:r>
+              <w:rPr>
+                <w:rStyle w:val="StringTok"/>
+              </w:rPr>
+              <w:t xml:space="preserve">"c"</w:t>
+            </w:r>
+            <w:r>
+              <w:br/>
+            </w:r>
+            <w:r>
+              <w:rPr>
+                <w:rStyle w:val="NormalTok"/>
+              </w:rPr>
+              <w:t xml:space="preserve">  ),</w:t>
+            </w:r>
+            <w:r>
+              <w:br/>
+            </w:r>
+            <w:r>
+              <w:rPr>
+                <w:rStyle w:val="NormalTok"/>
+              </w:rPr>
+              <w:t xml:space="preserve">  </w:t>
+            </w:r>
+            <w:r>
+              <w:rPr>
+                <w:rStyle w:val="StringTok"/>
+              </w:rPr>
+              <w:t xml:space="preserve">"a * x^2 + b * x + c"</w:t>
+            </w:r>
+            <w:r>
+              <w:rPr>
+                <w:rStyle w:val="NormalTok"/>
+              </w:rPr>
+              <w:t xml:space="preserve"> </w:t>
+            </w:r>
+            <w:r>
+              <w:rPr>
+                <w:rStyle w:val="OtherTok"/>
+              </w:rPr>
+              <w:t xml:space="preserve">=</w:t>
+            </w:r>
+            <w:r>
+              <w:rPr>
+                <w:rStyle w:val="NormalTok"/>
+              </w:rPr>
+              <w:t xml:space="preserve"> </w:t>
+            </w:r>
+            <w:r>
+              <w:rPr>
+                <w:rStyle w:val="FunctionTok"/>
+              </w:rPr>
+              <w:t xml:space="preserve">list</w:t>
+            </w:r>
+            <w:r>
+              <w:rPr>
+                <w:rStyle w:val="NormalTok"/>
+              </w:rPr>
+              <w:t xml:space="preserve">(</w:t>
+            </w:r>
+            <w:r>
+              <w:br/>
+            </w:r>
+            <w:r>
+              <w:rPr>
+                <w:rStyle w:val="NormalTok"/>
+              </w:rPr>
+              <w:t xml:space="preserve">    </w:t>
+            </w:r>
+            <w:r>
+              <w:rPr>
+                <w:rStyle w:val="StringTok"/>
+              </w:rPr>
+              <w:t xml:space="preserve">"+"</w:t>
+            </w:r>
+            <w:r>
+              <w:rPr>
+                <w:rStyle w:val="NormalTok"/>
+              </w:rPr>
+              <w:t xml:space="preserve">,</w:t>
+            </w:r>
+            <w:r>
+              <w:br/>
+            </w:r>
+            <w:r>
+              <w:rPr>
+                <w:rStyle w:val="NormalTok"/>
+              </w:rPr>
+              <w:t xml:space="preserve">    </w:t>
+            </w:r>
+            <w:r>
+              <w:rPr>
+                <w:rStyle w:val="FunctionTok"/>
+              </w:rPr>
+              <w:t xml:space="preserve">list</w:t>
+            </w:r>
+            <w:r>
+              <w:rPr>
+                <w:rStyle w:val="NormalTok"/>
+              </w:rPr>
+              <w:t xml:space="preserve">(</w:t>
+            </w:r>
+            <w:r>
+              <w:br/>
+            </w:r>
+            <w:r>
+              <w:rPr>
+                <w:rStyle w:val="NormalTok"/>
+              </w:rPr>
+              <w:t xml:space="preserve">      </w:t>
+            </w:r>
+            <w:r>
+              <w:rPr>
+                <w:rStyle w:val="StringTok"/>
+              </w:rPr>
+              <w:t xml:space="preserve">"+"</w:t>
+            </w:r>
+            <w:r>
+              <w:rPr>
+                <w:rStyle w:val="NormalTok"/>
+              </w:rPr>
+              <w:t xml:space="preserve">,</w:t>
+            </w:r>
+            <w:r>
+              <w:br/>
+            </w:r>
+            <w:r>
+              <w:rPr>
+                <w:rStyle w:val="NormalTok"/>
+              </w:rPr>
+              <w:t xml:space="preserve">      </w:t>
+            </w:r>
+            <w:r>
+              <w:rPr>
+                <w:rStyle w:val="FunctionTok"/>
+              </w:rPr>
+              <w:t xml:space="preserve">list</w:t>
+            </w:r>
+            <w:r>
+              <w:rPr>
+                <w:rStyle w:val="NormalTok"/>
+              </w:rPr>
+              <w:t xml:space="preserve">(times, </w:t>
+            </w:r>
+            <w:r>
+              <w:rPr>
+                <w:rStyle w:val="StringTok"/>
+              </w:rPr>
+              <w:t xml:space="preserve">"a"</w:t>
+            </w:r>
+            <w:r>
+              <w:rPr>
+                <w:rStyle w:val="NormalTok"/>
+              </w:rPr>
+              <w:t xml:space="preserve">, </w:t>
+            </w:r>
+            <w:r>
+              <w:rPr>
+                <w:rStyle w:val="FunctionTok"/>
+              </w:rPr>
+              <w:t xml:space="preserve">list</w:t>
+            </w:r>
+            <w:r>
+              <w:rPr>
+                <w:rStyle w:val="NormalTok"/>
+              </w:rPr>
+              <w:t xml:space="preserve">(</w:t>
+            </w:r>
+            <w:r>
+              <w:rPr>
+                <w:rStyle w:val="StringTok"/>
+              </w:rPr>
+              <w:t xml:space="preserve">"^"</w:t>
+            </w:r>
+            <w:r>
+              <w:rPr>
+                <w:rStyle w:val="NormalTok"/>
+              </w:rPr>
+              <w:t xml:space="preserve">, </w:t>
+            </w:r>
+            <w:r>
+              <w:rPr>
+                <w:rStyle w:val="StringTok"/>
+              </w:rPr>
+              <w:t xml:space="preserve">"x"</w:t>
+            </w:r>
+            <w:r>
+              <w:rPr>
+                <w:rStyle w:val="NormalTok"/>
+              </w:rPr>
+              <w:t xml:space="preserve">, </w:t>
+            </w:r>
+            <w:r>
+              <w:rPr>
+                <w:rStyle w:val="StringTok"/>
+              </w:rPr>
+              <w:t xml:space="preserve">"2"</w:t>
+            </w:r>
+            <w:r>
+              <w:rPr>
+                <w:rStyle w:val="NormalTok"/>
+              </w:rPr>
+              <w:t xml:space="preserve">)),</w:t>
+            </w:r>
+            <w:r>
+              <w:br/>
+            </w:r>
+            <w:r>
+              <w:rPr>
+                <w:rStyle w:val="NormalTok"/>
+              </w:rPr>
+              <w:t xml:space="preserve">      </w:t>
+            </w:r>
+            <w:r>
+              <w:rPr>
+                <w:rStyle w:val="FunctionTok"/>
+              </w:rPr>
+              <w:t xml:space="preserve">list</w:t>
+            </w:r>
+            <w:r>
+              <w:rPr>
+                <w:rStyle w:val="NormalTok"/>
+              </w:rPr>
+              <w:t xml:space="preserve">(times, </w:t>
+            </w:r>
+            <w:r>
+              <w:rPr>
+                <w:rStyle w:val="StringTok"/>
+              </w:rPr>
+              <w:t xml:space="preserve">"b"</w:t>
+            </w:r>
+            <w:r>
+              <w:rPr>
+                <w:rStyle w:val="NormalTok"/>
+              </w:rPr>
+              <w:t xml:space="preserve">, </w:t>
+            </w:r>
+            <w:r>
+              <w:rPr>
+                <w:rStyle w:val="StringTok"/>
+              </w:rPr>
+              <w:t xml:space="preserve">"x"</w:t>
+            </w:r>
+            <w:r>
+              <w:rPr>
+                <w:rStyle w:val="NormalTok"/>
+              </w:rPr>
+              <w:t xml:space="preserve">)</w:t>
+            </w:r>
+            <w:r>
+              <w:br/>
+            </w:r>
+            <w:r>
+              <w:rPr>
+                <w:rStyle w:val="NormalTok"/>
+              </w:rPr>
+              <w:t xml:space="preserve">    ),</w:t>
+            </w:r>
+            <w:r>
+              <w:br/>
+            </w:r>
+            <w:r>
+              <w:rPr>
+                <w:rStyle w:val="NormalTok"/>
+              </w:rPr>
+              <w:t xml:space="preserve">    </w:t>
+            </w:r>
+            <w:r>
+              <w:rPr>
+                <w:rStyle w:val="StringTok"/>
+              </w:rPr>
+              <w:t xml:space="preserve">"c"</w:t>
+            </w:r>
+            <w:r>
+              <w:br/>
+            </w:r>
+            <w:r>
+              <w:rPr>
+                <w:rStyle w:val="NormalTok"/>
+              </w:rPr>
+              <w:t xml:space="preserve">  )</w:t>
+            </w:r>
+            <w:r>
+              <w:br/>
+            </w:r>
+            <w:r>
+              <w:rPr>
+                <w:rStyle w:val="NormalTok"/>
+              </w:rPr>
+              <w:t xml:space="preserve">)</w:t>
+            </w:r>
+            <w:r>
+              <w:br/>
+            </w:r>
+            <w:r>
+              <w:br/>
+            </w:r>
+            <w:r>
+              <w:rPr>
+                <w:rStyle w:val="CommentTok"/>
+              </w:rPr>
+              <w:t xml:space="preserve"># Leaves sit at consecutive x positions;</w:t>
+            </w:r>
+            <w:r>
+              <w:br/>
+            </w:r>
+            <w:r>
+              <w:rPr>
+                <w:rStyle w:val="CommentTok"/>
+              </w:rPr>
+              <w:t xml:space="preserve"># each operation sits above the mean of its children.</w:t>
+            </w:r>
+            <w:r>
+              <w:br/>
+            </w:r>
+            <w:r>
+              <w:rPr>
+                <w:rStyle w:val="NormalTok"/>
+              </w:rPr>
+              <w:t xml:space="preserve">layout_tree </w:t>
+            </w:r>
+            <w:r>
+              <w:rPr>
+                <w:rStyle w:val="OtherTok"/>
+              </w:rPr>
+              <w:t xml:space="preserve">&lt;-</w:t>
+            </w:r>
+            <w:r>
+              <w:rPr>
+                <w:rStyle w:val="NormalTok"/>
+              </w:rPr>
+              <w:t xml:space="preserve"> </w:t>
+            </w:r>
+            <w:r>
+              <w:rPr>
+                <w:rStyle w:val="ControlFlowTok"/>
+              </w:rPr>
+              <w:t xml:space="preserve">function</w:t>
+            </w:r>
+            <w:r>
+              <w:rPr>
+                <w:rStyle w:val="NormalTok"/>
+              </w:rPr>
+              <w:t xml:space="preserve">(node, </w:t>
+            </w:r>
+            <w:r>
+              <w:rPr>
+                <w:rStyle w:val="AttributeTok"/>
+              </w:rPr>
+              <w:t xml:space="preserve">depth =</w:t>
+            </w:r>
+            <w:r>
+              <w:rPr>
+                <w:rStyle w:val="NormalTok"/>
+              </w:rPr>
+              <w:t xml:space="preserve"> </w:t>
+            </w:r>
+            <w:r>
+              <w:rPr>
+                <w:rStyle w:val="DecValTok"/>
+              </w:rPr>
+              <w:t xml:space="preserve">0</w:t>
+            </w:r>
+            <w:r>
+              <w:rPr>
+                <w:rStyle w:val="NormalTok"/>
+              </w:rPr>
+              <w:t xml:space="preserve">, </w:t>
+            </w:r>
+            <w:r>
+              <w:rPr>
+                <w:rStyle w:val="AttributeTok"/>
+              </w:rPr>
+              <w:t xml:space="preserve">next_x =</w:t>
+            </w:r>
+            <w:r>
+              <w:rPr>
+                <w:rStyle w:val="NormalTok"/>
+              </w:rPr>
+              <w:t xml:space="preserve"> </w:t>
+            </w:r>
+            <w:r>
+              <w:rPr>
+                <w:rStyle w:val="DecValTok"/>
+              </w:rPr>
+              <w:t xml:space="preserve">0</w:t>
+            </w:r>
+            <w:r>
+              <w:rPr>
+                <w:rStyle w:val="NormalTok"/>
+              </w:rPr>
+              <w:t xml:space="preserve">) {</w:t>
+            </w:r>
+            <w:r>
+              <w:br/>
+            </w:r>
+            <w:r>
+              <w:rPr>
+                <w:rStyle w:val="NormalTok"/>
+              </w:rPr>
+              <w:t xml:space="preserve">  </w:t>
+            </w:r>
+            <w:r>
+              <w:rPr>
+                <w:rStyle w:val="ControlFlowTok"/>
+              </w:rPr>
+              <w:t xml:space="preserve">if</w:t>
+            </w:r>
+            <w:r>
+              <w:rPr>
+                <w:rStyle w:val="NormalTok"/>
+              </w:rPr>
+              <w:t xml:space="preserve"> (</w:t>
+            </w:r>
+            <w:r>
+              <w:rPr>
+                <w:rStyle w:val="SpecialCharTok"/>
+              </w:rPr>
+              <w:t xml:space="preserve">!</w:t>
+            </w:r>
+            <w:r>
+              <w:rPr>
+                <w:rStyle w:val="FunctionTok"/>
+              </w:rPr>
+              <w:t xml:space="preserve">is.list</w:t>
+            </w:r>
+            <w:r>
+              <w:rPr>
+                <w:rStyle w:val="NormalTok"/>
+              </w:rPr>
+              <w:t xml:space="preserve">(node)) {</w:t>
+            </w:r>
+            <w:r>
+              <w:br/>
+            </w:r>
+            <w:r>
+              <w:rPr>
+                <w:rStyle w:val="NormalTok"/>
+              </w:rPr>
+              <w:t xml:space="preserve">    </w:t>
+            </w:r>
+            <w:r>
+              <w:rPr>
+                <w:rStyle w:val="FunctionTok"/>
+              </w:rPr>
+              <w:t xml:space="preserve">return</w:t>
+            </w:r>
+            <w:r>
+              <w:rPr>
+                <w:rStyle w:val="NormalTok"/>
+              </w:rPr>
+              <w:t xml:space="preserve">(</w:t>
+            </w:r>
+            <w:r>
+              <w:rPr>
+                <w:rStyle w:val="FunctionTok"/>
+              </w:rPr>
+              <w:t xml:space="preserve">list</w:t>
+            </w:r>
+            <w:r>
+              <w:rPr>
+                <w:rStyle w:val="NormalTok"/>
+              </w:rPr>
+              <w:t xml:space="preserve">(</w:t>
+            </w:r>
+            <w:r>
+              <w:br/>
+            </w:r>
+            <w:r>
+              <w:rPr>
+                <w:rStyle w:val="NormalTok"/>
+              </w:rPr>
+              <w:t xml:space="preserve">      </w:t>
+            </w:r>
+            <w:r>
+              <w:rPr>
+                <w:rStyle w:val="AttributeTok"/>
+              </w:rPr>
+              <w:t xml:space="preserve">nodes =</w:t>
+            </w:r>
+            <w:r>
+              <w:rPr>
+                <w:rStyle w:val="NormalTok"/>
+              </w:rPr>
+              <w:t xml:space="preserve"> </w:t>
+            </w:r>
+            <w:r>
+              <w:rPr>
+                <w:rStyle w:val="FunctionTok"/>
+              </w:rPr>
+              <w:t xml:space="preserve">data.frame</w:t>
+            </w:r>
+            <w:r>
+              <w:rPr>
+                <w:rStyle w:val="NormalTok"/>
+              </w:rPr>
+              <w:t xml:space="preserve">(</w:t>
+            </w:r>
+            <w:r>
+              <w:rPr>
+                <w:rStyle w:val="AttributeTok"/>
+              </w:rPr>
+              <w:t xml:space="preserve">label =</w:t>
+            </w:r>
+            <w:r>
+              <w:rPr>
+                <w:rStyle w:val="NormalTok"/>
+              </w:rPr>
+              <w:t xml:space="preserve"> node, </w:t>
+            </w:r>
+            <w:r>
+              <w:rPr>
+                <w:rStyle w:val="AttributeTok"/>
+              </w:rPr>
+              <w:t xml:space="preserve">x =</w:t>
+            </w:r>
+            <w:r>
+              <w:rPr>
+                <w:rStyle w:val="NormalTok"/>
+              </w:rPr>
+              <w:t xml:space="preserve"> next_x, </w:t>
+            </w:r>
+            <w:r>
+              <w:rPr>
+                <w:rStyle w:val="AttributeTok"/>
+              </w:rPr>
+              <w:t xml:space="preserve">y =</w:t>
+            </w:r>
+            <w:r>
+              <w:rPr>
+                <w:rStyle w:val="NormalTok"/>
+              </w:rPr>
+              <w:t xml:space="preserve"> </w:t>
+            </w:r>
+            <w:r>
+              <w:rPr>
+                <w:rStyle w:val="SpecialCharTok"/>
+              </w:rPr>
+              <w:t xml:space="preserve">-</w:t>
+            </w:r>
+            <w:r>
+              <w:rPr>
+                <w:rStyle w:val="NormalTok"/>
+              </w:rPr>
+              <w:t xml:space="preserve">depth, </w:t>
+            </w:r>
+            <w:r>
+              <w:rPr>
+                <w:rStyle w:val="AttributeTok"/>
+              </w:rPr>
+              <w:t xml:space="preserve">is_leaf =</w:t>
+            </w:r>
+            <w:r>
+              <w:rPr>
+                <w:rStyle w:val="NormalTok"/>
+              </w:rPr>
+              <w:t xml:space="preserve"> </w:t>
+            </w:r>
+            <w:r>
+              <w:rPr>
+                <w:rStyle w:val="ConstantTok"/>
+              </w:rPr>
+              <w:t xml:space="preserve">TRUE</w:t>
+            </w:r>
+            <w:r>
+              <w:rPr>
+                <w:rStyle w:val="NormalTok"/>
+              </w:rPr>
+              <w:t xml:space="preserve">),</w:t>
+            </w:r>
+            <w:r>
+              <w:br/>
+            </w:r>
+            <w:r>
+              <w:rPr>
+                <w:rStyle w:val="NormalTok"/>
+              </w:rPr>
+              <w:t xml:space="preserve">      </w:t>
+            </w:r>
+            <w:r>
+              <w:rPr>
+                <w:rStyle w:val="AttributeTok"/>
+              </w:rPr>
+              <w:t xml:space="preserve">edges =</w:t>
+            </w:r>
+            <w:r>
+              <w:rPr>
+                <w:rStyle w:val="NormalTok"/>
+              </w:rPr>
+              <w:t xml:space="preserve"> </w:t>
+            </w:r>
+            <w:r>
+              <w:rPr>
+                <w:rStyle w:val="ConstantTok"/>
+              </w:rPr>
+              <w:t xml:space="preserve">NULL</w:t>
+            </w:r>
+            <w:r>
+              <w:rPr>
+                <w:rStyle w:val="NormalTok"/>
+              </w:rPr>
+              <w:t xml:space="preserve">,</w:t>
+            </w:r>
+            <w:r>
+              <w:br/>
+            </w:r>
+            <w:r>
+              <w:rPr>
+                <w:rStyle w:val="NormalTok"/>
+              </w:rPr>
+              <w:t xml:space="preserve">      </w:t>
+            </w:r>
+            <w:r>
+              <w:rPr>
+                <w:rStyle w:val="AttributeTok"/>
+              </w:rPr>
+              <w:t xml:space="preserve">next_x =</w:t>
+            </w:r>
+            <w:r>
+              <w:rPr>
+                <w:rStyle w:val="NormalTok"/>
+              </w:rPr>
+              <w:t xml:space="preserve"> next_x </w:t>
+            </w:r>
+            <w:r>
+              <w:rPr>
+                <w:rStyle w:val="SpecialCharTok"/>
+              </w:rPr>
+              <w:t xml:space="preserve">+</w:t>
+            </w:r>
+            <w:r>
+              <w:rPr>
+                <w:rStyle w:val="NormalTok"/>
+              </w:rPr>
+              <w:t xml:space="preserve"> </w:t>
+            </w:r>
+            <w:r>
+              <w:rPr>
+                <w:rStyle w:val="DecValTok"/>
+              </w:rPr>
+              <w:t xml:space="preserve">1</w:t>
+            </w:r>
+            <w:r>
+              <w:br/>
+            </w:r>
+            <w:r>
+              <w:rPr>
+                <w:rStyle w:val="NormalTok"/>
+              </w:rPr>
+              <w:t xml:space="preserve">    ))</w:t>
+            </w:r>
+            <w:r>
+              <w:br/>
+            </w:r>
+            <w:r>
+              <w:rPr>
+                <w:rStyle w:val="NormalTok"/>
+              </w:rPr>
+              <w:t xml:space="preserve">  }</w:t>
+            </w:r>
+            <w:r>
+              <w:br/>
+            </w:r>
+            <w:r>
+              <w:rPr>
+                <w:rStyle w:val="NormalTok"/>
+              </w:rPr>
+              <w:t xml:space="preserve">  nodes </w:t>
+            </w:r>
+            <w:r>
+              <w:rPr>
+                <w:rStyle w:val="OtherTok"/>
+              </w:rPr>
+              <w:t xml:space="preserve">&lt;-</w:t>
+            </w:r>
+            <w:r>
+              <w:rPr>
+                <w:rStyle w:val="NormalTok"/>
+              </w:rPr>
+              <w:t xml:space="preserve"> </w:t>
+            </w:r>
+            <w:r>
+              <w:rPr>
+                <w:rStyle w:val="ConstantTok"/>
+              </w:rPr>
+              <w:t xml:space="preserve">NULL</w:t>
+            </w:r>
+            <w:r>
+              <w:br/>
+            </w:r>
+            <w:r>
+              <w:rPr>
+                <w:rStyle w:val="NormalTok"/>
+              </w:rPr>
+              <w:t xml:space="preserve">  edges </w:t>
+            </w:r>
+            <w:r>
+              <w:rPr>
+                <w:rStyle w:val="OtherTok"/>
+              </w:rPr>
+              <w:t xml:space="preserve">&lt;-</w:t>
+            </w:r>
+            <w:r>
+              <w:rPr>
+                <w:rStyle w:val="NormalTok"/>
+              </w:rPr>
+              <w:t xml:space="preserve"> </w:t>
+            </w:r>
+            <w:r>
+              <w:rPr>
+                <w:rStyle w:val="ConstantTok"/>
+              </w:rPr>
+              <w:t xml:space="preserve">NULL</w:t>
+            </w:r>
+            <w:r>
+              <w:br/>
+            </w:r>
+            <w:r>
+              <w:rPr>
+                <w:rStyle w:val="NormalTok"/>
+              </w:rPr>
+              <w:t xml:space="preserve">  child_x </w:t>
+            </w:r>
+            <w:r>
+              <w:rPr>
+                <w:rStyle w:val="OtherTok"/>
+              </w:rPr>
+              <w:t xml:space="preserve">&lt;-</w:t>
+            </w:r>
+            <w:r>
+              <w:rPr>
+                <w:rStyle w:val="NormalTok"/>
+              </w:rPr>
+              <w:t xml:space="preserve"> </w:t>
+            </w:r>
+            <w:r>
+              <w:rPr>
+                <w:rStyle w:val="FunctionTok"/>
+              </w:rPr>
+              <w:t xml:space="preserve">numeric</w:t>
+            </w:r>
+            <w:r>
+              <w:rPr>
+                <w:rStyle w:val="NormalTok"/>
+              </w:rPr>
+              <w:t xml:space="preserve">()</w:t>
+            </w:r>
+            <w:r>
+              <w:br/>
+            </w:r>
+            <w:r>
+              <w:rPr>
+                <w:rStyle w:val="NormalTok"/>
+              </w:rPr>
+              <w:t xml:space="preserve">  </w:t>
+            </w:r>
+            <w:r>
+              <w:rPr>
+                <w:rStyle w:val="ControlFlowTok"/>
+              </w:rPr>
+              <w:t xml:space="preserve">for</w:t>
+            </w:r>
+            <w:r>
+              <w:rPr>
+                <w:rStyle w:val="NormalTok"/>
+              </w:rPr>
+              <w:t xml:space="preserve"> (child </w:t>
+            </w:r>
+            <w:r>
+              <w:rPr>
+                <w:rStyle w:val="ControlFlowTok"/>
+              </w:rPr>
+              <w:t xml:space="preserve">in</w:t>
+            </w:r>
+            <w:r>
+              <w:rPr>
+                <w:rStyle w:val="NormalTok"/>
+              </w:rPr>
+              <w:t xml:space="preserve"> node[</w:t>
+            </w:r>
+            <w:r>
+              <w:rPr>
+                <w:rStyle w:val="SpecialCharTok"/>
+              </w:rPr>
+              <w:t xml:space="preserve">-</w:t>
+            </w:r>
+            <w:r>
+              <w:rPr>
+                <w:rStyle w:val="DecValTok"/>
+              </w:rPr>
+              <w:t xml:space="preserve">1</w:t>
+            </w:r>
+            <w:r>
+              <w:rPr>
+                <w:rStyle w:val="NormalTok"/>
+              </w:rPr>
+              <w:t xml:space="preserve">]) {</w:t>
+            </w:r>
+            <w:r>
+              <w:br/>
+            </w:r>
+            <w:r>
+              <w:rPr>
+                <w:rStyle w:val="NormalTok"/>
+              </w:rPr>
+              <w:t xml:space="preserve">    sub </w:t>
+            </w:r>
+            <w:r>
+              <w:rPr>
+                <w:rStyle w:val="OtherTok"/>
+              </w:rPr>
+              <w:t xml:space="preserve">&lt;-</w:t>
+            </w:r>
+            <w:r>
+              <w:rPr>
+                <w:rStyle w:val="NormalTok"/>
+              </w:rPr>
+              <w:t xml:space="preserve"> </w:t>
+            </w:r>
+            <w:r>
+              <w:rPr>
+                <w:rStyle w:val="FunctionTok"/>
+              </w:rPr>
+              <w:t xml:space="preserve">layout_tree</w:t>
+            </w:r>
+            <w:r>
+              <w:rPr>
+                <w:rStyle w:val="NormalTok"/>
+              </w:rPr>
+              <w:t xml:space="preserve">(child, depth </w:t>
+            </w:r>
+            <w:r>
+              <w:rPr>
+                <w:rStyle w:val="SpecialCharTok"/>
+              </w:rPr>
+              <w:t xml:space="preserve">+</w:t>
+            </w:r>
+            <w:r>
+              <w:rPr>
+                <w:rStyle w:val="NormalTok"/>
+              </w:rPr>
+              <w:t xml:space="preserve"> </w:t>
+            </w:r>
+            <w:r>
+              <w:rPr>
+                <w:rStyle w:val="DecValTok"/>
+              </w:rPr>
+              <w:t xml:space="preserve">1</w:t>
+            </w:r>
+            <w:r>
+              <w:rPr>
+                <w:rStyle w:val="NormalTok"/>
+              </w:rPr>
+              <w:t xml:space="preserve">, next_x)</w:t>
+            </w:r>
+            <w:r>
+              <w:br/>
+            </w:r>
+            <w:r>
+              <w:rPr>
+                <w:rStyle w:val="NormalTok"/>
+              </w:rPr>
+              <w:t xml:space="preserve">    next_x </w:t>
+            </w:r>
+            <w:r>
+              <w:rPr>
+                <w:rStyle w:val="OtherTok"/>
+              </w:rPr>
+              <w:t xml:space="preserve">&lt;-</w:t>
+            </w:r>
+            <w:r>
+              <w:rPr>
+                <w:rStyle w:val="NormalTok"/>
+              </w:rPr>
+              <w:t xml:space="preserve"> sub</w:t>
+            </w:r>
+            <w:r>
+              <w:rPr>
+                <w:rStyle w:val="SpecialCharTok"/>
+              </w:rPr>
+              <w:t xml:space="preserve">$</w:t>
+            </w:r>
+            <w:r>
+              <w:rPr>
+                <w:rStyle w:val="NormalTok"/>
+              </w:rPr>
+              <w:t xml:space="preserve">next_x</w:t>
+            </w:r>
+            <w:r>
+              <w:br/>
+            </w:r>
+            <w:r>
+              <w:rPr>
+                <w:rStyle w:val="NormalTok"/>
+              </w:rPr>
+              <w:t xml:space="preserve">    child_x </w:t>
+            </w:r>
+            <w:r>
+              <w:rPr>
+                <w:rStyle w:val="OtherTok"/>
+              </w:rPr>
+              <w:t xml:space="preserve">&lt;-</w:t>
+            </w:r>
+            <w:r>
+              <w:rPr>
+                <w:rStyle w:val="NormalTok"/>
+              </w:rPr>
+              <w:t xml:space="preserve"> </w:t>
+            </w:r>
+            <w:r>
+              <w:rPr>
+                <w:rStyle w:val="FunctionTok"/>
+              </w:rPr>
+              <w:t xml:space="preserve">c</w:t>
+            </w:r>
+            <w:r>
+              <w:rPr>
+                <w:rStyle w:val="NormalTok"/>
+              </w:rPr>
+              <w:t xml:space="preserve">(child_x, sub</w:t>
+            </w:r>
+            <w:r>
+              <w:rPr>
+                <w:rStyle w:val="SpecialCharTok"/>
+              </w:rPr>
+              <w:t xml:space="preserve">$</w:t>
+            </w:r>
+            <w:r>
+              <w:rPr>
+                <w:rStyle w:val="NormalTok"/>
+              </w:rPr>
+              <w:t xml:space="preserve">nodes</w:t>
+            </w:r>
+            <w:r>
+              <w:rPr>
+                <w:rStyle w:val="SpecialCharTok"/>
+              </w:rPr>
+              <w:t xml:space="preserve">$</w:t>
+            </w:r>
+            <w:r>
+              <w:rPr>
+                <w:rStyle w:val="NormalTok"/>
+              </w:rPr>
+              <w:t xml:space="preserve">x[</w:t>
+            </w:r>
+            <w:r>
+              <w:rPr>
+                <w:rStyle w:val="DecValTok"/>
+              </w:rPr>
+              <w:t xml:space="preserve">1</w:t>
+            </w:r>
+            <w:r>
+              <w:rPr>
+                <w:rStyle w:val="NormalTok"/>
+              </w:rPr>
+              <w:t xml:space="preserve">])</w:t>
+            </w:r>
+            <w:r>
+              <w:br/>
+            </w:r>
+            <w:r>
+              <w:rPr>
+                <w:rStyle w:val="NormalTok"/>
+              </w:rPr>
+              <w:t xml:space="preserve">    edges </w:t>
+            </w:r>
+            <w:r>
+              <w:rPr>
+                <w:rStyle w:val="OtherTok"/>
+              </w:rPr>
+              <w:t xml:space="preserve">&lt;-</w:t>
+            </w:r>
+            <w:r>
+              <w:rPr>
+                <w:rStyle w:val="NormalTok"/>
+              </w:rPr>
+              <w:t xml:space="preserve"> </w:t>
+            </w:r>
+            <w:r>
+              <w:rPr>
+                <w:rStyle w:val="FunctionTok"/>
+              </w:rPr>
+              <w:t xml:space="preserve">rbind</w:t>
+            </w:r>
+            <w:r>
+              <w:rPr>
+                <w:rStyle w:val="NormalTok"/>
+              </w:rPr>
+              <w:t xml:space="preserve">(</w:t>
+            </w:r>
+            <w:r>
+              <w:br/>
+            </w:r>
+            <w:r>
+              <w:rPr>
+                <w:rStyle w:val="NormalTok"/>
+              </w:rPr>
+              <w:t xml:space="preserve">      edges,</w:t>
+            </w:r>
+            <w:r>
+              <w:br/>
+            </w:r>
+            <w:r>
+              <w:rPr>
+                <w:rStyle w:val="NormalTok"/>
+              </w:rPr>
+              <w:t xml:space="preserve">      sub</w:t>
+            </w:r>
+            <w:r>
+              <w:rPr>
+                <w:rStyle w:val="SpecialCharTok"/>
+              </w:rPr>
+              <w:t xml:space="preserve">$</w:t>
+            </w:r>
+            <w:r>
+              <w:rPr>
+                <w:rStyle w:val="NormalTok"/>
+              </w:rPr>
+              <w:t xml:space="preserve">edges,</w:t>
+            </w:r>
+            <w:r>
+              <w:br/>
+            </w:r>
+            <w:r>
+              <w:rPr>
+                <w:rStyle w:val="NormalTok"/>
+              </w:rPr>
+              <w:t xml:space="preserve">      </w:t>
+            </w:r>
+            <w:r>
+              <w:rPr>
+                <w:rStyle w:val="FunctionTok"/>
+              </w:rPr>
+              <w:t xml:space="preserve">data.frame</w:t>
+            </w:r>
+            <w:r>
+              <w:rPr>
+                <w:rStyle w:val="NormalTok"/>
+              </w:rPr>
+              <w:t xml:space="preserve">(</w:t>
+            </w:r>
+            <w:r>
+              <w:br/>
+            </w:r>
+            <w:r>
+              <w:rPr>
+                <w:rStyle w:val="NormalTok"/>
+              </w:rPr>
+              <w:t xml:space="preserve">        </w:t>
+            </w:r>
+            <w:r>
+              <w:rPr>
+                <w:rStyle w:val="AttributeTok"/>
+              </w:rPr>
+              <w:t xml:space="preserve">x =</w:t>
+            </w:r>
+            <w:r>
+              <w:rPr>
+                <w:rStyle w:val="NormalTok"/>
+              </w:rPr>
+              <w:t xml:space="preserve"> </w:t>
+            </w:r>
+            <w:r>
+              <w:rPr>
+                <w:rStyle w:val="ConstantTok"/>
+              </w:rPr>
+              <w:t xml:space="preserve">NA_real_</w:t>
+            </w:r>
+            <w:r>
+              <w:rPr>
+                <w:rStyle w:val="NormalTok"/>
+              </w:rPr>
+              <w:t xml:space="preserve">,</w:t>
+            </w:r>
+            <w:r>
+              <w:br/>
+            </w:r>
+            <w:r>
+              <w:rPr>
+                <w:rStyle w:val="NormalTok"/>
+              </w:rPr>
+              <w:t xml:space="preserve">        </w:t>
+            </w:r>
+            <w:r>
+              <w:rPr>
+                <w:rStyle w:val="AttributeTok"/>
+              </w:rPr>
+              <w:t xml:space="preserve">y =</w:t>
+            </w:r>
+            <w:r>
+              <w:rPr>
+                <w:rStyle w:val="NormalTok"/>
+              </w:rPr>
+              <w:t xml:space="preserve"> </w:t>
+            </w:r>
+            <w:r>
+              <w:rPr>
+                <w:rStyle w:val="SpecialCharTok"/>
+              </w:rPr>
+              <w:t xml:space="preserve">-</w:t>
+            </w:r>
+            <w:r>
+              <w:rPr>
+                <w:rStyle w:val="NormalTok"/>
+              </w:rPr>
+              <w:t xml:space="preserve">depth,</w:t>
+            </w:r>
+            <w:r>
+              <w:br/>
+            </w:r>
+            <w:r>
+              <w:rPr>
+                <w:rStyle w:val="NormalTok"/>
+              </w:rPr>
+              <w:t xml:space="preserve">        </w:t>
+            </w:r>
+            <w:r>
+              <w:rPr>
+                <w:rStyle w:val="AttributeTok"/>
+              </w:rPr>
+              <w:t xml:space="preserve">xend =</w:t>
+            </w:r>
+            <w:r>
+              <w:rPr>
+                <w:rStyle w:val="NormalTok"/>
+              </w:rPr>
+              <w:t xml:space="preserve"> sub</w:t>
+            </w:r>
+            <w:r>
+              <w:rPr>
+                <w:rStyle w:val="SpecialCharTok"/>
+              </w:rPr>
+              <w:t xml:space="preserve">$</w:t>
+            </w:r>
+            <w:r>
+              <w:rPr>
+                <w:rStyle w:val="NormalTok"/>
+              </w:rPr>
+              <w:t xml:space="preserve">nodes</w:t>
+            </w:r>
+            <w:r>
+              <w:rPr>
+                <w:rStyle w:val="SpecialCharTok"/>
+              </w:rPr>
+              <w:t xml:space="preserve">$</w:t>
+            </w:r>
+            <w:r>
+              <w:rPr>
+                <w:rStyle w:val="NormalTok"/>
+              </w:rPr>
+              <w:t xml:space="preserve">x[</w:t>
+            </w:r>
+            <w:r>
+              <w:rPr>
+                <w:rStyle w:val="DecValTok"/>
+              </w:rPr>
+              <w:t xml:space="preserve">1</w:t>
+            </w:r>
+            <w:r>
+              <w:rPr>
+                <w:rStyle w:val="NormalTok"/>
+              </w:rPr>
+              <w:t xml:space="preserve">],</w:t>
+            </w:r>
+            <w:r>
+              <w:br/>
+            </w:r>
+            <w:r>
+              <w:rPr>
+                <w:rStyle w:val="NormalTok"/>
+              </w:rPr>
+              <w:t xml:space="preserve">        </w:t>
+            </w:r>
+            <w:r>
+              <w:rPr>
+                <w:rStyle w:val="AttributeTok"/>
+              </w:rPr>
+              <w:t xml:space="preserve">yend =</w:t>
+            </w:r>
+            <w:r>
+              <w:rPr>
+                <w:rStyle w:val="NormalTok"/>
+              </w:rPr>
+              <w:t xml:space="preserve"> sub</w:t>
+            </w:r>
+            <w:r>
+              <w:rPr>
+                <w:rStyle w:val="SpecialCharTok"/>
+              </w:rPr>
+              <w:t xml:space="preserve">$</w:t>
+            </w:r>
+            <w:r>
+              <w:rPr>
+                <w:rStyle w:val="NormalTok"/>
+              </w:rPr>
+              <w:t xml:space="preserve">nodes</w:t>
+            </w:r>
+            <w:r>
+              <w:rPr>
+                <w:rStyle w:val="SpecialCharTok"/>
+              </w:rPr>
+              <w:t xml:space="preserve">$</w:t>
+            </w:r>
+            <w:r>
+              <w:rPr>
+                <w:rStyle w:val="NormalTok"/>
+              </w:rPr>
+              <w:t xml:space="preserve">y[</w:t>
+            </w:r>
+            <w:r>
+              <w:rPr>
+                <w:rStyle w:val="DecValTok"/>
+              </w:rPr>
+              <w:t xml:space="preserve">1</w:t>
+            </w:r>
+            <w:r>
+              <w:rPr>
+                <w:rStyle w:val="NormalTok"/>
+              </w:rPr>
+              <w:t xml:space="preserve">]</w:t>
+            </w:r>
+            <w:r>
+              <w:br/>
+            </w:r>
+            <w:r>
+              <w:rPr>
+                <w:rStyle w:val="NormalTok"/>
+              </w:rPr>
+              <w:t xml:space="preserve">      )</w:t>
+            </w:r>
+            <w:r>
+              <w:br/>
+            </w:r>
+            <w:r>
+              <w:rPr>
+                <w:rStyle w:val="NormalTok"/>
+              </w:rPr>
+              <w:t xml:space="preserve">    )</w:t>
+            </w:r>
+            <w:r>
+              <w:br/>
+            </w:r>
+            <w:r>
+              <w:rPr>
+                <w:rStyle w:val="NormalTok"/>
+              </w:rPr>
+              <w:t xml:space="preserve">    nodes </w:t>
+            </w:r>
+            <w:r>
+              <w:rPr>
+                <w:rStyle w:val="OtherTok"/>
+              </w:rPr>
+              <w:t xml:space="preserve">&lt;-</w:t>
+            </w:r>
+            <w:r>
+              <w:rPr>
+                <w:rStyle w:val="NormalTok"/>
+              </w:rPr>
+              <w:t xml:space="preserve"> </w:t>
+            </w:r>
+            <w:r>
+              <w:rPr>
+                <w:rStyle w:val="FunctionTok"/>
+              </w:rPr>
+              <w:t xml:space="preserve">rbind</w:t>
+            </w:r>
+            <w:r>
+              <w:rPr>
+                <w:rStyle w:val="NormalTok"/>
+              </w:rPr>
+              <w:t xml:space="preserve">(nodes, sub</w:t>
+            </w:r>
+            <w:r>
+              <w:rPr>
+                <w:rStyle w:val="SpecialCharTok"/>
+              </w:rPr>
+              <w:t xml:space="preserve">$</w:t>
+            </w:r>
+            <w:r>
+              <w:rPr>
+                <w:rStyle w:val="NormalTok"/>
+              </w:rPr>
+              <w:t xml:space="preserve">nodes)</w:t>
+            </w:r>
+            <w:r>
+              <w:br/>
+            </w:r>
+            <w:r>
+              <w:rPr>
+                <w:rStyle w:val="NormalTok"/>
+              </w:rPr>
+              <w:t xml:space="preserve">  }</w:t>
+            </w:r>
+            <w:r>
+              <w:br/>
+            </w:r>
+            <w:r>
+              <w:rPr>
+                <w:rStyle w:val="NormalTok"/>
+              </w:rPr>
+              <w:t xml:space="preserve">  me </w:t>
+            </w:r>
+            <w:r>
+              <w:rPr>
+                <w:rStyle w:val="OtherTok"/>
+              </w:rPr>
+              <w:t xml:space="preserve">&lt;-</w:t>
+            </w:r>
+            <w:r>
+              <w:rPr>
+                <w:rStyle w:val="NormalTok"/>
+              </w:rPr>
+              <w:t xml:space="preserve"> </w:t>
+            </w:r>
+            <w:r>
+              <w:rPr>
+                <w:rStyle w:val="FunctionTok"/>
+              </w:rPr>
+              <w:t xml:space="preserve">data.frame</w:t>
+            </w:r>
+            <w:r>
+              <w:rPr>
+                <w:rStyle w:val="NormalTok"/>
+              </w:rPr>
+              <w:t xml:space="preserve">(</w:t>
+            </w:r>
+            <w:r>
+              <w:br/>
+            </w:r>
+            <w:r>
+              <w:rPr>
+                <w:rStyle w:val="NormalTok"/>
+              </w:rPr>
+              <w:t xml:space="preserve">    </w:t>
+            </w:r>
+            <w:r>
+              <w:rPr>
+                <w:rStyle w:val="AttributeTok"/>
+              </w:rPr>
+              <w:t xml:space="preserve">label =</w:t>
+            </w:r>
+            <w:r>
+              <w:rPr>
+                <w:rStyle w:val="NormalTok"/>
+              </w:rPr>
+              <w:t xml:space="preserve"> node[[</w:t>
+            </w:r>
+            <w:r>
+              <w:rPr>
+                <w:rStyle w:val="DecValTok"/>
+              </w:rPr>
+              <w:t xml:space="preserve">1</w:t>
+            </w:r>
+            <w:r>
+              <w:rPr>
+                <w:rStyle w:val="NormalTok"/>
+              </w:rPr>
+              <w:t xml:space="preserve">]],</w:t>
+            </w:r>
+            <w:r>
+              <w:br/>
+            </w:r>
+            <w:r>
+              <w:rPr>
+                <w:rStyle w:val="NormalTok"/>
+              </w:rPr>
+              <w:t xml:space="preserve">    </w:t>
+            </w:r>
+            <w:r>
+              <w:rPr>
+                <w:rStyle w:val="AttributeTok"/>
+              </w:rPr>
+              <w:t xml:space="preserve">x =</w:t>
+            </w:r>
+            <w:r>
+              <w:rPr>
+                <w:rStyle w:val="NormalTok"/>
+              </w:rPr>
+              <w:t xml:space="preserve"> </w:t>
+            </w:r>
+            <w:r>
+              <w:rPr>
+                <w:rStyle w:val="FunctionTok"/>
+              </w:rPr>
+              <w:t xml:space="preserve">mean</w:t>
+            </w:r>
+            <w:r>
+              <w:rPr>
+                <w:rStyle w:val="NormalTok"/>
+              </w:rPr>
+              <w:t xml:space="preserve">(child_x),</w:t>
+            </w:r>
+            <w:r>
+              <w:br/>
+            </w:r>
+            <w:r>
+              <w:rPr>
+                <w:rStyle w:val="NormalTok"/>
+              </w:rPr>
+              <w:t xml:space="preserve">    </w:t>
+            </w:r>
+            <w:r>
+              <w:rPr>
+                <w:rStyle w:val="AttributeTok"/>
+              </w:rPr>
+              <w:t xml:space="preserve">y =</w:t>
+            </w:r>
+            <w:r>
+              <w:rPr>
+                <w:rStyle w:val="NormalTok"/>
+              </w:rPr>
+              <w:t xml:space="preserve"> </w:t>
+            </w:r>
+            <w:r>
+              <w:rPr>
+                <w:rStyle w:val="SpecialCharTok"/>
+              </w:rPr>
+              <w:t xml:space="preserve">-</w:t>
+            </w:r>
+            <w:r>
+              <w:rPr>
+                <w:rStyle w:val="NormalTok"/>
+              </w:rPr>
+              <w:t xml:space="preserve">depth,</w:t>
+            </w:r>
+            <w:r>
+              <w:br/>
+            </w:r>
+            <w:r>
+              <w:rPr>
+                <w:rStyle w:val="NormalTok"/>
+              </w:rPr>
+              <w:t xml:space="preserve">    </w:t>
+            </w:r>
+            <w:r>
+              <w:rPr>
+                <w:rStyle w:val="AttributeTok"/>
+              </w:rPr>
+              <w:t xml:space="preserve">is_leaf =</w:t>
+            </w:r>
+            <w:r>
+              <w:rPr>
+                <w:rStyle w:val="NormalTok"/>
+              </w:rPr>
+              <w:t xml:space="preserve"> </w:t>
+            </w:r>
+            <w:r>
+              <w:rPr>
+                <w:rStyle w:val="ConstantTok"/>
+              </w:rPr>
+              <w:t xml:space="preserve">FALSE</w:t>
+            </w:r>
+            <w:r>
+              <w:br/>
+            </w:r>
+            <w:r>
+              <w:rPr>
+                <w:rStyle w:val="NormalTok"/>
+              </w:rPr>
+              <w:t xml:space="preserve">  )</w:t>
+            </w:r>
+            <w:r>
+              <w:br/>
+            </w:r>
+            <w:r>
+              <w:rPr>
+                <w:rStyle w:val="NormalTok"/>
+              </w:rPr>
+              <w:t xml:space="preserve">  edges</w:t>
+            </w:r>
+            <w:r>
+              <w:rPr>
+                <w:rStyle w:val="SpecialCharTok"/>
+              </w:rPr>
+              <w:t xml:space="preserve">$</w:t>
+            </w:r>
+            <w:r>
+              <w:rPr>
+                <w:rStyle w:val="NormalTok"/>
+              </w:rPr>
+              <w:t xml:space="preserve">x[</w:t>
+            </w:r>
+            <w:r>
+              <w:rPr>
+                <w:rStyle w:val="FunctionTok"/>
+              </w:rPr>
+              <w:t xml:space="preserve">is.na</w:t>
+            </w:r>
+            <w:r>
+              <w:rPr>
+                <w:rStyle w:val="NormalTok"/>
+              </w:rPr>
+              <w:t xml:space="preserve">(edges</w:t>
+            </w:r>
+            <w:r>
+              <w:rPr>
+                <w:rStyle w:val="SpecialCharTok"/>
+              </w:rPr>
+              <w:t xml:space="preserve">$</w:t>
+            </w:r>
+            <w:r>
+              <w:rPr>
+                <w:rStyle w:val="NormalTok"/>
+              </w:rPr>
+              <w:t xml:space="preserve">x)] </w:t>
+            </w:r>
+            <w:r>
+              <w:rPr>
+                <w:rStyle w:val="OtherTok"/>
+              </w:rPr>
+              <w:t xml:space="preserve">&lt;-</w:t>
+            </w:r>
+            <w:r>
+              <w:rPr>
+                <w:rStyle w:val="NormalTok"/>
+              </w:rPr>
+              <w:t xml:space="preserve"> me</w:t>
+            </w:r>
+            <w:r>
+              <w:rPr>
+                <w:rStyle w:val="SpecialCharTok"/>
+              </w:rPr>
+              <w:t xml:space="preserve">$</w:t>
+            </w:r>
+            <w:r>
+              <w:rPr>
+                <w:rStyle w:val="NormalTok"/>
+              </w:rPr>
+              <w:t xml:space="preserve">x</w:t>
+            </w:r>
+            <w:r>
+              <w:br/>
+            </w:r>
+            <w:r>
+              <w:rPr>
+                <w:rStyle w:val="NormalTok"/>
+              </w:rPr>
+              <w:t xml:space="preserve">  </w:t>
+            </w:r>
+            <w:r>
+              <w:rPr>
+                <w:rStyle w:val="FunctionTok"/>
+              </w:rPr>
+              <w:t xml:space="preserve">list</w:t>
+            </w:r>
+            <w:r>
+              <w:rPr>
+                <w:rStyle w:val="NormalTok"/>
+              </w:rPr>
+              <w:t xml:space="preserve">(</w:t>
+            </w:r>
+            <w:r>
+              <w:rPr>
+                <w:rStyle w:val="AttributeTok"/>
+              </w:rPr>
+              <w:t xml:space="preserve">nodes =</w:t>
+            </w:r>
+            <w:r>
+              <w:rPr>
+                <w:rStyle w:val="NormalTok"/>
+              </w:rPr>
+              <w:t xml:space="preserve"> </w:t>
+            </w:r>
+            <w:r>
+              <w:rPr>
+                <w:rStyle w:val="FunctionTok"/>
+              </w:rPr>
+              <w:t xml:space="preserve">rbind</w:t>
+            </w:r>
+            <w:r>
+              <w:rPr>
+                <w:rStyle w:val="NormalTok"/>
+              </w:rPr>
+              <w:t xml:space="preserve">(me, nodes), </w:t>
+            </w:r>
+            <w:r>
+              <w:rPr>
+                <w:rStyle w:val="AttributeTok"/>
+              </w:rPr>
+              <w:t xml:space="preserve">edges =</w:t>
+            </w:r>
+            <w:r>
+              <w:rPr>
+                <w:rStyle w:val="NormalTok"/>
+              </w:rPr>
+              <w:t xml:space="preserve"> edges, </w:t>
+            </w:r>
+            <w:r>
+              <w:rPr>
+                <w:rStyle w:val="AttributeTok"/>
+              </w:rPr>
+              <w:t xml:space="preserve">next_x =</w:t>
+            </w:r>
+            <w:r>
+              <w:rPr>
+                <w:rStyle w:val="NormalTok"/>
+              </w:rPr>
+              <w:t xml:space="preserve"> next_x)</w:t>
+            </w:r>
+            <w:r>
+              <w:br/>
+            </w:r>
+            <w:r>
+              <w:rPr>
+                <w:rStyle w:val="NormalTok"/>
+              </w:rPr>
+              <w:t xml:space="preserve">}</w:t>
+            </w:r>
+            <w:r>
+              <w:br/>
+            </w:r>
+            <w:r>
+              <w:br/>
+            </w:r>
+            <w:r>
+              <w:rPr>
+                <w:rStyle w:val="NormalTok"/>
+              </w:rPr>
+              <w:t xml:space="preserve">laid_out </w:t>
+            </w:r>
+            <w:r>
+              <w:rPr>
+                <w:rStyle w:val="OtherTok"/>
+              </w:rPr>
+              <w:t xml:space="preserve">&lt;-</w:t>
+            </w:r>
+            <w:r>
+              <w:rPr>
+                <w:rStyle w:val="NormalTok"/>
+              </w:rPr>
+              <w:t xml:space="preserve"> </w:t>
+            </w:r>
+            <w:r>
+              <w:rPr>
+                <w:rStyle w:val="FunctionTok"/>
+              </w:rPr>
+              <w:t xml:space="preserve">lapply</w:t>
+            </w:r>
+            <w:r>
+              <w:rPr>
+                <w:rStyle w:val="NormalTok"/>
+              </w:rPr>
+              <w:t xml:space="preserve">(trees, layout_tree)</w:t>
+            </w:r>
+            <w:r>
+              <w:br/>
+            </w:r>
+            <w:r>
+              <w:rPr>
+                <w:rStyle w:val="NormalTok"/>
+              </w:rPr>
+              <w:t xml:space="preserve">tree_nodes </w:t>
+            </w:r>
+            <w:r>
+              <w:rPr>
+                <w:rStyle w:val="OtherTok"/>
+              </w:rPr>
+              <w:t xml:space="preserve">&lt;-</w:t>
+            </w:r>
+            <w:r>
+              <w:rPr>
+                <w:rStyle w:val="NormalTok"/>
+              </w:rPr>
+              <w:t xml:space="preserve"> </w:t>
+            </w:r>
+            <w:r>
+              <w:rPr>
+                <w:rStyle w:val="FunctionTok"/>
+              </w:rPr>
+              <w:t xml:space="preserve">do.call</w:t>
+            </w:r>
+            <w:r>
+              <w:rPr>
+                <w:rStyle w:val="NormalTok"/>
+              </w:rPr>
+              <w:t xml:space="preserve">(rbind, </w:t>
+            </w:r>
+            <w:r>
+              <w:rPr>
+                <w:rStyle w:val="FunctionTok"/>
+              </w:rPr>
+              <w:t xml:space="preserve">Map</w:t>
+            </w:r>
+            <w:r>
+              <w:rPr>
+                <w:rStyle w:val="NormalTok"/>
+              </w:rPr>
+              <w:t xml:space="preserve">(</w:t>
+            </w:r>
+            <w:r>
+              <w:br/>
+            </w:r>
+            <w:r>
+              <w:rPr>
+                <w:rStyle w:val="NormalTok"/>
+              </w:rPr>
+              <w:t xml:space="preserve">  </w:t>
+            </w:r>
+            <w:r>
+              <w:rPr>
+                <w:rStyle w:val="ControlFlowTok"/>
+              </w:rPr>
+              <w:t xml:space="preserve">function</w:t>
+            </w:r>
+            <w:r>
+              <w:rPr>
+                <w:rStyle w:val="NormalTok"/>
+              </w:rPr>
+              <w:t xml:space="preserve">(res, name) </w:t>
+            </w:r>
+            <w:r>
+              <w:rPr>
+                <w:rStyle w:val="FunctionTok"/>
+              </w:rPr>
+              <w:t xml:space="preserve">cbind</w:t>
+            </w:r>
+            <w:r>
+              <w:rPr>
+                <w:rStyle w:val="NormalTok"/>
+              </w:rPr>
+              <w:t xml:space="preserve">(res</w:t>
+            </w:r>
+            <w:r>
+              <w:rPr>
+                <w:rStyle w:val="SpecialCharTok"/>
+              </w:rPr>
+              <w:t xml:space="preserve">$</w:t>
+            </w:r>
+            <w:r>
+              <w:rPr>
+                <w:rStyle w:val="NormalTok"/>
+              </w:rPr>
+              <w:t xml:space="preserve">nodes, </w:t>
+            </w:r>
+            <w:r>
+              <w:rPr>
+                <w:rStyle w:val="AttributeTok"/>
+              </w:rPr>
+              <w:t xml:space="preserve">tree =</w:t>
+            </w:r>
+            <w:r>
+              <w:rPr>
+                <w:rStyle w:val="NormalTok"/>
+              </w:rPr>
+              <w:t xml:space="preserve"> name),</w:t>
+            </w:r>
+            <w:r>
+              <w:br/>
+            </w:r>
+            <w:r>
+              <w:rPr>
+                <w:rStyle w:val="NormalTok"/>
+              </w:rPr>
+              <w:t xml:space="preserve">  laid_out,</w:t>
+            </w:r>
+            <w:r>
+              <w:br/>
+            </w:r>
+            <w:r>
+              <w:rPr>
+                <w:rStyle w:val="NormalTok"/>
+              </w:rPr>
+              <w:t xml:space="preserve">  </w:t>
+            </w:r>
+            <w:r>
+              <w:rPr>
+                <w:rStyle w:val="FunctionTok"/>
+              </w:rPr>
+              <w:t xml:space="preserve">names</w:t>
+            </w:r>
+            <w:r>
+              <w:rPr>
+                <w:rStyle w:val="NormalTok"/>
+              </w:rPr>
+              <w:t xml:space="preserve">(trees)</w:t>
+            </w:r>
+            <w:r>
+              <w:br/>
+            </w:r>
+            <w:r>
+              <w:rPr>
+                <w:rStyle w:val="NormalTok"/>
+              </w:rPr>
+              <w:t xml:space="preserve">))</w:t>
+            </w:r>
+            <w:r>
+              <w:br/>
+            </w:r>
+            <w:r>
+              <w:rPr>
+                <w:rStyle w:val="NormalTok"/>
+              </w:rPr>
+              <w:t xml:space="preserve">tree_edges </w:t>
+            </w:r>
+            <w:r>
+              <w:rPr>
+                <w:rStyle w:val="OtherTok"/>
+              </w:rPr>
+              <w:t xml:space="preserve">&lt;-</w:t>
+            </w:r>
+            <w:r>
+              <w:rPr>
+                <w:rStyle w:val="NormalTok"/>
+              </w:rPr>
+              <w:t xml:space="preserve"> </w:t>
+            </w:r>
+            <w:r>
+              <w:rPr>
+                <w:rStyle w:val="FunctionTok"/>
+              </w:rPr>
+              <w:t xml:space="preserve">do.call</w:t>
+            </w:r>
+            <w:r>
+              <w:rPr>
+                <w:rStyle w:val="NormalTok"/>
+              </w:rPr>
+              <w:t xml:space="preserve">(rbind, </w:t>
+            </w:r>
+            <w:r>
+              <w:rPr>
+                <w:rStyle w:val="FunctionTok"/>
+              </w:rPr>
+              <w:t xml:space="preserve">Map</w:t>
+            </w:r>
+            <w:r>
+              <w:rPr>
+                <w:rStyle w:val="NormalTok"/>
+              </w:rPr>
+              <w:t xml:space="preserve">(</w:t>
+            </w:r>
+            <w:r>
+              <w:br/>
+            </w:r>
+            <w:r>
+              <w:rPr>
+                <w:rStyle w:val="NormalTok"/>
+              </w:rPr>
+              <w:t xml:space="preserve">  </w:t>
+            </w:r>
+            <w:r>
+              <w:rPr>
+                <w:rStyle w:val="ControlFlowTok"/>
+              </w:rPr>
+              <w:t xml:space="preserve">function</w:t>
+            </w:r>
+            <w:r>
+              <w:rPr>
+                <w:rStyle w:val="NormalTok"/>
+              </w:rPr>
+              <w:t xml:space="preserve">(res, name) </w:t>
+            </w:r>
+            <w:r>
+              <w:rPr>
+                <w:rStyle w:val="FunctionTok"/>
+              </w:rPr>
+              <w:t xml:space="preserve">cbind</w:t>
+            </w:r>
+            <w:r>
+              <w:rPr>
+                <w:rStyle w:val="NormalTok"/>
+              </w:rPr>
+              <w:t xml:space="preserve">(res</w:t>
+            </w:r>
+            <w:r>
+              <w:rPr>
+                <w:rStyle w:val="SpecialCharTok"/>
+              </w:rPr>
+              <w:t xml:space="preserve">$</w:t>
+            </w:r>
+            <w:r>
+              <w:rPr>
+                <w:rStyle w:val="NormalTok"/>
+              </w:rPr>
+              <w:t xml:space="preserve">edges, </w:t>
+            </w:r>
+            <w:r>
+              <w:rPr>
+                <w:rStyle w:val="AttributeTok"/>
+              </w:rPr>
+              <w:t xml:space="preserve">tree =</w:t>
+            </w:r>
+            <w:r>
+              <w:rPr>
+                <w:rStyle w:val="NormalTok"/>
+              </w:rPr>
+              <w:t xml:space="preserve"> name),</w:t>
+            </w:r>
+            <w:r>
+              <w:br/>
+            </w:r>
+            <w:r>
+              <w:rPr>
+                <w:rStyle w:val="NormalTok"/>
+              </w:rPr>
+              <w:t xml:space="preserve">  laid_out,</w:t>
+            </w:r>
+            <w:r>
+              <w:br/>
+            </w:r>
+            <w:r>
+              <w:rPr>
+                <w:rStyle w:val="NormalTok"/>
+              </w:rPr>
+              <w:t xml:space="preserve">  </w:t>
+            </w:r>
+            <w:r>
+              <w:rPr>
+                <w:rStyle w:val="FunctionTok"/>
+              </w:rPr>
+              <w:t xml:space="preserve">names</w:t>
+            </w:r>
+            <w:r>
+              <w:rPr>
+                <w:rStyle w:val="NormalTok"/>
+              </w:rPr>
+              <w:t xml:space="preserve">(trees)</w:t>
+            </w:r>
+            <w:r>
+              <w:br/>
+            </w:r>
+            <w:r>
+              <w:rPr>
+                <w:rStyle w:val="NormalTok"/>
+              </w:rPr>
+              <w:t xml:space="preserve">))</w:t>
+            </w:r>
+            <w:r>
+              <w:br/>
+            </w:r>
+            <w:r>
+              <w:rPr>
+                <w:rStyle w:val="NormalTok"/>
+              </w:rPr>
+              <w:t xml:space="preserve">tree_nodes</w:t>
+            </w:r>
+            <w:r>
+              <w:rPr>
+                <w:rStyle w:val="SpecialCharTok"/>
+              </w:rPr>
+              <w:t xml:space="preserve">$</w:t>
+            </w:r>
+            <w:r>
+              <w:rPr>
+                <w:rStyle w:val="NormalTok"/>
+              </w:rPr>
+              <w:t xml:space="preserve">kind </w:t>
+            </w:r>
+            <w:r>
+              <w:rPr>
+                <w:rStyle w:val="OtherTok"/>
+              </w:rPr>
+              <w:t xml:space="preserve">&lt;-</w:t>
+            </w:r>
+            <w:r>
+              <w:rPr>
+                <w:rStyle w:val="NormalTok"/>
+              </w:rPr>
+              <w:t xml:space="preserve"> </w:t>
+            </w:r>
+            <w:r>
+              <w:rPr>
+                <w:rStyle w:val="FunctionTok"/>
+              </w:rPr>
+              <w:t xml:space="preserve">ifelse</w:t>
+            </w:r>
+            <w:r>
+              <w:rPr>
+                <w:rStyle w:val="NormalTok"/>
+              </w:rPr>
+              <w:t xml:space="preserve">(tree_nodes</w:t>
+            </w:r>
+            <w:r>
+              <w:rPr>
+                <w:rStyle w:val="SpecialCharTok"/>
+              </w:rPr>
+              <w:t xml:space="preserve">$</w:t>
+            </w:r>
+            <w:r>
+              <w:rPr>
+                <w:rStyle w:val="NormalTok"/>
+              </w:rPr>
+              <w:t xml:space="preserve">is_leaf, </w:t>
+            </w:r>
+            <w:r>
+              <w:rPr>
+                <w:rStyle w:val="StringTok"/>
+              </w:rPr>
+              <w:t xml:space="preserve">"leaf"</w:t>
+            </w:r>
+            <w:r>
+              <w:rPr>
+                <w:rStyle w:val="NormalTok"/>
+              </w:rPr>
+              <w:t xml:space="preserve">, </w:t>
+            </w:r>
+            <w:r>
+              <w:rPr>
+                <w:rStyle w:val="StringTok"/>
+              </w:rPr>
+              <w:t xml:space="preserve">"operation"</w:t>
+            </w:r>
+            <w:r>
+              <w:rPr>
+                <w:rStyle w:val="NormalTok"/>
+              </w:rPr>
+              <w:t xml:space="preserve">)</w:t>
+            </w:r>
+            <w:r>
+              <w:br/>
+            </w:r>
+            <w:r>
+              <w:rPr>
+                <w:rStyle w:val="NormalTok"/>
+              </w:rPr>
+              <w:t xml:space="preserve">tree_nodes</w:t>
+            </w:r>
+            <w:r>
+              <w:rPr>
+                <w:rStyle w:val="SpecialCharTok"/>
+              </w:rPr>
+              <w:t xml:space="preserve">$</w:t>
+            </w:r>
+            <w:r>
+              <w:rPr>
+                <w:rStyle w:val="NormalTok"/>
+              </w:rPr>
+              <w:t xml:space="preserve">tree </w:t>
+            </w:r>
+            <w:r>
+              <w:rPr>
+                <w:rStyle w:val="OtherTok"/>
+              </w:rPr>
+              <w:t xml:space="preserve">&lt;-</w:t>
+            </w:r>
+            <w:r>
+              <w:rPr>
+                <w:rStyle w:val="NormalTok"/>
+              </w:rPr>
+              <w:t xml:space="preserve"> </w:t>
+            </w:r>
+            <w:r>
+              <w:rPr>
+                <w:rStyle w:val="FunctionTok"/>
+              </w:rPr>
+              <w:t xml:space="preserve">factor</w:t>
+            </w:r>
+            <w:r>
+              <w:rPr>
+                <w:rStyle w:val="NormalTok"/>
+              </w:rPr>
+              <w:t xml:space="preserve">(tree_nodes</w:t>
+            </w:r>
+            <w:r>
+              <w:rPr>
+                <w:rStyle w:val="SpecialCharTok"/>
+              </w:rPr>
+              <w:t xml:space="preserve">$</w:t>
+            </w:r>
+            <w:r>
+              <w:rPr>
+                <w:rStyle w:val="NormalTok"/>
+              </w:rPr>
+              <w:t xml:space="preserve">tree, </w:t>
+            </w:r>
+            <w:r>
+              <w:rPr>
+                <w:rStyle w:val="AttributeTok"/>
+              </w:rPr>
+              <w:t xml:space="preserve">levels =</w:t>
+            </w:r>
+            <w:r>
+              <w:rPr>
+                <w:rStyle w:val="NormalTok"/>
+              </w:rPr>
+              <w:t xml:space="preserve"> </w:t>
+            </w:r>
+            <w:r>
+              <w:rPr>
+                <w:rStyle w:val="FunctionTok"/>
+              </w:rPr>
+              <w:t xml:space="preserve">names</w:t>
+            </w:r>
+            <w:r>
+              <w:rPr>
+                <w:rStyle w:val="NormalTok"/>
+              </w:rPr>
+              <w:t xml:space="preserve">(trees))</w:t>
+            </w:r>
+            <w:r>
+              <w:br/>
+            </w:r>
+            <w:r>
+              <w:rPr>
+                <w:rStyle w:val="NormalTok"/>
+              </w:rPr>
+              <w:t xml:space="preserve">tree_edges</w:t>
+            </w:r>
+            <w:r>
+              <w:rPr>
+                <w:rStyle w:val="SpecialCharTok"/>
+              </w:rPr>
+              <w:t xml:space="preserve">$</w:t>
+            </w:r>
+            <w:r>
+              <w:rPr>
+                <w:rStyle w:val="NormalTok"/>
+              </w:rPr>
+              <w:t xml:space="preserve">tree </w:t>
+            </w:r>
+            <w:r>
+              <w:rPr>
+                <w:rStyle w:val="OtherTok"/>
+              </w:rPr>
+              <w:t xml:space="preserve">&lt;-</w:t>
+            </w:r>
+            <w:r>
+              <w:rPr>
+                <w:rStyle w:val="NormalTok"/>
+              </w:rPr>
+              <w:t xml:space="preserve"> </w:t>
+            </w:r>
+            <w:r>
+              <w:rPr>
+                <w:rStyle w:val="FunctionTok"/>
+              </w:rPr>
+              <w:t xml:space="preserve">factor</w:t>
+            </w:r>
+            <w:r>
+              <w:rPr>
+                <w:rStyle w:val="NormalTok"/>
+              </w:rPr>
+              <w:t xml:space="preserve">(tree_edges</w:t>
+            </w:r>
+            <w:r>
+              <w:rPr>
+                <w:rStyle w:val="SpecialCharTok"/>
+              </w:rPr>
+              <w:t xml:space="preserve">$</w:t>
+            </w:r>
+            <w:r>
+              <w:rPr>
+                <w:rStyle w:val="NormalTok"/>
+              </w:rPr>
+              <w:t xml:space="preserve">tree, </w:t>
+            </w:r>
+            <w:r>
+              <w:rPr>
+                <w:rStyle w:val="AttributeTok"/>
+              </w:rPr>
+              <w:t xml:space="preserve">levels =</w:t>
+            </w:r>
+            <w:r>
+              <w:rPr>
+                <w:rStyle w:val="NormalTok"/>
+              </w:rPr>
+              <w:t xml:space="preserve"> </w:t>
+            </w:r>
+            <w:r>
+              <w:rPr>
+                <w:rStyle w:val="FunctionTok"/>
+              </w:rPr>
+              <w:t xml:space="preserve">names</w:t>
+            </w:r>
+            <w:r>
+              <w:rPr>
+                <w:rStyle w:val="NormalTok"/>
+              </w:rPr>
+              <w:t xml:space="preserve">(trees))</w:t>
+            </w:r>
+            <w:r>
+              <w:br/>
+            </w:r>
+            <w:r>
+              <w:br/>
+            </w:r>
+            <w:r>
+              <w:rPr>
+                <w:rStyle w:val="NormalTok"/>
+              </w:rPr>
+              <w:t xml:space="preserve">ggplot2</w:t>
+            </w:r>
+            <w:r>
+              <w:rPr>
+                <w:rStyle w:val="SpecialCharTok"/>
+              </w:rPr>
+              <w:t xml:space="preserve">::</w:t>
+            </w:r>
+            <w:r>
+              <w:rPr>
+                <w:rStyle w:val="FunctionTok"/>
+              </w:rPr>
+              <w:t xml:space="preserve">ggplot</w:t>
+            </w:r>
+            <w:r>
+              <w:rPr>
+                <w:rStyle w:val="NormalTok"/>
+              </w:rPr>
+              <w:t xml:space="preserve">() </w:t>
+            </w:r>
+            <w:r>
+              <w:rPr>
+                <w:rStyle w:val="SpecialCharTok"/>
+              </w:rPr>
+              <w:t xml:space="preserve">+</w:t>
+            </w:r>
+            <w:r>
+              <w:br/>
+            </w:r>
+            <w:r>
+              <w:rPr>
+                <w:rStyle w:val="NormalTok"/>
+              </w:rPr>
+              <w:t xml:space="preserve">  ggplot2</w:t>
+            </w:r>
+            <w:r>
+              <w:rPr>
+                <w:rStyle w:val="SpecialCharTok"/>
+              </w:rPr>
+              <w:t xml:space="preserve">::</w:t>
+            </w:r>
+            <w:r>
+              <w:rPr>
+                <w:rStyle w:val="FunctionTok"/>
+              </w:rPr>
+              <w:t xml:space="preserve">geom_segment</w:t>
+            </w:r>
+            <w:r>
+              <w:rPr>
+                <w:rStyle w:val="NormalTok"/>
+              </w:rPr>
+              <w:t xml:space="preserve">(</w:t>
+            </w:r>
+            <w:r>
+              <w:br/>
+            </w:r>
+            <w:r>
+              <w:rPr>
+                <w:rStyle w:val="NormalTok"/>
+              </w:rPr>
+              <w:t xml:space="preserve">    </w:t>
+            </w:r>
+            <w:r>
+              <w:rPr>
+                <w:rStyle w:val="AttributeTok"/>
+              </w:rPr>
+              <w:t xml:space="preserve">data =</w:t>
+            </w:r>
+            <w:r>
+              <w:rPr>
+                <w:rStyle w:val="NormalTok"/>
+              </w:rPr>
+              <w:t xml:space="preserve"> tree_edges,</w:t>
+            </w:r>
+            <w:r>
+              <w:br/>
+            </w:r>
+            <w:r>
+              <w:rPr>
+                <w:rStyle w:val="NormalTok"/>
+              </w:rPr>
+              <w:t xml:space="preserve">    ggplot2</w:t>
+            </w:r>
+            <w:r>
+              <w:rPr>
+                <w:rStyle w:val="SpecialCharTok"/>
+              </w:rPr>
+              <w:t xml:space="preserve">::</w:t>
+            </w:r>
+            <w:r>
+              <w:rPr>
+                <w:rStyle w:val="FunctionTok"/>
+              </w:rPr>
+              <w:t xml:space="preserve">aes</w:t>
+            </w:r>
+            <w:r>
+              <w:rPr>
+                <w:rStyle w:val="NormalTok"/>
+              </w:rPr>
+              <w:t xml:space="preserve">(</w:t>
+            </w:r>
+            <w:r>
+              <w:rPr>
+                <w:rStyle w:val="AttributeTok"/>
+              </w:rPr>
+              <w:t xml:space="preserve">x =</w:t>
+            </w:r>
+            <w:r>
+              <w:rPr>
+                <w:rStyle w:val="NormalTok"/>
+              </w:rPr>
+              <w:t xml:space="preserve"> x, </w:t>
+            </w:r>
+            <w:r>
+              <w:rPr>
+                <w:rStyle w:val="AttributeTok"/>
+              </w:rPr>
+              <w:t xml:space="preserve">y =</w:t>
+            </w:r>
+            <w:r>
+              <w:rPr>
+                <w:rStyle w:val="NormalTok"/>
+              </w:rPr>
+              <w:t xml:space="preserve"> y, </w:t>
+            </w:r>
+            <w:r>
+              <w:rPr>
+                <w:rStyle w:val="AttributeTok"/>
+              </w:rPr>
+              <w:t xml:space="preserve">xend =</w:t>
+            </w:r>
+            <w:r>
+              <w:rPr>
+                <w:rStyle w:val="NormalTok"/>
+              </w:rPr>
+              <w:t xml:space="preserve"> xend, </w:t>
+            </w:r>
+            <w:r>
+              <w:rPr>
+                <w:rStyle w:val="AttributeTok"/>
+              </w:rPr>
+              <w:t xml:space="preserve">yend =</w:t>
+            </w:r>
+            <w:r>
+              <w:rPr>
+                <w:rStyle w:val="NormalTok"/>
+              </w:rPr>
+              <w:t xml:space="preserve"> yend),</w:t>
+            </w:r>
+            <w:r>
+              <w:br/>
+            </w:r>
+            <w:r>
+              <w:rPr>
+                <w:rStyle w:val="NormalTok"/>
+              </w:rPr>
+              <w:t xml:space="preserve">    </w:t>
+            </w:r>
+            <w:r>
+              <w:rPr>
+                <w:rStyle w:val="AttributeTok"/>
+              </w:rPr>
+              <w:t xml:space="preserve">colour =</w:t>
+            </w:r>
+            <w:r>
+              <w:rPr>
+                <w:rStyle w:val="NormalTok"/>
+              </w:rPr>
+              <w:t xml:space="preserve"> </w:t>
+            </w:r>
+            <w:r>
+              <w:rPr>
+                <w:rStyle w:val="StringTok"/>
+              </w:rPr>
+              <w:t xml:space="preserve">"grey50"</w:t>
+            </w:r>
+            <w:r>
+              <w:br/>
+            </w:r>
+            <w:r>
+              <w:rPr>
+                <w:rStyle w:val="NormalTok"/>
+              </w:rPr>
+              <w:t xml:space="preserve">  ) </w:t>
+            </w:r>
+            <w:r>
+              <w:rPr>
+                <w:rStyle w:val="SpecialCharTok"/>
+              </w:rPr>
+              <w:t xml:space="preserve">+</w:t>
+            </w:r>
+            <w:r>
+              <w:br/>
+            </w:r>
+            <w:r>
+              <w:rPr>
+                <w:rStyle w:val="NormalTok"/>
+              </w:rPr>
+              <w:t xml:space="preserve">  ggplot2</w:t>
+            </w:r>
+            <w:r>
+              <w:rPr>
+                <w:rStyle w:val="SpecialCharTok"/>
+              </w:rPr>
+              <w:t xml:space="preserve">::</w:t>
+            </w:r>
+            <w:r>
+              <w:rPr>
+                <w:rStyle w:val="FunctionTok"/>
+              </w:rPr>
+              <w:t xml:space="preserve">geom_label</w:t>
+            </w:r>
+            <w:r>
+              <w:rPr>
+                <w:rStyle w:val="NormalTok"/>
+              </w:rPr>
+              <w:t xml:space="preserve">(</w:t>
+            </w:r>
+            <w:r>
+              <w:br/>
+            </w:r>
+            <w:r>
+              <w:rPr>
+                <w:rStyle w:val="NormalTok"/>
+              </w:rPr>
+              <w:t xml:space="preserve">    </w:t>
+            </w:r>
+            <w:r>
+              <w:rPr>
+                <w:rStyle w:val="AttributeTok"/>
+              </w:rPr>
+              <w:t xml:space="preserve">data =</w:t>
+            </w:r>
+            <w:r>
+              <w:rPr>
+                <w:rStyle w:val="NormalTok"/>
+              </w:rPr>
+              <w:t xml:space="preserve"> tree_nodes,</w:t>
+            </w:r>
+            <w:r>
+              <w:br/>
+            </w:r>
+            <w:r>
+              <w:rPr>
+                <w:rStyle w:val="NormalTok"/>
+              </w:rPr>
+              <w:t xml:space="preserve">    ggplot2</w:t>
+            </w:r>
+            <w:r>
+              <w:rPr>
+                <w:rStyle w:val="SpecialCharTok"/>
+              </w:rPr>
+              <w:t xml:space="preserve">::</w:t>
+            </w:r>
+            <w:r>
+              <w:rPr>
+                <w:rStyle w:val="FunctionTok"/>
+              </w:rPr>
+              <w:t xml:space="preserve">aes</w:t>
+            </w:r>
+            <w:r>
+              <w:rPr>
+                <w:rStyle w:val="NormalTok"/>
+              </w:rPr>
+              <w:t xml:space="preserve">(</w:t>
+            </w:r>
+            <w:r>
+              <w:rPr>
+                <w:rStyle w:val="AttributeTok"/>
+              </w:rPr>
+              <w:t xml:space="preserve">x =</w:t>
+            </w:r>
+            <w:r>
+              <w:rPr>
+                <w:rStyle w:val="NormalTok"/>
+              </w:rPr>
+              <w:t xml:space="preserve"> x, </w:t>
+            </w:r>
+            <w:r>
+              <w:rPr>
+                <w:rStyle w:val="AttributeTok"/>
+              </w:rPr>
+              <w:t xml:space="preserve">y =</w:t>
+            </w:r>
+            <w:r>
+              <w:rPr>
+                <w:rStyle w:val="NormalTok"/>
+              </w:rPr>
+              <w:t xml:space="preserve"> y, </w:t>
+            </w:r>
+            <w:r>
+              <w:rPr>
+                <w:rStyle w:val="AttributeTok"/>
+              </w:rPr>
+              <w:t xml:space="preserve">label =</w:t>
+            </w:r>
+            <w:r>
+              <w:rPr>
+                <w:rStyle w:val="NormalTok"/>
+              </w:rPr>
+              <w:t xml:space="preserve"> label, </w:t>
+            </w:r>
+            <w:r>
+              <w:rPr>
+                <w:rStyle w:val="AttributeTok"/>
+              </w:rPr>
+              <w:t xml:space="preserve">fill =</w:t>
+            </w:r>
+            <w:r>
+              <w:rPr>
+                <w:rStyle w:val="NormalTok"/>
+              </w:rPr>
+              <w:t xml:space="preserve"> kind),</w:t>
+            </w:r>
+            <w:r>
+              <w:br/>
+            </w:r>
+            <w:r>
+              <w:rPr>
+                <w:rStyle w:val="NormalTok"/>
+              </w:rPr>
+              <w:t xml:space="preserve">    </w:t>
+            </w:r>
+            <w:r>
+              <w:rPr>
+                <w:rStyle w:val="AttributeTok"/>
+              </w:rPr>
+              <w:t xml:space="preserve">size =</w:t>
+            </w:r>
+            <w:r>
+              <w:rPr>
+                <w:rStyle w:val="NormalTok"/>
+              </w:rPr>
+              <w:t xml:space="preserve"> </w:t>
+            </w:r>
+            <w:r>
+              <w:rPr>
+                <w:rStyle w:val="DecValTok"/>
+              </w:rPr>
+              <w:t xml:space="preserve">5</w:t>
+            </w:r>
+            <w:r>
+              <w:rPr>
+                <w:rStyle w:val="NormalTok"/>
+              </w:rPr>
+              <w:t xml:space="preserve">,</w:t>
+            </w:r>
+            <w:r>
+              <w:br/>
+            </w:r>
+            <w:r>
+              <w:rPr>
+                <w:rStyle w:val="NormalTok"/>
+              </w:rPr>
+              <w:t xml:space="preserve">    </w:t>
+            </w:r>
+            <w:r>
+              <w:rPr>
+                <w:rStyle w:val="AttributeTok"/>
+              </w:rPr>
+              <w:t xml:space="preserve">linewidth =</w:t>
+            </w:r>
+            <w:r>
+              <w:rPr>
+                <w:rStyle w:val="NormalTok"/>
+              </w:rPr>
+              <w:t xml:space="preserve"> </w:t>
+            </w:r>
+            <w:r>
+              <w:rPr>
+                <w:rStyle w:val="DecValTok"/>
+              </w:rPr>
+              <w:t xml:space="preserve">0</w:t>
+            </w:r>
+            <w:r>
+              <w:br/>
+            </w:r>
+            <w:r>
+              <w:rPr>
+                <w:rStyle w:val="NormalTok"/>
+              </w:rPr>
+              <w:t xml:space="preserve">  ) </w:t>
+            </w:r>
+            <w:r>
+              <w:rPr>
+                <w:rStyle w:val="SpecialCharTok"/>
+              </w:rPr>
+              <w:t xml:space="preserve">+</w:t>
+            </w:r>
+            <w:r>
+              <w:br/>
+            </w:r>
+            <w:r>
+              <w:rPr>
+                <w:rStyle w:val="NormalTok"/>
+              </w:rPr>
+              <w:t xml:space="preserve">  ggplot2</w:t>
+            </w:r>
+            <w:r>
+              <w:rPr>
+                <w:rStyle w:val="SpecialCharTok"/>
+              </w:rPr>
+              <w:t xml:space="preserve">::</w:t>
+            </w:r>
+            <w:r>
+              <w:rPr>
+                <w:rStyle w:val="FunctionTok"/>
+              </w:rPr>
+              <w:t xml:space="preserve">scale_fill_manual</w:t>
+            </w:r>
+            <w:r>
+              <w:rPr>
+                <w:rStyle w:val="NormalTok"/>
+              </w:rPr>
+              <w:t xml:space="preserve">(</w:t>
+            </w:r>
+            <w:r>
+              <w:br/>
+            </w:r>
+            <w:r>
+              <w:rPr>
+                <w:rStyle w:val="NormalTok"/>
+              </w:rPr>
+              <w:t xml:space="preserve">    </w:t>
+            </w:r>
+            <w:r>
+              <w:rPr>
+                <w:rStyle w:val="AttributeTok"/>
+              </w:rPr>
+              <w:t xml:space="preserve">values =</w:t>
+            </w:r>
+            <w:r>
+              <w:rPr>
+                <w:rStyle w:val="NormalTok"/>
+              </w:rPr>
+              <w:t xml:space="preserve"> </w:t>
+            </w:r>
+            <w:r>
+              <w:rPr>
+                <w:rStyle w:val="FunctionTok"/>
+              </w:rPr>
+              <w:t xml:space="preserve">c</w:t>
+            </w:r>
+            <w:r>
+              <w:rPr>
+                <w:rStyle w:val="NormalTok"/>
+              </w:rPr>
+              <w:t xml:space="preserve">(</w:t>
+            </w:r>
+            <w:r>
+              <w:rPr>
+                <w:rStyle w:val="AttributeTok"/>
+              </w:rPr>
+              <w:t xml:space="preserve">operation =</w:t>
+            </w:r>
+            <w:r>
+              <w:rPr>
+                <w:rStyle w:val="NormalTok"/>
+              </w:rPr>
+              <w:t xml:space="preserve"> </w:t>
+            </w:r>
+            <w:r>
+              <w:rPr>
+                <w:rStyle w:val="StringTok"/>
+              </w:rPr>
+              <w:t xml:space="preserve">"#CCE5F6"</w:t>
+            </w:r>
+            <w:r>
+              <w:rPr>
+                <w:rStyle w:val="NormalTok"/>
+              </w:rPr>
+              <w:t xml:space="preserve">, </w:t>
+            </w:r>
+            <w:r>
+              <w:rPr>
+                <w:rStyle w:val="AttributeTok"/>
+              </w:rPr>
+              <w:t xml:space="preserve">leaf =</w:t>
+            </w:r>
+            <w:r>
+              <w:rPr>
+                <w:rStyle w:val="NormalTok"/>
+              </w:rPr>
+              <w:t xml:space="preserve"> </w:t>
+            </w:r>
+            <w:r>
+              <w:rPr>
+                <w:rStyle w:val="StringTok"/>
+              </w:rPr>
+              <w:t xml:space="preserve">"#F9DDBF"</w:t>
+            </w:r>
+            <w:r>
+              <w:rPr>
+                <w:rStyle w:val="NormalTok"/>
+              </w:rPr>
+              <w:t xml:space="preserve">)</w:t>
+            </w:r>
+            <w:r>
+              <w:br/>
+            </w:r>
+            <w:r>
+              <w:rPr>
+                <w:rStyle w:val="NormalTok"/>
+              </w:rPr>
+              <w:t xml:space="preserve">  ) </w:t>
+            </w:r>
+            <w:r>
+              <w:rPr>
+                <w:rStyle w:val="SpecialCharTok"/>
+              </w:rPr>
+              <w:t xml:space="preserve">+</w:t>
+            </w:r>
+            <w:r>
+              <w:br/>
+            </w:r>
+            <w:r>
+              <w:rPr>
+                <w:rStyle w:val="NormalTok"/>
+              </w:rPr>
+              <w:t xml:space="preserve">  ggplot2</w:t>
+            </w:r>
+            <w:r>
+              <w:rPr>
+                <w:rStyle w:val="SpecialCharTok"/>
+              </w:rPr>
+              <w:t xml:space="preserve">::</w:t>
+            </w:r>
+            <w:r>
+              <w:rPr>
+                <w:rStyle w:val="FunctionTok"/>
+              </w:rPr>
+              <w:t xml:space="preserve">facet_wrap</w:t>
+            </w:r>
+            <w:r>
+              <w:rPr>
+                <w:rStyle w:val="NormalTok"/>
+              </w:rPr>
+              <w:t xml:space="preserve">(</w:t>
+            </w:r>
+            <w:r>
+              <w:br/>
+            </w:r>
+            <w:r>
+              <w:rPr>
+                <w:rStyle w:val="NormalTok"/>
+              </w:rPr>
+              <w:t xml:space="preserve">    </w:t>
+            </w:r>
+            <w:r>
+              <w:rPr>
+                <w:rStyle w:val="SpecialCharTok"/>
+              </w:rPr>
+              <w:t xml:space="preserve">~</w:t>
+            </w:r>
+            <w:r>
+              <w:rPr>
+                <w:rStyle w:val="NormalTok"/>
+              </w:rPr>
+              <w:t xml:space="preserve">tree,</w:t>
+            </w:r>
+            <w:r>
+              <w:br/>
+            </w:r>
+            <w:r>
+              <w:rPr>
+                <w:rStyle w:val="NormalTok"/>
+              </w:rPr>
+              <w:t xml:space="preserve">    </w:t>
+            </w:r>
+            <w:r>
+              <w:rPr>
+                <w:rStyle w:val="AttributeTok"/>
+              </w:rPr>
+              <w:t xml:space="preserve">scales =</w:t>
+            </w:r>
+            <w:r>
+              <w:rPr>
+                <w:rStyle w:val="NormalTok"/>
+              </w:rPr>
+              <w:t xml:space="preserve"> </w:t>
+            </w:r>
+            <w:r>
+              <w:rPr>
+                <w:rStyle w:val="StringTok"/>
+              </w:rPr>
+              <w:t xml:space="preserve">"free_x"</w:t>
+            </w:r>
+            <w:r>
+              <w:rPr>
+                <w:rStyle w:val="NormalTok"/>
+              </w:rPr>
+              <w:t xml:space="preserve">,</w:t>
+            </w:r>
+            <w:r>
+              <w:br/>
+            </w:r>
+            <w:r>
+              <w:rPr>
+                <w:rStyle w:val="NormalTok"/>
+              </w:rPr>
+              <w:t xml:space="preserve">    </w:t>
+            </w:r>
+            <w:r>
+              <w:rPr>
+                <w:rStyle w:val="AttributeTok"/>
+              </w:rPr>
+              <w:t xml:space="preserve">labeller =</w:t>
+            </w:r>
+            <w:r>
+              <w:rPr>
+                <w:rStyle w:val="NormalTok"/>
+              </w:rPr>
+              <w:t xml:space="preserve"> ggplot2</w:t>
+            </w:r>
+            <w:r>
+              <w:rPr>
+                <w:rStyle w:val="SpecialCharTok"/>
+              </w:rPr>
+              <w:t xml:space="preserve">::</w:t>
+            </w:r>
+            <w:r>
+              <w:rPr>
+                <w:rStyle w:val="NormalTok"/>
+              </w:rPr>
+              <w:t xml:space="preserve">label_parsed</w:t>
+            </w:r>
+            <w:r>
+              <w:br/>
+            </w:r>
+            <w:r>
+              <w:rPr>
+                <w:rStyle w:val="NormalTok"/>
+              </w:rPr>
+              <w:t xml:space="preserve">  ) </w:t>
+            </w:r>
+            <w:r>
+              <w:rPr>
+                <w:rStyle w:val="SpecialCharTok"/>
+              </w:rPr>
+              <w:t xml:space="preserve">+</w:t>
+            </w:r>
+            <w:r>
+              <w:br/>
+            </w:r>
+            <w:r>
+              <w:rPr>
+                <w:rStyle w:val="NormalTok"/>
+              </w:rPr>
+              <w:t xml:space="preserve">  ggplot2</w:t>
+            </w:r>
+            <w:r>
+              <w:rPr>
+                <w:rStyle w:val="SpecialCharTok"/>
+              </w:rPr>
+              <w:t xml:space="preserve">::</w:t>
+            </w:r>
+            <w:r>
+              <w:rPr>
+                <w:rStyle w:val="FunctionTok"/>
+              </w:rPr>
+              <w:t xml:space="preserve">labs</w:t>
+            </w:r>
+            <w:r>
+              <w:rPr>
+                <w:rStyle w:val="NormalTok"/>
+              </w:rPr>
+              <w:t xml:space="preserve">(</w:t>
+            </w:r>
+            <w:r>
+              <w:rPr>
+                <w:rStyle w:val="AttributeTok"/>
+              </w:rPr>
+              <w:t xml:space="preserve">fill =</w:t>
+            </w:r>
+            <w:r>
+              <w:rPr>
+                <w:rStyle w:val="NormalTok"/>
+              </w:rPr>
+              <w:t xml:space="preserve"> </w:t>
+            </w:r>
+            <w:r>
+              <w:rPr>
+                <w:rStyle w:val="StringTok"/>
+              </w:rPr>
+              <w:t xml:space="preserve">"node type"</w:t>
+            </w:r>
+            <w:r>
+              <w:rPr>
+                <w:rStyle w:val="NormalTok"/>
+              </w:rPr>
+              <w:t xml:space="preserve">) </w:t>
+            </w:r>
+            <w:r>
+              <w:rPr>
+                <w:rStyle w:val="SpecialCharTok"/>
+              </w:rPr>
+              <w:t xml:space="preserve">+</w:t>
+            </w:r>
+            <w:r>
+              <w:br/>
+            </w:r>
+            <w:r>
+              <w:rPr>
+                <w:rStyle w:val="NormalTok"/>
+              </w:rPr>
+              <w:t xml:space="preserve">  ggplot2</w:t>
+            </w:r>
+            <w:r>
+              <w:rPr>
+                <w:rStyle w:val="SpecialCharTok"/>
+              </w:rPr>
+              <w:t xml:space="preserve">::</w:t>
+            </w:r>
+            <w:r>
+              <w:rPr>
+                <w:rStyle w:val="FunctionTok"/>
+              </w:rPr>
+              <w:t xml:space="preserve">theme_void</w:t>
+            </w:r>
+            <w:r>
+              <w:rPr>
+                <w:rStyle w:val="NormalTok"/>
+              </w:rPr>
+              <w:t xml:space="preserve">() </w:t>
+            </w:r>
+            <w:r>
+              <w:rPr>
+                <w:rStyle w:val="SpecialCharTok"/>
+              </w:rPr>
+              <w:t xml:space="preserve">+</w:t>
+            </w:r>
+            <w:r>
+              <w:br/>
+            </w:r>
+            <w:r>
+              <w:rPr>
+                <w:rStyle w:val="NormalTok"/>
+              </w:rPr>
+              <w:t xml:space="preserve">  ggplot2</w:t>
+            </w:r>
+            <w:r>
+              <w:rPr>
+                <w:rStyle w:val="SpecialCharTok"/>
+              </w:rPr>
+              <w:t xml:space="preserve">::</w:t>
+            </w:r>
+            <w:r>
+              <w:rPr>
+                <w:rStyle w:val="FunctionTok"/>
+              </w:rPr>
+              <w:t xml:space="preserve">theme</w:t>
+            </w:r>
+            <w:r>
+              <w:rPr>
+                <w:rStyle w:val="NormalTok"/>
+              </w:rPr>
+              <w:t xml:space="preserve">(</w:t>
+            </w:r>
+            <w:r>
+              <w:br/>
+            </w:r>
+            <w:r>
+              <w:rPr>
+                <w:rStyle w:val="NormalTok"/>
+              </w:rPr>
+              <w:t xml:space="preserve">    </w:t>
+            </w:r>
+            <w:r>
+              <w:rPr>
+                <w:rStyle w:val="AttributeTok"/>
+              </w:rPr>
+              <w:t xml:space="preserve">legend.position =</w:t>
+            </w:r>
+            <w:r>
+              <w:rPr>
+                <w:rStyle w:val="NormalTok"/>
+              </w:rPr>
+              <w:t xml:space="preserve"> </w:t>
+            </w:r>
+            <w:r>
+              <w:rPr>
+                <w:rStyle w:val="StringTok"/>
+              </w:rPr>
+              <w:t xml:space="preserve">"bottom"</w:t>
+            </w:r>
+            <w:r>
+              <w:rPr>
+                <w:rStyle w:val="NormalTok"/>
+              </w:rPr>
+              <w:t xml:space="preserve">,</w:t>
+            </w:r>
+            <w:r>
+              <w:br/>
+            </w:r>
+            <w:r>
+              <w:rPr>
+                <w:rStyle w:val="NormalTok"/>
+              </w:rPr>
+              <w:t xml:space="preserve">    </w:t>
+            </w:r>
+            <w:r>
+              <w:rPr>
+                <w:rStyle w:val="AttributeTok"/>
+              </w:rPr>
+              <w:t xml:space="preserve">strip.text =</w:t>
+            </w:r>
+            <w:r>
+              <w:rPr>
+                <w:rStyle w:val="NormalTok"/>
+              </w:rPr>
+              <w:t xml:space="preserve"> ggplot2</w:t>
+            </w:r>
+            <w:r>
+              <w:rPr>
+                <w:rStyle w:val="SpecialCharTok"/>
+              </w:rPr>
+              <w:t xml:space="preserve">::</w:t>
+            </w:r>
+            <w:r>
+              <w:rPr>
+                <w:rStyle w:val="FunctionTok"/>
+              </w:rPr>
+              <w:t xml:space="preserve">element_text</w:t>
+            </w:r>
+            <w:r>
+              <w:rPr>
+                <w:rStyle w:val="NormalTok"/>
+              </w:rPr>
+              <w:t xml:space="preserve">(</w:t>
+            </w:r>
+            <w:r>
+              <w:rPr>
+                <w:rStyle w:val="AttributeTok"/>
+              </w:rPr>
+              <w:t xml:space="preserve">size =</w:t>
+            </w:r>
+            <w:r>
+              <w:rPr>
+                <w:rStyle w:val="NormalTok"/>
+              </w:rPr>
+              <w:t xml:space="preserve"> </w:t>
+            </w:r>
+            <w:r>
+              <w:rPr>
+                <w:rStyle w:val="DecValTok"/>
+              </w:rPr>
+              <w:t xml:space="preserve">12</w:t>
+            </w:r>
+            <w:r>
+              <w:rPr>
+                <w:rStyle w:val="NormalTok"/>
+              </w:rPr>
+              <w:t xml:space="preserve">)</w:t>
+            </w:r>
+            <w:r>
+              <w:br/>
+            </w:r>
+            <w:r>
+              <w:rPr>
+                <w:rStyle w:val="NormalTok"/>
+              </w:rPr>
+              <w:t xml:space="preserve">  )</w:t>
+            </w:r>
+          </w:p>
+          <w:p>
+            <w:pPr>
+              <w:jc w:val="center"/>
+            </w:pPr>
+            <w:r>
+              <w:drawing>
+                <wp:inline>
+                  <wp:extent cx="4620126" cy="3696101"/>
+                  <wp:effectExtent b="0" l="0" r="0" t="0"/>
+                  <wp:docPr descr="" title="" id="19" name="Picture"/>
+                  <a:graphic>
+                    <a:graphicData uri="http://schemas.openxmlformats.org/drawingml/2006/picture">
+                      <pic:pic>
+                        <pic:nvPicPr>
+                          <pic:cNvPr descr="expressions-algorithms_files/figure-docx/parse-trees-plot-1.png" id="20" name="Picture"/>
+                          <pic:cNvPicPr>
+                            <a:picLocks noChangeArrowheads="1" noChangeAspect="1"/>
+                          </pic:cNvPicPr>
+                        </pic:nvPicPr>
+                        <pic:blipFill>
+                          <a:blip r:embed="rId18"/>
+                          <a:stretch>
+                            <a:fillRect/>
+                          </a:stretch>
+                        </pic:blipFill>
+                        <pic:spPr bwMode="auto">
+                          <a:xfrm>
+                            <a:off x="0" y="0"/>
+                            <a:ext cx="4620126" cy="3696101"/>
+                          </a:xfrm>
+                          <a:prstGeom prst="rect">
+                            <a:avLst/>
+                          </a:prstGeom>
+                          <a:noFill/>
+                          <a:ln w="9525">
+                            <a:noFill/>
+                            <a:headEnd/>
+                            <a:tailEnd/>
+                          </a:ln>
+                        </pic:spPr>
+                      </pic:pic>
+                    </a:graphicData>
+                  </a:graphic>
+                </wp:inline>
+              </w:drawing>
+            </w:r>
+          </w:p>
+          <w:p>
+            <w:pPr>
+              <w:jc w:val="center"/>
+            </w:pPr>
+            <w:pPr>
+              <w:jc w:val="left"/>
+              <w:spacing w:before="200"/>
+              <w:pStyle w:val="ImageCaption"/>
+            </w:pPr>
+            <w:r>
+              <w:t xml:space="preserve">Figure 1: The</w:t>
+            </w:r>
+            <w:r>
+              <w:t xml:space="preserve"> </w:t>
+            </w:r>
+            <w:hyperlink w:anchor="def-parse-tree">
+              <w:r>
+                <w:rPr>
+                  <w:rStyle w:val="Hyperlink"/>
+                </w:rPr>
+                <w:t xml:space="preserve">parse trees</w:t>
+              </w:r>
+            </w:hyperlink>
+            <w:r>
+              <w:t xml:space="preserve"> </w:t>
+            </w:r>
+            <w:r>
+              <w:t xml:space="preserve">of</w:t>
+            </w:r>
+            <w:r>
+              <w:t xml:space="preserve"> </w:t>
+            </w:r>
+            <m:oMath>
+              <m:r>
+                <m:rPr>
+                  <m:sty m:val="p"/>
+                </m:rPr>
+                <m:t>(</m:t>
+              </m:r>
+              <m:r>
+                <m:t>a</m:t>
+              </m:r>
+              <m:r>
+                <m:t>x</m:t>
+              </m:r>
+              <m:r>
+                <m:rPr>
+                  <m:sty m:val="p"/>
+                </m:rPr>
+                <m:t>+</m:t>
+              </m:r>
+              <m:r>
+                <m:t>b</m:t>
+              </m:r>
+              <m:r>
+                <m:rPr>
+                  <m:sty m:val="p"/>
+                </m:rPr>
+                <m:t>)</m:t>
+              </m:r>
+              <m:r>
+                <m:t> </m:t>
+              </m:r>
+              <m:r>
+                <m:t>x</m:t>
+              </m:r>
+              <m:r>
+                <m:rPr>
+                  <m:sty m:val="p"/>
+                </m:rPr>
+                <m:t>+</m:t>
+              </m:r>
+              <m:r>
+                <m:t>c</m:t>
+              </m:r>
+            </m:oMath>
+            <w:r>
+              <w:t xml:space="preserve"> </w:t>
+            </w:r>
+            <w:r>
+              <w:t xml:space="preserve">and</w:t>
+            </w:r>
+            <w:r>
+              <w:t xml:space="preserve"> </w:t>
+            </w:r>
+            <m:oMath>
+              <m:r>
+                <m:t>a</m:t>
+              </m:r>
+              <m:sSup>
+                <m:e>
+                  <m:r>
+                    <m:t>x</m:t>
+                  </m:r>
+                </m:e>
+                <m:sup>
+                  <m:r>
+                    <m:t>2</m:t>
+                  </m:r>
+                </m:sup>
+              </m:sSup>
+              <m:r>
+                <m:rPr>
+                  <m:sty m:val="p"/>
+                </m:rPr>
+                <m:t>+</m:t>
+              </m:r>
+              <m:r>
+                <m:t>b</m:t>
+              </m:r>
+              <m:r>
+                <m:t>x</m:t>
+              </m:r>
+              <m:r>
+                <m:rPr>
+                  <m:sty m:val="p"/>
+                </m:rPr>
+                <m:t>+</m:t>
+              </m:r>
+              <m:r>
+                <m:t>c</m:t>
+              </m:r>
+            </m:oMath>
+            <w:r>
+              <w:t xml:space="preserve">.</w:t>
+            </w:r>
+            <w:r>
+              <w:t xml:space="preserve"> </w:t>
+            </w:r>
+            <w:r>
+              <w:t xml:space="preserve">Each operation is a node with one child per</w:t>
+            </w:r>
+            <w:r>
+              <w:t xml:space="preserve"> </w:t>
+            </w:r>
+            <w:hyperlink r:id="rId12">
+              <w:r>
+                <w:rPr>
+                  <w:rStyle w:val="Hyperlink"/>
+                </w:rPr>
+                <w:t xml:space="preserve">argument</w:t>
+              </w:r>
+            </w:hyperlink>
+            <w:r>
+              <w:t xml:space="preserve">, and the leaves are the symbols that are not operations.</w:t>
+            </w:r>
+            <w:r>
+              <w:t xml:space="preserve"> </w:t>
+            </w:r>
+            <w:r>
+              <w:t xml:space="preserve">The caret is the</w:t>
+            </w:r>
+            <w:r>
+              <w:t xml:space="preserve"> </w:t>
+            </w:r>
+            <w:hyperlink r:id="rId21">
+              <w:r>
+                <w:rPr>
+                  <w:rStyle w:val="Hyperlink"/>
+                </w:rPr>
+                <w:t xml:space="preserve">power</w:t>
+              </w:r>
+            </w:hyperlink>
+            <w:r>
+              <w:t xml:space="preserve"> </w:t>
+            </w:r>
+            <w:r>
+              <w:t xml:space="preserve">operation, which takes a</w:t>
+            </w:r>
+            <w:r>
+              <w:t xml:space="preserve"> </w:t>
+            </w:r>
+            <w:hyperlink r:id="rId22">
+              <w:r>
+                <w:rPr>
+                  <w:rStyle w:val="Hyperlink"/>
+                </w:rPr>
+                <w:t xml:space="preserve">base</w:t>
+              </w:r>
+            </w:hyperlink>
+            <w:r>
+              <w:t xml:space="preserve"> </w:t>
+            </w:r>
+            <w:r>
+              <w:t xml:space="preserve">and an</w:t>
+            </w:r>
+            <w:r>
+              <w:t xml:space="preserve"> </w:t>
+            </w:r>
+            <w:hyperlink r:id="rId23">
+              <w:r>
+                <w:rPr>
+                  <w:rStyle w:val="Hyperlink"/>
+                </w:rPr>
+                <w:t xml:space="preserve">exponent</w:t>
+              </w:r>
+            </w:hyperlink>
+            <w:r>
+              <w:t xml:space="preserve">.</w:t>
+            </w:r>
+          </w:p>
+          <w:bookmarkEnd w:id="24"/>
+        </w:tc>
+      </w:tr>
+    </w:tbl>
+    <w:bookmarkStart w:id="25" w:name="rem-expression-parse-tree"/>
     <w:p>
       <w:pPr>
         <w:pStyle w:val="BodyText"/>
@@ -1265,13 +5015,89 @@
         <w:t xml:space="preserve"> (Expressions, precedence and parse trees). </w:t>
       </w:r>
       <w:r>
-        <w:t xml:space="preserve">An expression does not say how to compute the output it fixes,</w:t>
-      </w:r>
-      <w:r>
-        <w:t xml:space="preserve"> </w:t>
-      </w:r>
-      <w:r>
-        <w:t xml:space="preserve">and many expressions denote the same function.</w:t>
+        <w:t xml:space="preserve">An</w:t>
+      </w:r>
+      <w:r>
+        <w:t xml:space="preserve"> </w:t>
+      </w:r>
+      <w:hyperlink w:anchor="def-expression">
+        <w:r>
+          <w:rPr>
+            <w:rStyle w:val="Hyperlink"/>
+          </w:rPr>
+          <w:t xml:space="preserve">expression</w:t>
+        </w:r>
+      </w:hyperlink>
+      <w:r>
+        <w:t xml:space="preserve"> </w:t>
+      </w:r>
+      <w:r>
+        <w:t xml:space="preserve">does not say how to compute the</w:t>
+      </w:r>
+      <w:r>
+        <w:t xml:space="preserve"> </w:t>
+      </w:r>
+      <w:hyperlink r:id="rId13">
+        <w:r>
+          <w:rPr>
+            <w:rStyle w:val="Hyperlink"/>
+          </w:rPr>
+          <w:t xml:space="preserve">output</w:t>
+        </w:r>
+      </w:hyperlink>
+      <w:r>
+        <w:t xml:space="preserve"> </w:t>
+      </w:r>
+      <w:r>
+        <w:t xml:space="preserve">it fixes,</w:t>
+      </w:r>
+      <w:r>
+        <w:t xml:space="preserve"> </w:t>
+      </w:r>
+      <w:r>
+        <w:t xml:space="preserve">and many</w:t>
+      </w:r>
+      <w:r>
+        <w:t xml:space="preserve"> </w:t>
+      </w:r>
+      <w:hyperlink w:anchor="def-expression">
+        <w:r>
+          <w:rPr>
+            <w:rStyle w:val="Hyperlink"/>
+          </w:rPr>
+          <w:t xml:space="preserve">expressions</w:t>
+        </w:r>
+      </w:hyperlink>
+      <w:r>
+        <w:t xml:space="preserve"> </w:t>
+      </w:r>
+      <w:hyperlink w:anchor="def-denotes">
+        <w:r>
+          <w:rPr>
+            <w:rStyle w:val="Hyperlink"/>
+          </w:rPr>
+          <w:t xml:space="preserve">denote</w:t>
+        </w:r>
+      </w:hyperlink>
+      <w:r>
+        <w:t xml:space="preserve"> </w:t>
+      </w:r>
+      <w:r>
+        <w:t xml:space="preserve">the same</w:t>
+      </w:r>
+      <w:r>
+        <w:t xml:space="preserve"> </w:t>
+      </w:r>
+      <w:hyperlink r:id="rId11">
+        <w:r>
+          <w:rPr>
+            <w:rStyle w:val="Hyperlink"/>
+          </w:rPr>
+          <w:t xml:space="preserve">function</w:t>
+        </w:r>
+      </w:hyperlink>
+      <w:r>
+        <w:t xml:space="preserve">.</w:t>
       </w:r>
       <w:r>
         <w:t xml:space="preserve"> </w:t>
@@ -1316,16 +5142,16 @@
           <w:rPr>
             <w:rStyle w:val="Hyperlink"/>
           </w:rPr>
-          <w:t xml:space="preserve">Definition 2</w:t>
+          <w:t xml:space="preserve">Definition 3</w:t>
         </w:r>
       </w:hyperlink>
       <w:r>
         <w:t xml:space="preserve">).</w:t>
       </w:r>
     </w:p>
-    <w:bookmarkEnd w:id="15"/>
-    <w:bookmarkEnd w:id="16"/>
-    <w:bookmarkStart w:id="26" w:name="algorithms"/>
+    <w:bookmarkEnd w:id="25"/>
+    <w:bookmarkEnd w:id="26"/>
+    <w:bookmarkStart w:id="34" w:name="algorithms"/>
     <w:p>
       <w:pPr>
         <w:pStyle w:val="Heading2"/>
@@ -1334,7 +5160,7 @@
         <w:t xml:space="preserve">2 Algorithms</w:t>
       </w:r>
     </w:p>
-    <w:bookmarkStart w:id="17" w:name="def-algorithm"/>
+    <w:bookmarkStart w:id="27" w:name="def-algorithm"/>
     <w:p>
       <w:pPr>
         <w:pStyle w:val="FirstParagraph"/>
@@ -1344,7 +5170,7 @@
           <w:b/>
           <w:bCs/>
         </w:rPr>
-        <w:t xml:space="preserve">Definition 3 (Algorithm)</w:t>
+        <w:t xml:space="preserve">Definition 4 (Algorithm)</w:t>
       </w:r>
       <w:r>
         <w:t xml:space="preserve"> </w:t>
@@ -1381,8 +5207,8 @@
         <w:t xml:space="preserve">applied to any valid input, halts and returns an output.</w:t>
       </w:r>
     </w:p>
-    <w:bookmarkEnd w:id="17"/>
-    <w:bookmarkStart w:id="20" w:name="def-computes"/>
+    <w:bookmarkEnd w:id="27"/>
+    <w:bookmarkStart w:id="28" w:name="def-computes"/>
     <w:p>
       <w:pPr>
         <w:pStyle w:val="BodyText"/>
@@ -1392,7 +5218,7 @@
           <w:b/>
           <w:bCs/>
         </w:rPr>
-        <w:t xml:space="preserve">Definition 4 (Computes)</w:t>
+        <w:t xml:space="preserve">Definition 5 (Computes)</w:t>
       </w:r>
       <w:r>
         <w:t xml:space="preserve"> </w:t>
@@ -1430,7 +5256,7 @@
       <w:r>
         <w:t xml:space="preserve"> </w:t>
       </w:r>
-      <w:hyperlink r:id="rId10">
+      <w:hyperlink r:id="rId11">
         <w:r>
           <w:rPr>
             <w:rStyle w:val="Hyperlink"/>
@@ -1447,7 +5273,7 @@
       <w:r>
         <w:t xml:space="preserve"> </w:t>
       </w:r>
-      <w:hyperlink r:id="rId18">
+      <w:hyperlink r:id="rId12">
         <w:r>
           <w:rPr>
             <w:rStyle w:val="Hyperlink"/>
@@ -1461,7 +5287,7 @@
       <w:r>
         <w:t xml:space="preserve"> </w:t>
       </w:r>
-      <w:hyperlink r:id="rId19">
+      <w:hyperlink r:id="rId13">
         <w:r>
           <w:rPr>
             <w:rStyle w:val="Hyperlink"/>
@@ -1476,8 +5302,8 @@
         <w:t xml:space="preserve">at that input.</w:t>
       </w:r>
     </w:p>
-    <w:bookmarkEnd w:id="20"/>
-    <w:bookmarkStart w:id="21" w:name="exm-algorithm"/>
+    <w:bookmarkEnd w:id="28"/>
+    <w:bookmarkStart w:id="29" w:name="exm-algorithm"/>
     <w:p>
       <w:pPr>
         <w:pStyle w:val="BodyText"/>
@@ -1878,8 +5704,8 @@
         <w:t xml:space="preserve">the same value by different steps.</w:t>
       </w:r>
     </w:p>
-    <w:bookmarkEnd w:id="21"/>
-    <w:bookmarkStart w:id="22" w:name="rem-algorithm-scope"/>
+    <w:bookmarkEnd w:id="29"/>
+    <w:bookmarkStart w:id="30" w:name="rem-algorithm-scope"/>
     <w:p>
       <w:pPr>
         <w:pStyle w:val="BodyText"/>
@@ -1931,7 +5757,7 @@
       <w:r>
         <w:t xml:space="preserve"> </w:t>
       </w:r>
-      <w:hyperlink r:id="rId10">
+      <w:hyperlink r:id="rId11">
         <w:r>
           <w:rPr>
             <w:rStyle w:val="Hyperlink"/>
@@ -1951,7 +5777,7 @@
       <w:r>
         <w:t xml:space="preserve"> </w:t>
       </w:r>
-      <w:hyperlink r:id="rId18">
+      <w:hyperlink r:id="rId12">
         <w:r>
           <w:rPr>
             <w:rStyle w:val="Hyperlink"/>
@@ -1971,7 +5797,7 @@
       <w:r>
         <w:t xml:space="preserve"> </w:t>
       </w:r>
-      <w:hyperlink r:id="rId19">
+      <w:hyperlink r:id="rId13">
         <w:r>
           <w:rPr>
             <w:rStyle w:val="Hyperlink"/>
@@ -1994,7 +5820,7 @@
       <w:r>
         <w:t xml:space="preserve"> </w:t>
       </w:r>
-      <w:hyperlink r:id="rId19">
+      <w:hyperlink r:id="rId13">
         <w:r>
           <w:rPr>
             <w:rStyle w:val="Hyperlink"/>
@@ -2035,8 +5861,8 @@
         <w:t xml:space="preserve">.</w:t>
       </w:r>
     </w:p>
-    <w:bookmarkEnd w:id="22"/>
-    <w:bookmarkStart w:id="23" w:name="rem-function-expression-algorithm"/>
+    <w:bookmarkEnd w:id="30"/>
+    <w:bookmarkStart w:id="31" w:name="rem-function-expression-algorithm"/>
     <w:p>
       <w:pPr>
         <w:pStyle w:val="BodyText"/>
@@ -2064,7 +5890,24 @@
         </w:numPr>
       </w:pPr>
       <w:r>
-        <w:t xml:space="preserve">A function is the input-output relationship.</w:t>
+        <w:t xml:space="preserve">A</w:t>
+      </w:r>
+      <w:r>
+        <w:t xml:space="preserve"> </w:t>
+      </w:r>
+      <w:hyperlink r:id="rId11">
+        <w:r>
+          <w:rPr>
+            <w:rStyle w:val="Hyperlink"/>
+          </w:rPr>
+          <w:t xml:space="preserve">function</w:t>
+        </w:r>
+      </w:hyperlink>
+      <w:r>
+        <w:t xml:space="preserve"> </w:t>
+      </w:r>
+      <w:r>
+        <w:t xml:space="preserve">is the input-output relationship.</w:t>
       </w:r>
     </w:p>
     <w:p>
@@ -2092,8 +5935,19 @@
       <w:r>
         <w:t xml:space="preserve"> </w:t>
       </w:r>
-      <w:r>
-        <w:t xml:space="preserve">denotes a function,</w:t>
+      <w:hyperlink w:anchor="def-denotes">
+        <w:r>
+          <w:rPr>
+            <w:rStyle w:val="Hyperlink"/>
+          </w:rPr>
+          <w:t xml:space="preserve">denotes</w:t>
+        </w:r>
+      </w:hyperlink>
+      <w:r>
+        <w:t xml:space="preserve"> </w:t>
+      </w:r>
+      <w:r>
+        <w:t xml:space="preserve">a function,</w:t>
       </w:r>
       <w:r>
         <w:t xml:space="preserve"> </w:t>
@@ -2127,8 +5981,19 @@
       <w:r>
         <w:t xml:space="preserve"> </w:t>
       </w:r>
-      <w:r>
-        <w:t xml:space="preserve">computes a function,</w:t>
+      <w:hyperlink w:anchor="def-computes">
+        <w:r>
+          <w:rPr>
+            <w:rStyle w:val="Hyperlink"/>
+          </w:rPr>
+          <w:t xml:space="preserve">computes</w:t>
+        </w:r>
+      </w:hyperlink>
+      <w:r>
+        <w:t xml:space="preserve"> </w:t>
+      </w:r>
+      <w:r>
+        <w:t xml:space="preserve">a function,</w:t>
       </w:r>
       <w:r>
         <w:t xml:space="preserve"> </w:t>
@@ -2169,8 +6034,8 @@
         <w:t xml:space="preserve">and a different expression for the same function gives a different tree and a different algorithm.</w:t>
       </w:r>
     </w:p>
-    <w:bookmarkEnd w:id="23"/>
-    <w:bookmarkStart w:id="24" w:name="rem-no-known-algorithm"/>
+    <w:bookmarkEnd w:id="31"/>
+    <w:bookmarkStart w:id="32" w:name="rem-no-known-algorithm"/>
     <w:p>
       <w:pPr>
         <w:pStyle w:val="BodyText"/>
@@ -2192,7 +6057,41 @@
         <w:t xml:space="preserve"> </w:t>
       </w:r>
       <w:r>
-        <w:t xml:space="preserve">and expressions that denote them,</w:t>
+        <w:t xml:space="preserve">and</w:t>
+      </w:r>
+      <w:r>
+        <w:t xml:space="preserve"> </w:t>
+      </w:r>
+      <w:hyperlink w:anchor="def-expression">
+        <w:r>
+          <w:rPr>
+            <w:rStyle w:val="Hyperlink"/>
+          </w:rPr>
+          <w:t xml:space="preserve">expressions</w:t>
+        </w:r>
+      </w:hyperlink>
+      <w:r>
+        <w:t xml:space="preserve"> </w:t>
+      </w:r>
+      <w:r>
+        <w:t xml:space="preserve">that</w:t>
+      </w:r>
+      <w:r>
+        <w:t xml:space="preserve"> </w:t>
+      </w:r>
+      <w:hyperlink w:anchor="def-denotes">
+        <w:r>
+          <w:rPr>
+            <w:rStyle w:val="Hyperlink"/>
+          </w:rPr>
+          <w:t xml:space="preserve">denote</w:t>
+        </w:r>
+      </w:hyperlink>
+      <w:r>
+        <w:t xml:space="preserve"> </w:t>
+      </w:r>
+      <w:r>
+        <w:t xml:space="preserve">them,</w:t>
       </w:r>
       <w:r>
         <w:t xml:space="preserve"> </w:t>
@@ -2242,8 +6141,8 @@
         <w:t xml:space="preserve">Such a value can still be well defined and approximated by an algorithm.</w:t>
       </w:r>
     </w:p>
-    <w:bookmarkEnd w:id="24"/>
-    <w:bookmarkStart w:id="25" w:name="exm-no-known-algorithm"/>
+    <w:bookmarkEnd w:id="32"/>
+    <w:bookmarkStart w:id="33" w:name="exm-no-known-algorithm"/>
     <w:p>
       <w:pPr>
         <w:pStyle w:val="BodyText"/>
@@ -2403,9 +6302,9 @@
         <w:t xml:space="preserve">An algorithm such as bisection approximates it as closely as we like.</w:t>
       </w:r>
     </w:p>
-    <w:bookmarkEnd w:id="25"/>
-    <w:bookmarkEnd w:id="26"/>
-    <w:bookmarkStart w:id="45" w:name="exercises"/>
+    <w:bookmarkEnd w:id="33"/>
+    <w:bookmarkEnd w:id="34"/>
+    <w:bookmarkStart w:id="53" w:name="exercises"/>
     <w:p>
       <w:pPr>
         <w:pStyle w:val="Heading2"/>
@@ -2414,7 +6313,7 @@
         <w:t xml:space="preserve">3 Exercises</w:t>
       </w:r>
     </w:p>
-    <w:bookmarkStart w:id="27" w:name="exr-expression-or-algorithm"/>
+    <w:bookmarkStart w:id="35" w:name="exr-expression-or-algorithm"/>
     <w:p>
       <w:pPr>
         <w:pStyle w:val="FirstParagraph"/>
@@ -2435,7 +6334,7 @@
       <w:r>
         <w:t xml:space="preserve"> </w:t>
       </w:r>
-      <w:hyperlink r:id="rId10">
+      <w:hyperlink r:id="rId11">
         <w:r>
           <w:rPr>
             <w:rStyle w:val="Hyperlink"/>
@@ -2481,8 +6380,8 @@
         <w:t xml:space="preserve">differ?</w:t>
       </w:r>
     </w:p>
-    <w:bookmarkEnd w:id="27"/>
-    <w:bookmarkStart w:id="29" w:name="sol-expression-or-algorithm"/>
+    <w:bookmarkEnd w:id="35"/>
+    <w:bookmarkStart w:id="37" w:name="sol-expression-or-algorithm"/>
     <w:p>
       <w:pPr>
         <w:pStyle w:val="BodyText"/>
@@ -2503,7 +6402,7 @@
       <w:r>
         <w:t xml:space="preserve"> </w:t>
       </w:r>
-      <w:hyperlink r:id="rId10">
+      <w:hyperlink r:id="rId11">
         <w:r>
           <w:rPr>
             <w:rStyle w:val="Hyperlink"/>
@@ -2538,7 +6437,24 @@
         <w:t xml:space="preserve"> </w:t>
       </w:r>
       <w:r>
-        <w:t xml:space="preserve">is a string of symbols that denotes a function,</w:t>
+        <w:t xml:space="preserve">is a string of symbols that</w:t>
+      </w:r>
+      <w:r>
+        <w:t xml:space="preserve"> </w:t>
+      </w:r>
+      <w:hyperlink w:anchor="def-denotes">
+        <w:r>
+          <w:rPr>
+            <w:rStyle w:val="Hyperlink"/>
+          </w:rPr>
+          <w:t xml:space="preserve">denotes</w:t>
+        </w:r>
+      </w:hyperlink>
+      <w:r>
+        <w:t xml:space="preserve"> </w:t>
+      </w:r>
+      <w:r>
+        <w:t xml:space="preserve">a function,</w:t>
       </w:r>
       <w:r>
         <w:t xml:space="preserve"> </w:t>
@@ -2589,7 +6505,7 @@
       <w:r>
         <w:t xml:space="preserve"> </w:t>
       </w:r>
-      <w:hyperlink r:id="rId28">
+      <w:hyperlink r:id="rId36">
         <w:r>
           <w:rPr>
             <w:rStyle w:val="Hyperlink"/>
@@ -2601,7 +6517,24 @@
         <w:t xml:space="preserve"> </w:t>
       </w:r>
       <w:r>
-        <w:t xml:space="preserve">list of steps that computes a function,</w:t>
+        <w:t xml:space="preserve">list of steps that</w:t>
+      </w:r>
+      <w:r>
+        <w:t xml:space="preserve"> </w:t>
+      </w:r>
+      <w:hyperlink w:anchor="def-computes">
+        <w:r>
+          <w:rPr>
+            <w:rStyle w:val="Hyperlink"/>
+          </w:rPr>
+          <w:t xml:space="preserve">computes</w:t>
+        </w:r>
+      </w:hyperlink>
+      <w:r>
+        <w:t xml:space="preserve"> </w:t>
+      </w:r>
+      <w:r>
+        <w:t xml:space="preserve">a function,</w:t>
       </w:r>
       <w:r>
         <w:t xml:space="preserve"> </w:t>
@@ -2627,8 +6560,8 @@
         <w:t xml:space="preserve">compute the same one.</w:t>
       </w:r>
     </w:p>
-    <w:bookmarkEnd w:id="29"/>
-    <w:bookmarkStart w:id="30" w:name="exr-expression-or-algorithm-part2"/>
+    <w:bookmarkEnd w:id="37"/>
+    <w:bookmarkStart w:id="38" w:name="exr-expression-or-algorithm-part2"/>
     <w:p>
       <w:pPr>
         <w:pStyle w:val="BodyText"/>
@@ -2718,7 +6651,7 @@
       <w:r>
         <w:t xml:space="preserve"> </w:t>
       </w:r>
-      <w:hyperlink r:id="rId10">
+      <w:hyperlink r:id="rId11">
         <w:r>
           <w:rPr>
             <w:rStyle w:val="Hyperlink"/>
@@ -2761,8 +6694,8 @@
         <w:t xml:space="preserve">?</w:t>
       </w:r>
     </w:p>
-    <w:bookmarkEnd w:id="30"/>
-    <w:bookmarkStart w:id="31" w:name="sol-expression-or-algorithm-part2"/>
+    <w:bookmarkEnd w:id="38"/>
+    <w:bookmarkStart w:id="39" w:name="sol-expression-or-algorithm-part2"/>
     <w:p>
       <w:pPr>
         <w:pStyle w:val="BodyText"/>
@@ -2797,7 +6730,7 @@
       <w:r>
         <w:t xml:space="preserve"> </w:t>
       </w:r>
-      <w:hyperlink r:id="rId10">
+      <w:hyperlink r:id="rId11">
         <w:r>
           <w:rPr>
             <w:rStyle w:val="Hyperlink"/>
@@ -2823,8 +6756,8 @@
         <w:t xml:space="preserve">.</w:t>
       </w:r>
     </w:p>
-    <w:bookmarkEnd w:id="31"/>
-    <w:bookmarkStart w:id="32" w:name="exr-expression-or-algorithm-part3"/>
+    <w:bookmarkEnd w:id="39"/>
+    <w:bookmarkStart w:id="40" w:name="exr-expression-or-algorithm-part3"/>
     <w:p>
       <w:pPr>
         <w:pStyle w:val="BodyText"/>
@@ -2923,8 +6856,8 @@
         <w:t xml:space="preserve">tell you which arithmetic steps to carry out?</w:t>
       </w:r>
     </w:p>
-    <w:bookmarkEnd w:id="32"/>
-    <w:bookmarkStart w:id="33" w:name="sol-expression-or-algorithm-part3"/>
+    <w:bookmarkEnd w:id="40"/>
+    <w:bookmarkStart w:id="41" w:name="sol-expression-or-algorithm-part3"/>
     <w:p>
       <w:pPr>
         <w:pStyle w:val="BodyText"/>
@@ -3091,8 +7024,8 @@
         <w:t xml:space="preserve">.</w:t>
       </w:r>
     </w:p>
-    <w:bookmarkEnd w:id="33"/>
-    <w:bookmarkStart w:id="34" w:name="exr-expression-or-algorithm-part4"/>
+    <w:bookmarkEnd w:id="41"/>
+    <w:bookmarkStart w:id="42" w:name="exr-expression-or-algorithm-part4"/>
     <w:p>
       <w:pPr>
         <w:pStyle w:val="BodyText"/>
@@ -3188,8 +7121,8 @@
         <w:t xml:space="preserve">?</w:t>
       </w:r>
     </w:p>
-    <w:bookmarkEnd w:id="34"/>
-    <w:bookmarkStart w:id="35" w:name="sol-expression-or-algorithm-part4"/>
+    <w:bookmarkEnd w:id="42"/>
+    <w:bookmarkStart w:id="43" w:name="sol-expression-or-algorithm-part4"/>
     <w:p>
       <w:pPr>
         <w:pStyle w:val="BodyText"/>
@@ -3346,8 +7279,8 @@
         <w:t xml:space="preserve">that evaluates it.</w:t>
       </w:r>
     </w:p>
-    <w:bookmarkEnd w:id="35"/>
-    <w:bookmarkStart w:id="36" w:name="exr-expression-or-algorithm-part5"/>
+    <w:bookmarkEnd w:id="43"/>
+    <w:bookmarkStart w:id="44" w:name="exr-expression-or-algorithm-part5"/>
     <w:p>
       <w:pPr>
         <w:pStyle w:val="BodyText"/>
@@ -3402,12 +7335,29 @@
         <w:t xml:space="preserve"> </w:t>
       </w:r>
       <w:r>
-        <w:t xml:space="preserve">that denotes the same</w:t>
-      </w:r>
-      <w:r>
-        <w:t xml:space="preserve"> </w:t>
-      </w:r>
-      <w:hyperlink r:id="rId10">
+        <w:t xml:space="preserve">that</w:t>
+      </w:r>
+      <w:r>
+        <w:t xml:space="preserve"> </w:t>
+      </w:r>
+      <w:hyperlink w:anchor="def-denotes">
+        <w:r>
+          <w:rPr>
+            <w:rStyle w:val="Hyperlink"/>
+          </w:rPr>
+          <w:t xml:space="preserve">denotes</w:t>
+        </w:r>
+      </w:hyperlink>
+      <w:r>
+        <w:t xml:space="preserve"> </w:t>
+      </w:r>
+      <w:r>
+        <w:t xml:space="preserve">the same</w:t>
+      </w:r>
+      <w:r>
+        <w:t xml:space="preserve"> </w:t>
+      </w:r>
+      <w:hyperlink r:id="rId11">
         <w:r>
           <w:rPr>
             <w:rStyle w:val="Hyperlink"/>
@@ -3469,8 +7419,8 @@
         <w:t xml:space="preserve">and needs fewer multiplications.</w:t>
       </w:r>
     </w:p>
-    <w:bookmarkEnd w:id="36"/>
-    <w:bookmarkStart w:id="37" w:name="sol-expression-or-algorithm-part5"/>
+    <w:bookmarkEnd w:id="44"/>
+    <w:bookmarkStart w:id="45" w:name="sol-expression-or-algorithm-part5"/>
     <w:p>
       <w:pPr>
         <w:pStyle w:val="BodyText"/>
@@ -3613,7 +7563,7 @@
       <w:r>
         <w:t xml:space="preserve"> </w:t>
       </w:r>
-      <w:hyperlink r:id="rId10">
+      <w:hyperlink r:id="rId11">
         <w:r>
           <w:rPr>
             <w:rStyle w:val="Hyperlink"/>
@@ -3642,9 +7592,9 @@
         <w:t xml:space="preserve">.</w:t>
       </w:r>
     </w:p>
-    <w:bookmarkEnd w:id="37"/>
-    <w:bookmarkStart w:id="44" w:name="refs"/>
-    <w:bookmarkStart w:id="39" w:name="ref-wikipedia_expression_mathematics"/>
+    <w:bookmarkEnd w:id="45"/>
+    <w:bookmarkStart w:id="52" w:name="refs"/>
+    <w:bookmarkStart w:id="47" w:name="ref-wikipedia_expression_mathematics"/>
     <w:p>
       <w:pPr>
         <w:pStyle w:val="Bibliography"/>
@@ -3691,7 +7641,7 @@
       <w:r>
         <w:t xml:space="preserve"> </w:t>
       </w:r>
-      <w:hyperlink r:id="rId38">
+      <w:hyperlink r:id="rId46">
         <w:r>
           <w:rPr>
             <w:rStyle w:val="Hyperlink"/>
@@ -3700,8 +7650,8 @@
         </w:r>
       </w:hyperlink>
     </w:p>
-    <w:bookmarkEnd w:id="39"/>
-    <w:bookmarkStart w:id="41" w:name="ref-wikipedia_parse_tree"/>
+    <w:bookmarkEnd w:id="47"/>
+    <w:bookmarkStart w:id="49" w:name="ref-wikipedia_parse_tree"/>
     <w:p>
       <w:pPr>
         <w:pStyle w:val="Bibliography"/>
@@ -3748,7 +7698,7 @@
       <w:r>
         <w:t xml:space="preserve"> </w:t>
       </w:r>
-      <w:hyperlink r:id="rId40">
+      <w:hyperlink r:id="rId48">
         <w:r>
           <w:rPr>
             <w:rStyle w:val="Hyperlink"/>
@@ -3757,8 +7707,8 @@
         </w:r>
       </w:hyperlink>
     </w:p>
-    <w:bookmarkEnd w:id="41"/>
-    <w:bookmarkStart w:id="43" w:name="ref-wikipedia_algorithm"/>
+    <w:bookmarkEnd w:id="49"/>
+    <w:bookmarkStart w:id="51" w:name="ref-wikipedia_algorithm"/>
     <w:p>
       <w:pPr>
         <w:pStyle w:val="Bibliography"/>
@@ -3805,7 +7755,7 @@
       <w:r>
         <w:t xml:space="preserve"> </w:t>
       </w:r>
-      <w:hyperlink r:id="rId42">
+      <w:hyperlink r:id="rId50">
         <w:r>
           <w:rPr>
             <w:rStyle w:val="Hyperlink"/>
@@ -3814,9 +7764,9 @@
         </w:r>
       </w:hyperlink>
     </w:p>
-    <w:bookmarkEnd w:id="43"/>
-    <w:bookmarkEnd w:id="44"/>
-    <w:bookmarkEnd w:id="45"/>
+    <w:bookmarkEnd w:id="51"/>
+    <w:bookmarkEnd w:id="52"/>
+    <w:bookmarkEnd w:id="53"/>
     <w:sectPr>
       <w:footnotePr>
         <w:numRestart w:val="eachSect"/>

</xml_diff>

<commit_message>
Deploying to gh-pages from @ Morrison-Lab/mds@e83f9bcb65a6d7fb3c2d5b3fdc30b32acf1c218c 🚀
</commit_message>
<xml_diff>
--- a/expressions-algorithms.docx
+++ b/expressions-algorithms.docx
@@ -15,7 +15,7 @@
         <w:pStyle w:val="Date"/>
       </w:pPr>
       <w:r>
-        <w:t xml:space="preserve">Last modified: 2026-10-26 14:36:46 (PDT)</w:t>
+        <w:t xml:space="preserve">Last modified: 2026-10-26 20:57:05 (PDT)</w:t>
       </w:r>
     </w:p>
     <w:p>
@@ -65,7 +65,7 @@
         <w:t xml:space="preserve">the parse trees of expressions, and algorithms, which compute those functions.</w:t>
       </w:r>
     </w:p>
-    <w:bookmarkStart w:id="26" w:name="expressions"/>
+    <w:bookmarkStart w:id="36" w:name="expressions"/>
     <w:p>
       <w:pPr>
         <w:pStyle w:val="Heading2"/>
@@ -745,7 +745,7 @@
       </w:r>
     </w:p>
     <w:bookmarkEnd w:id="15"/>
-    <w:bookmarkStart w:id="16" w:name="def-parse-tree"/>
+    <w:bookmarkStart w:id="17" w:name="def-closed-form-expression"/>
     <w:p>
       <w:pPr>
         <w:pStyle w:val="BodyText"/>
@@ -755,13 +755,13 @@
           <w:b/>
           <w:bCs/>
         </w:rPr>
-        <w:t xml:space="preserve">Definition 3 (Parse tree)</w:t>
-      </w:r>
-      <w:r>
-        <w:t xml:space="preserve"> </w:t>
-      </w:r>
-      <w:r>
-        <w:t xml:space="preserve">The</w:t>
+        <w:t xml:space="preserve">Definition 3 (Closed-form expression (formula))</w:t>
+      </w:r>
+      <w:r>
+        <w:t xml:space="preserve"> </w:t>
+      </w:r>
+      <w:r>
+        <w:t xml:space="preserve">A</w:t>
       </w:r>
       <w:r>
         <w:t xml:space="preserve"> </w:t>
@@ -771,7 +771,26 @@
           <w:b/>
           <w:bCs/>
         </w:rPr>
-        <w:t xml:space="preserve">parse tree</w:t>
+        <w:t xml:space="preserve">closed-form expression</w:t>
+      </w:r>
+      <w:r>
+        <w:t xml:space="preserve"> </w:t>
+      </w:r>
+      <w:r>
+        <w:t xml:space="preserve">(or</w:t>
+      </w:r>
+      <w:r>
+        <w:t xml:space="preserve"> </w:t>
+      </w:r>
+      <w:r>
+        <w:rPr>
+          <w:b/>
+          <w:bCs/>
+        </w:rPr>
+        <w:t xml:space="preserve">formula</w:t>
+      </w:r>
+      <w:r>
+        <w:t xml:space="preserve">)</w:t>
       </w:r>
       <w:r>
         <w:t xml:space="preserve"> </w:t>
@@ -783,7 +802,7 @@
         <w:t xml:space="preserve"> </w:t>
       </w:r>
       <w:r>
-        <w:t xml:space="preserve">of an</w:t>
+        <w:t xml:space="preserve">is an</w:t>
       </w:r>
       <w:r>
         <w:t xml:space="preserve"> </w:t>
@@ -800,29 +819,69 @@
         <w:t xml:space="preserve"> </w:t>
       </w:r>
       <w:r>
-        <w:t xml:space="preserve">is the tree</w:t>
-      </w:r>
-      <w:r>
-        <w:t xml:space="preserve"> </w:t>
-      </w:r>
-      <w:r>
-        <w:t xml:space="preserve">that shows how its symbols group into operations.</w:t>
-      </w:r>
-      <w:r>
-        <w:t xml:space="preserve"> </w:t>
-      </w:r>
-      <w:r>
-        <w:t xml:space="preserve">Its leaves are the constants and variables of the expression,</w:t>
-      </w:r>
-      <w:r>
-        <w:t xml:space="preserve"> </w:t>
-      </w:r>
-      <w:r>
-        <w:t xml:space="preserve">and each internal node is an operation applied to the nodes below it.</w:t>
+        <w:t xml:space="preserve">built from constants and variables</w:t>
+      </w:r>
+      <w:r>
+        <w:t xml:space="preserve"> </w:t>
+      </w:r>
+      <w:r>
+        <w:t xml:space="preserve"> </w:t>
+      </w:r>
+      <w:r>
+        <w:t xml:space="preserve">using a finite number of operations from a list of accepted</w:t>
+      </w:r>
+      <w:r>
+        <w:t xml:space="preserve"> </w:t>
+      </w:r>
+      <w:hyperlink r:id="rId11">
+        <w:r>
+          <w:rPr>
+            <w:rStyle w:val="Hyperlink"/>
+          </w:rPr>
+          <w:t xml:space="preserve">functions</w:t>
+        </w:r>
+      </w:hyperlink>
+      <w:r>
+        <w:t xml:space="preserve">,</w:t>
+      </w:r>
+      <w:r>
+        <w:t xml:space="preserve"> </w:t>
+      </w:r>
+      <w:r>
+        <w:t xml:space="preserve"> </w:t>
+      </w:r>
+      <w:r>
+        <w:t xml:space="preserve">such as</w:t>
+      </w:r>
+      <w:r>
+        <w:t xml:space="preserve"> </w:t>
+      </w:r>
+      <w:hyperlink r:id="rId16">
+        <w:r>
+          <w:rPr>
+            <w:rStyle w:val="Hyperlink"/>
+          </w:rPr>
+          <w:t xml:space="preserve">powers</w:t>
+        </w:r>
+      </w:hyperlink>
+      <w:r>
+        <w:t xml:space="preserve">, roots, exponentials, logarithms, and trigonometric functions.</w:t>
+      </w:r>
+      <w:r>
+        <w:t xml:space="preserve"> </w:t>
+      </w:r>
+      <w:r>
+        <w:t xml:space="preserve">Which functions are accepted is a convention,</w:t>
+      </w:r>
+      <w:r>
+        <w:t xml:space="preserve"> </w:t>
+      </w:r>
+      <w:r>
+        <w:t xml:space="preserve">and a source states it when the boundary matters.</w:t>
       </w:r>
     </w:p>
-    <w:bookmarkEnd w:id="16"/>
-    <w:bookmarkStart w:id="17" w:name="exm-parse-tree"/>
+    <w:bookmarkEnd w:id="17"/>
+    <w:bookmarkStart w:id="18" w:name="exm-closed-form-expression"/>
     <w:p>
       <w:pPr>
         <w:pStyle w:val="BodyText"/>
@@ -832,7 +891,768 @@
           <w:b/>
           <w:bCs/>
         </w:rPr>
-        <w:t xml:space="preserve">Example 2 (The parse tree of a polynomial)</w:t>
+        <w:t xml:space="preserve">Example 2 (The quadratic formula)</w:t>
+      </w:r>
+      <w:r>
+        <w:t xml:space="preserve"> </w:t>
+      </w:r>
+      <w:r>
+        <w:t xml:space="preserve">For</w:t>
+      </w:r>
+      <w:r>
+        <w:t xml:space="preserve"> </w:t>
+      </w:r>
+      <m:oMath>
+        <m:r>
+          <m:t>a</m:t>
+        </m:r>
+        <m:r>
+          <m:rPr>
+            <m:sty m:val="p"/>
+          </m:rPr>
+          <m:t>≠</m:t>
+        </m:r>
+        <m:r>
+          <m:t>0</m:t>
+        </m:r>
+      </m:oMath>
+      <w:r>
+        <w:t xml:space="preserve"> </w:t>
+      </w:r>
+      <w:r>
+        <w:t xml:space="preserve">with</w:t>
+      </w:r>
+      <w:r>
+        <w:t xml:space="preserve"> </w:t>
+      </w:r>
+      <m:oMath>
+        <m:sSup>
+          <m:e>
+            <m:r>
+              <m:t>b</m:t>
+            </m:r>
+          </m:e>
+          <m:sup>
+            <m:r>
+              <m:t>2</m:t>
+            </m:r>
+          </m:sup>
+        </m:sSup>
+        <m:r>
+          <m:rPr>
+            <m:sty m:val="p"/>
+          </m:rPr>
+          <m:t>−</m:t>
+        </m:r>
+        <m:r>
+          <m:t>4</m:t>
+        </m:r>
+        <m:r>
+          <m:t>a</m:t>
+        </m:r>
+        <m:r>
+          <m:t>c</m:t>
+        </m:r>
+        <m:r>
+          <m:rPr>
+            <m:sty m:val="p"/>
+          </m:rPr>
+          <m:t>≥</m:t>
+        </m:r>
+        <m:r>
+          <m:t>0</m:t>
+        </m:r>
+      </m:oMath>
+      <w:r>
+        <w:t xml:space="preserve">,</w:t>
+      </w:r>
+      <w:r>
+        <w:t xml:space="preserve"> </w:t>
+      </w:r>
+      <w:r>
+        <w:t xml:space="preserve">the roots of</w:t>
+      </w:r>
+      <w:r>
+        <w:t xml:space="preserve"> </w:t>
+      </w:r>
+      <m:oMath>
+        <m:r>
+          <m:t>a</m:t>
+        </m:r>
+        <m:sSup>
+          <m:e>
+            <m:r>
+              <m:t>x</m:t>
+            </m:r>
+          </m:e>
+          <m:sup>
+            <m:r>
+              <m:t>2</m:t>
+            </m:r>
+          </m:sup>
+        </m:sSup>
+        <m:r>
+          <m:rPr>
+            <m:sty m:val="p"/>
+          </m:rPr>
+          <m:t>+</m:t>
+        </m:r>
+        <m:r>
+          <m:t>b</m:t>
+        </m:r>
+        <m:r>
+          <m:t>x</m:t>
+        </m:r>
+        <m:r>
+          <m:rPr>
+            <m:sty m:val="p"/>
+          </m:rPr>
+          <m:t>+</m:t>
+        </m:r>
+        <m:r>
+          <m:t>c</m:t>
+        </m:r>
+        <m:r>
+          <m:rPr>
+            <m:sty m:val="p"/>
+          </m:rPr>
+          <m:t>=</m:t>
+        </m:r>
+        <m:r>
+          <m:t>0</m:t>
+        </m:r>
+      </m:oMath>
+      <w:r>
+        <w:t xml:space="preserve"> </w:t>
+      </w:r>
+      <w:r>
+        <w:t xml:space="preserve">are</w:t>
+      </w:r>
+    </w:p>
+    <w:p>
+      <w:pPr>
+        <w:pStyle w:val="BodyText"/>
+      </w:pPr>
+      <m:oMathPara>
+        <m:oMathParaPr>
+          <m:jc m:val="center"/>
+        </m:oMathParaPr>
+        <m:oMath>
+          <m:r>
+            <m:t>x</m:t>
+          </m:r>
+          <m:r>
+            <m:rPr>
+              <m:sty m:val="p"/>
+            </m:rPr>
+            <m:t>=</m:t>
+          </m:r>
+          <m:f>
+            <m:fPr>
+              <m:type m:val="bar"/>
+            </m:fPr>
+            <m:num>
+              <m:r>
+                <m:rPr>
+                  <m:sty m:val="p"/>
+                </m:rPr>
+                <m:t>−</m:t>
+              </m:r>
+              <m:r>
+                <m:t>b</m:t>
+              </m:r>
+              <m:r>
+                <m:rPr>
+                  <m:sty m:val="p"/>
+                </m:rPr>
+                <m:t>±</m:t>
+              </m:r>
+              <m:rad>
+                <m:radPr>
+                  <m:degHide m:val="on"/>
+                </m:radPr>
+                <m:deg/>
+                <m:e>
+                  <m:sSup>
+                    <m:e>
+                      <m:r>
+                        <m:t>b</m:t>
+                      </m:r>
+                    </m:e>
+                    <m:sup>
+                      <m:r>
+                        <m:t>2</m:t>
+                      </m:r>
+                    </m:sup>
+                  </m:sSup>
+                  <m:r>
+                    <m:rPr>
+                      <m:sty m:val="p"/>
+                    </m:rPr>
+                    <m:t>−</m:t>
+                  </m:r>
+                  <m:r>
+                    <m:t>4</m:t>
+                  </m:r>
+                  <m:r>
+                    <m:t>a</m:t>
+                  </m:r>
+                  <m:r>
+                    <m:t>c</m:t>
+                  </m:r>
+                </m:e>
+              </m:rad>
+            </m:num>
+            <m:den>
+              <m:r>
+                <m:t>2</m:t>
+              </m:r>
+              <m:r>
+                <m:t>a</m:t>
+              </m:r>
+            </m:den>
+          </m:f>
+          <m:r>
+            <m:rPr>
+              <m:sty m:val="p"/>
+            </m:rPr>
+            <m:t>,</m:t>
+          </m:r>
+        </m:oMath>
+      </m:oMathPara>
+    </w:p>
+    <w:p>
+      <w:pPr>
+        <w:pStyle w:val="FirstParagraph"/>
+      </w:pPr>
+      <w:r>
+        <w:t xml:space="preserve">where the right-hand side is a</w:t>
+      </w:r>
+      <w:r>
+        <w:t xml:space="preserve"> </w:t>
+      </w:r>
+      <w:hyperlink w:anchor="def-closed-form-expression">
+        <w:r>
+          <w:rPr>
+            <w:rStyle w:val="Hyperlink"/>
+          </w:rPr>
+          <w:t xml:space="preserve">closed-form expression</w:t>
+        </w:r>
+      </w:hyperlink>
+      <w:r>
+        <w:t xml:space="preserve"> </w:t>
+      </w:r>
+      <w:r>
+        <w:t xml:space="preserve">in</w:t>
+      </w:r>
+      <w:r>
+        <w:t xml:space="preserve"> </w:t>
+      </w:r>
+      <m:oMath>
+        <m:r>
+          <m:t>a</m:t>
+        </m:r>
+      </m:oMath>
+      <w:r>
+        <w:t xml:space="preserve">,</w:t>
+      </w:r>
+      <w:r>
+        <w:t xml:space="preserve"> </w:t>
+      </w:r>
+      <m:oMath>
+        <m:r>
+          <m:t>b</m:t>
+        </m:r>
+      </m:oMath>
+      <w:r>
+        <w:t xml:space="preserve">, and</w:t>
+      </w:r>
+      <w:r>
+        <w:t xml:space="preserve"> </w:t>
+      </w:r>
+      <m:oMath>
+        <m:r>
+          <m:t>c</m:t>
+        </m:r>
+      </m:oMath>
+      <w:r>
+        <w:t xml:space="preserve">.</w:t>
+      </w:r>
+      <w:r>
+        <w:t xml:space="preserve"> </w:t>
+      </w:r>
+      <w:r>
+        <w:t xml:space="preserve">By contrast, no closed-form expression is known for the root of</w:t>
+      </w:r>
+      <w:r>
+        <w:t xml:space="preserve"> </w:t>
+      </w:r>
+      <m:oMath>
+        <m:r>
+          <m:t>x</m:t>
+        </m:r>
+        <m:r>
+          <m:rPr>
+            <m:sty m:val="p"/>
+          </m:rPr>
+          <m:t>−</m:t>
+        </m:r>
+        <m:r>
+          <m:rPr>
+            <m:sty m:val="p"/>
+          </m:rPr>
+          <m:t>cos</m:t>
+        </m:r>
+        <m:r>
+          <m:t>x</m:t>
+        </m:r>
+        <m:r>
+          <m:rPr>
+            <m:sty m:val="p"/>
+          </m:rPr>
+          <m:t>=</m:t>
+        </m:r>
+        <m:r>
+          <m:t>0</m:t>
+        </m:r>
+      </m:oMath>
+      <w:r>
+        <w:t xml:space="preserve">.</w:t>
+      </w:r>
+    </w:p>
+    <w:bookmarkEnd w:id="18"/>
+    <w:bookmarkStart w:id="19" w:name="def-closed-form-solution"/>
+    <w:p>
+      <w:pPr>
+        <w:pStyle w:val="BodyText"/>
+      </w:pPr>
+      <w:r>
+        <w:rPr>
+          <w:b/>
+          <w:bCs/>
+        </w:rPr>
+        <w:t xml:space="preserve">Definition 4 (Closed-form solution)</w:t>
+      </w:r>
+      <w:r>
+        <w:t xml:space="preserve"> </w:t>
+      </w:r>
+      <w:r>
+        <w:t xml:space="preserve">A</w:t>
+      </w:r>
+      <w:r>
+        <w:t xml:space="preserve"> </w:t>
+      </w:r>
+      <w:r>
+        <w:rPr>
+          <w:b/>
+          <w:bCs/>
+        </w:rPr>
+        <w:t xml:space="preserve">closed-form solution</w:t>
+      </w:r>
+      <w:r>
+        <w:t xml:space="preserve"> </w:t>
+      </w:r>
+      <w:r>
+        <w:t xml:space="preserve">of a problem,</w:t>
+      </w:r>
+      <w:r>
+        <w:t xml:space="preserve"> </w:t>
+      </w:r>
+      <w:r>
+        <w:t xml:space="preserve">such as solving an equation or minimizing a</w:t>
+      </w:r>
+      <w:r>
+        <w:t xml:space="preserve"> </w:t>
+      </w:r>
+      <w:hyperlink r:id="rId11">
+        <w:r>
+          <w:rPr>
+            <w:rStyle w:val="Hyperlink"/>
+          </w:rPr>
+          <w:t xml:space="preserve">function</w:t>
+        </w:r>
+      </w:hyperlink>
+      <w:r>
+        <w:t xml:space="preserve">,</w:t>
+      </w:r>
+      <w:r>
+        <w:t xml:space="preserve"> </w:t>
+      </w:r>
+      <w:r>
+        <w:t xml:space="preserve">is a</w:t>
+      </w:r>
+      <w:r>
+        <w:t xml:space="preserve"> </w:t>
+      </w:r>
+      <w:hyperlink w:anchor="def-closed-form-expression">
+        <w:r>
+          <w:rPr>
+            <w:rStyle w:val="Hyperlink"/>
+          </w:rPr>
+          <w:t xml:space="preserve">closed-form expression</w:t>
+        </w:r>
+      </w:hyperlink>
+      <w:r>
+        <w:t xml:space="preserve"> </w:t>
+      </w:r>
+      <w:r>
+        <w:t xml:space="preserve">for the answer.</w:t>
+      </w:r>
+    </w:p>
+    <w:bookmarkEnd w:id="19"/>
+    <w:bookmarkStart w:id="26" w:name="exm-closed-form-solution"/>
+    <w:p>
+      <w:pPr>
+        <w:pStyle w:val="BodyText"/>
+      </w:pPr>
+      <w:r>
+        <w:rPr>
+          <w:b/>
+          <w:bCs/>
+        </w:rPr>
+        <w:t xml:space="preserve">Example 3 (Least squares versus logistic regression)</w:t>
+      </w:r>
+      <w:r>
+        <w:t xml:space="preserve"> </w:t>
+      </w:r>
+      <w:r>
+        <w:t xml:space="preserve">Minimizing the</w:t>
+      </w:r>
+      <w:r>
+        <w:t xml:space="preserve"> </w:t>
+      </w:r>
+      <w:hyperlink r:id="rId20">
+        <w:r>
+          <w:rPr>
+            <w:rStyle w:val="Hyperlink"/>
+          </w:rPr>
+          <w:t xml:space="preserve">squared-error</w:t>
+        </w:r>
+      </w:hyperlink>
+      <w:r>
+        <w:t xml:space="preserve"> </w:t>
+      </w:r>
+      <w:r>
+        <w:t xml:space="preserve">cost of a</w:t>
+      </w:r>
+      <w:r>
+        <w:t xml:space="preserve"> </w:t>
+      </w:r>
+      <w:hyperlink r:id="rId21">
+        <w:r>
+          <w:rPr>
+            <w:rStyle w:val="Hyperlink"/>
+          </w:rPr>
+          <w:t xml:space="preserve">linear</w:t>
+        </w:r>
+      </w:hyperlink>
+      <w:r>
+        <w:t xml:space="preserve"> </w:t>
+      </w:r>
+      <w:r>
+        <w:t xml:space="preserve">model over</w:t>
+      </w:r>
+      <w:r>
+        <w:t xml:space="preserve"> </w:t>
+      </w:r>
+      <w:r>
+        <w:t xml:space="preserve">$\mathord{\smash[b]{\underset{\raise.3ex\hbox{$\scriptstyle\sim$}}{\beta}}\vphantom{\beta}}$</w:t>
+      </w:r>
+      <w:r>
+        <w:t xml:space="preserve"> </w:t>
+      </w:r>
+      <w:r>
+        <w:t xml:space="preserve">gives the</w:t>
+      </w:r>
+      <w:r>
+        <w:t xml:space="preserve"> </w:t>
+      </w:r>
+      <w:hyperlink r:id="rId22">
+        <w:r>
+          <w:rPr>
+            <w:rStyle w:val="Hyperlink"/>
+          </w:rPr>
+          <w:t xml:space="preserve">normal equations</w:t>
+        </w:r>
+      </w:hyperlink>
+      <w:r>
+        <w:t xml:space="preserve"> </w:t>
+      </w:r>
+      <w:r>
+        <w:t xml:space="preserve">${D}^{\top} D \mathord{\smash[b]{\underset{\raise.3ex\hbox{$\scriptstyle\sim$}}{\beta}}\vphantom{\beta}}= {D}^{\top} \mathord{\smash[b]{\underset{\raise.3ex\hbox{$\scriptstyle\sim$}}{y}}\vphantom{y}}$</w:t>
+      </w:r>
+      <w:r>
+        <w:t xml:space="preserve">.</w:t>
+      </w:r>
+      <w:r>
+        <w:t xml:space="preserve"> </w:t>
+      </w:r>
+      <w:r>
+        <w:t xml:space="preserve">When</w:t>
+      </w:r>
+      <w:r>
+        <w:t xml:space="preserve"> </w:t>
+      </w:r>
+      <m:oMath>
+        <m:sSup>
+          <m:e>
+            <m:r>
+              <m:t>D</m:t>
+            </m:r>
+          </m:e>
+          <m:sup>
+            <m:r>
+              <m:rPr>
+                <m:sty m:val="p"/>
+              </m:rPr>
+              <m:t>⊤</m:t>
+            </m:r>
+          </m:sup>
+        </m:sSup>
+        <m:r>
+          <m:t>D</m:t>
+        </m:r>
+      </m:oMath>
+      <w:r>
+        <w:t xml:space="preserve"> </w:t>
+      </w:r>
+      <w:r>
+        <w:t xml:space="preserve">is</w:t>
+      </w:r>
+      <w:r>
+        <w:t xml:space="preserve"> </w:t>
+      </w:r>
+      <w:hyperlink r:id="rId23">
+        <w:r>
+          <w:rPr>
+            <w:rStyle w:val="Hyperlink"/>
+          </w:rPr>
+          <w:t xml:space="preserve">invertible</w:t>
+        </w:r>
+      </w:hyperlink>
+      <w:r>
+        <w:t xml:space="preserve">,</w:t>
+      </w:r>
+      <w:r>
+        <w:t xml:space="preserve"> </w:t>
+      </w:r>
+      <w:r>
+        <w:t xml:space="preserve">the unique minimizer is</w:t>
+      </w:r>
+    </w:p>
+    <w:p>
+      <w:pPr>
+        <w:pStyle w:val="BodyText"/>
+      </w:pPr>
+      <w:r>
+        <w:t xml:space="preserve">$$
+    \hat{\mathord{\smash[b]{\underset{\raise.3ex\hbox{$\scriptstyle\sim$}}{\beta}}\vphantom{\beta}}}= {\mathopen{}\left({D}^{\top} D\right)\mathclose{}}^{-1} {D}^{\top} \mathord{\smash[b]{\underset{\raise.3ex\hbox{$\scriptstyle\sim$}}{y}}\vphantom{y}},
+    $$</w:t>
+      </w:r>
+    </w:p>
+    <w:p>
+      <w:pPr>
+        <w:pStyle w:val="FirstParagraph"/>
+      </w:pPr>
+      <w:r>
+        <w:t xml:space="preserve">whose right-hand side is a</w:t>
+      </w:r>
+      <w:r>
+        <w:t xml:space="preserve"> </w:t>
+      </w:r>
+      <w:hyperlink w:anchor="def-closed-form-expression">
+        <w:r>
+          <w:rPr>
+            <w:rStyle w:val="Hyperlink"/>
+          </w:rPr>
+          <w:t xml:space="preserve">closed-form expression</w:t>
+        </w:r>
+      </w:hyperlink>
+      <w:r>
+        <w:t xml:space="preserve">,</w:t>
+      </w:r>
+      <w:r>
+        <w:t xml:space="preserve"> </w:t>
+      </w:r>
+      <w:r>
+        <w:t xml:space="preserve">so</w:t>
+      </w:r>
+      <w:r>
+        <w:t xml:space="preserve"> </w:t>
+      </w:r>
+      <w:hyperlink r:id="rId24">
+        <w:r>
+          <w:rPr>
+            <w:rStyle w:val="Hyperlink"/>
+          </w:rPr>
+          <w:t xml:space="preserve">least squares</w:t>
+        </w:r>
+      </w:hyperlink>
+      <w:r>
+        <w:t xml:space="preserve"> </w:t>
+      </w:r>
+      <w:r>
+        <w:t xml:space="preserve">has a</w:t>
+      </w:r>
+      <w:r>
+        <w:t xml:space="preserve"> </w:t>
+      </w:r>
+      <w:hyperlink w:anchor="def-closed-form-solution">
+        <w:r>
+          <w:rPr>
+            <w:rStyle w:val="Hyperlink"/>
+          </w:rPr>
+          <w:t xml:space="preserve">closed-form solution</w:t>
+        </w:r>
+      </w:hyperlink>
+      <w:r>
+        <w:t xml:space="preserve">.</w:t>
+      </w:r>
+    </w:p>
+    <w:p>
+      <w:pPr>
+        <w:pStyle w:val="BodyText"/>
+      </w:pPr>
+      <w:r>
+        <w:t xml:space="preserve">For logistic regression, no closed-form expression is known for a minimizer</w:t>
+      </w:r>
+      <w:r>
+        <w:t xml:space="preserve"> </w:t>
+      </w:r>
+      <w:r>
+        <w:t xml:space="preserve">of the negative log-likelihood over</w:t>
+      </w:r>
+      <w:r>
+        <w:t xml:space="preserve"> </w:t>
+      </w:r>
+      <w:r>
+        <w:t xml:space="preserve">$\mathord{\smash[b]{\underset{\raise.3ex\hbox{$\scriptstyle\sim$}}{\beta}}\vphantom{\beta}}$</w:t>
+      </w:r>
+      <w:r>
+        <w:t xml:space="preserve">,</w:t>
+      </w:r>
+      <w:r>
+        <w:t xml:space="preserve"> </w:t>
+      </w:r>
+      <w:r>
+        <w:t xml:space="preserve">so that problem has no known closed-form solution.</w:t>
+      </w:r>
+      <w:r>
+        <w:t xml:space="preserve"> </w:t>
+      </w:r>
+      <w:r>
+        <w:t xml:space="preserve">When a minimizer exists, an</w:t>
+      </w:r>
+      <w:r>
+        <w:t xml:space="preserve"> </w:t>
+      </w:r>
+      <w:hyperlink r:id="rId25">
+        <w:r>
+          <w:rPr>
+            <w:rStyle w:val="Hyperlink"/>
+          </w:rPr>
+          <w:t xml:space="preserve">iterative method</w:t>
+        </w:r>
+      </w:hyperlink>
+      <w:r>
+        <w:t xml:space="preserve"> </w:t>
+      </w:r>
+      <w:r>
+        <w:t xml:space="preserve">approximates it.</w:t>
+      </w:r>
+      <w:r>
+        <w:t xml:space="preserve"> </w:t>
+      </w:r>
+    </w:p>
+    <w:bookmarkEnd w:id="26"/>
+    <w:bookmarkStart w:id="27" w:name="def-parse-tree"/>
+    <w:p>
+      <w:pPr>
+        <w:pStyle w:val="BodyText"/>
+      </w:pPr>
+      <w:r>
+        <w:rPr>
+          <w:b/>
+          <w:bCs/>
+        </w:rPr>
+        <w:t xml:space="preserve">Definition 5 (Parse tree)</w:t>
+      </w:r>
+      <w:r>
+        <w:t xml:space="preserve"> </w:t>
+      </w:r>
+      <w:r>
+        <w:t xml:space="preserve">The</w:t>
+      </w:r>
+      <w:r>
+        <w:t xml:space="preserve"> </w:t>
+      </w:r>
+      <w:r>
+        <w:rPr>
+          <w:b/>
+          <w:bCs/>
+        </w:rPr>
+        <w:t xml:space="preserve">parse tree</w:t>
+      </w:r>
+      <w:r>
+        <w:t xml:space="preserve"> </w:t>
+      </w:r>
+      <w:r>
+        <w:t xml:space="preserve">[3]</w:t>
+      </w:r>
+      <w:r>
+        <w:t xml:space="preserve"> </w:t>
+      </w:r>
+      <w:r>
+        <w:t xml:space="preserve">of an</w:t>
+      </w:r>
+      <w:r>
+        <w:t xml:space="preserve"> </w:t>
+      </w:r>
+      <w:hyperlink w:anchor="def-expression">
+        <w:r>
+          <w:rPr>
+            <w:rStyle w:val="Hyperlink"/>
+          </w:rPr>
+          <w:t xml:space="preserve">expression</w:t>
+        </w:r>
+      </w:hyperlink>
+      <w:r>
+        <w:t xml:space="preserve"> </w:t>
+      </w:r>
+      <w:r>
+        <w:t xml:space="preserve">is the tree</w:t>
+      </w:r>
+      <w:r>
+        <w:t xml:space="preserve"> </w:t>
+      </w:r>
+      <w:r>
+        <w:t xml:space="preserve">that shows how its symbols group into operations.</w:t>
+      </w:r>
+      <w:r>
+        <w:t xml:space="preserve"> </w:t>
+      </w:r>
+      <w:r>
+        <w:t xml:space="preserve">Its leaves are the constants and variables of the expression,</w:t>
+      </w:r>
+      <w:r>
+        <w:t xml:space="preserve"> </w:t>
+      </w:r>
+      <w:r>
+        <w:t xml:space="preserve">and each internal node is an operation applied to the nodes below it.</w:t>
+      </w:r>
+    </w:p>
+    <w:bookmarkEnd w:id="27"/>
+    <w:bookmarkStart w:id="28" w:name="exm-parse-tree"/>
+    <w:p>
+      <w:pPr>
+        <w:pStyle w:val="BodyText"/>
+      </w:pPr>
+      <w:r>
+        <w:rPr>
+          <w:b/>
+          <w:bCs/>
+        </w:rPr>
+        <w:t xml:space="preserve">Example 4 (The parse tree of a polynomial)</w:t>
       </w:r>
       <w:r>
         <w:t xml:space="preserve"> </w:t>
@@ -1411,7 +2231,7 @@
         <w:t xml:space="preserve">.</w:t>
       </w:r>
     </w:p>
-    <w:bookmarkEnd w:id="17"/>
+    <w:bookmarkEnd w:id="28"/>
     <w:tbl>
       <w:tblPr>
         <w:tblStyle w:val="Table"/>
@@ -1425,7 +2245,7 @@
       <w:tr>
         <w:tc>
           <w:tcPr/>
-          <w:bookmarkStart w:id="24" w:name="fig-parse-trees"/>
+          <w:bookmarkStart w:id="34" w:name="fig-parse-trees"/>
           <w:p>
             <w:pPr>
               <w:pStyle w:val="SourceCode"/>
@@ -4756,18 +5576,18 @@
                 <wp:inline>
                   <wp:extent cx="4620126" cy="3696101"/>
                   <wp:effectExtent b="0" l="0" r="0" t="0"/>
-                  <wp:docPr descr="" title="" id="19" name="Picture"/>
+                  <wp:docPr descr="" title="" id="30" name="Picture"/>
                   <a:graphic>
                     <a:graphicData uri="http://schemas.openxmlformats.org/drawingml/2006/picture">
                       <pic:pic>
                         <pic:nvPicPr>
-                          <pic:cNvPr descr="expressions-algorithms_files/figure-docx/parse-trees-plot-1.png" id="20" name="Picture"/>
+                          <pic:cNvPr descr="expressions-algorithms_files/figure-docx/parse-trees-plot-1.png" id="31" name="Picture"/>
                           <pic:cNvPicPr>
                             <a:picLocks noChangeArrowheads="1" noChangeAspect="1"/>
                           </pic:cNvPicPr>
                         </pic:nvPicPr>
                         <pic:blipFill>
-                          <a:blip r:embed="rId18"/>
+                          <a:blip r:embed="rId29"/>
                           <a:stretch>
                             <a:fillRect/>
                           </a:stretch>
@@ -4949,7 +5769,7 @@
             <w:r>
               <w:t xml:space="preserve"> </w:t>
             </w:r>
-            <w:hyperlink r:id="rId21">
+            <w:hyperlink r:id="rId16">
               <w:r>
                 <w:rPr>
                   <w:rStyle w:val="Hyperlink"/>
@@ -4966,7 +5786,7 @@
             <w:r>
               <w:t xml:space="preserve"> </w:t>
             </w:r>
-            <w:hyperlink r:id="rId22">
+            <w:hyperlink r:id="rId32">
               <w:r>
                 <w:rPr>
                   <w:rStyle w:val="Hyperlink"/>
@@ -4983,7 +5803,7 @@
             <w:r>
               <w:t xml:space="preserve"> </w:t>
             </w:r>
-            <w:hyperlink r:id="rId23">
+            <w:hyperlink r:id="rId33">
               <w:r>
                 <w:rPr>
                   <w:rStyle w:val="Hyperlink"/>
@@ -4995,11 +5815,11 @@
               <w:t xml:space="preserve">.</w:t>
             </w:r>
           </w:p>
-          <w:bookmarkEnd w:id="24"/>
+          <w:bookmarkEnd w:id="34"/>
         </w:tc>
       </w:tr>
     </w:tbl>
-    <w:bookmarkStart w:id="25" w:name="rem-expression-parse-tree"/>
+    <w:bookmarkStart w:id="35" w:name="rem-expression-parse-tree"/>
     <w:p>
       <w:pPr>
         <w:pStyle w:val="BodyText"/>
@@ -5142,16 +5962,16 @@
           <w:rPr>
             <w:rStyle w:val="Hyperlink"/>
           </w:rPr>
-          <w:t xml:space="preserve">Definition 3</w:t>
+          <w:t xml:space="preserve">Definition 5</w:t>
         </w:r>
       </w:hyperlink>
       <w:r>
         <w:t xml:space="preserve">).</w:t>
       </w:r>
     </w:p>
-    <w:bookmarkEnd w:id="25"/>
-    <w:bookmarkEnd w:id="26"/>
-    <w:bookmarkStart w:id="34" w:name="algorithms"/>
+    <w:bookmarkEnd w:id="35"/>
+    <w:bookmarkEnd w:id="36"/>
+    <w:bookmarkStart w:id="44" w:name="algorithms"/>
     <w:p>
       <w:pPr>
         <w:pStyle w:val="Heading2"/>
@@ -5160,7 +5980,7 @@
         <w:t xml:space="preserve">2 Algorithms</w:t>
       </w:r>
     </w:p>
-    <w:bookmarkStart w:id="27" w:name="def-algorithm"/>
+    <w:bookmarkStart w:id="37" w:name="def-algorithm"/>
     <w:p>
       <w:pPr>
         <w:pStyle w:val="FirstParagraph"/>
@@ -5170,7 +5990,7 @@
           <w:b/>
           <w:bCs/>
         </w:rPr>
-        <w:t xml:space="preserve">Definition 4 (Algorithm)</w:t>
+        <w:t xml:space="preserve">Definition 6 (Algorithm)</w:t>
       </w:r>
       <w:r>
         <w:t xml:space="preserve"> </w:t>
@@ -5192,7 +6012,7 @@
         <w:t xml:space="preserve"> </w:t>
       </w:r>
       <w:r>
-        <w:t xml:space="preserve">[3]</w:t>
+        <w:t xml:space="preserve">[4]</w:t>
       </w:r>
       <w:r>
         <w:t xml:space="preserve"> </w:t>
@@ -5207,8 +6027,8 @@
         <w:t xml:space="preserve">applied to any valid input, halts and returns an output.</w:t>
       </w:r>
     </w:p>
-    <w:bookmarkEnd w:id="27"/>
-    <w:bookmarkStart w:id="28" w:name="def-computes"/>
+    <w:bookmarkEnd w:id="37"/>
+    <w:bookmarkStart w:id="38" w:name="def-computes"/>
     <w:p>
       <w:pPr>
         <w:pStyle w:val="BodyText"/>
@@ -5218,7 +6038,7 @@
           <w:b/>
           <w:bCs/>
         </w:rPr>
-        <w:t xml:space="preserve">Definition 5 (Computes)</w:t>
+        <w:t xml:space="preserve">Definition 7 (Computes)</w:t>
       </w:r>
       <w:r>
         <w:t xml:space="preserve"> </w:t>
@@ -5302,8 +6122,8 @@
         <w:t xml:space="preserve">at that input.</w:t>
       </w:r>
     </w:p>
-    <w:bookmarkEnd w:id="28"/>
-    <w:bookmarkStart w:id="29" w:name="exm-algorithm"/>
+    <w:bookmarkEnd w:id="38"/>
+    <w:bookmarkStart w:id="39" w:name="exm-algorithm"/>
     <w:p>
       <w:pPr>
         <w:pStyle w:val="BodyText"/>
@@ -5313,7 +6133,7 @@
           <w:b/>
           <w:bCs/>
         </w:rPr>
-        <w:t xml:space="preserve">Example 3 (Two algorithms for one function)</w:t>
+        <w:t xml:space="preserve">Example 5 (Two algorithms for one function)</w:t>
       </w:r>
       <w:r>
         <w:t xml:space="preserve"> </w:t>
@@ -5704,8 +6524,8 @@
         <w:t xml:space="preserve">the same value by different steps.</w:t>
       </w:r>
     </w:p>
-    <w:bookmarkEnd w:id="29"/>
-    <w:bookmarkStart w:id="30" w:name="rem-algorithm-scope"/>
+    <w:bookmarkEnd w:id="39"/>
+    <w:bookmarkStart w:id="40" w:name="rem-algorithm-scope"/>
     <w:p>
       <w:pPr>
         <w:pStyle w:val="BodyText"/>
@@ -5861,8 +6681,8 @@
         <w:t xml:space="preserve">.</w:t>
       </w:r>
     </w:p>
-    <w:bookmarkEnd w:id="30"/>
-    <w:bookmarkStart w:id="31" w:name="rem-function-expression-algorithm"/>
+    <w:bookmarkEnd w:id="40"/>
+    <w:bookmarkStart w:id="41" w:name="rem-function-expression-algorithm"/>
     <w:p>
       <w:pPr>
         <w:pStyle w:val="BodyText"/>
@@ -6034,8 +6854,8 @@
         <w:t xml:space="preserve">and a different expression for the same function gives a different tree and a different algorithm.</w:t>
       </w:r>
     </w:p>
-    <w:bookmarkEnd w:id="31"/>
-    <w:bookmarkStart w:id="32" w:name="rem-no-known-algorithm"/>
+    <w:bookmarkEnd w:id="41"/>
+    <w:bookmarkStart w:id="42" w:name="rem-no-known-algorithm"/>
     <w:p>
       <w:pPr>
         <w:pStyle w:val="BodyText"/>
@@ -6141,8 +6961,8 @@
         <w:t xml:space="preserve">Such a value can still be well defined and approximated by an algorithm.</w:t>
       </w:r>
     </w:p>
-    <w:bookmarkEnd w:id="32"/>
-    <w:bookmarkStart w:id="33" w:name="exm-no-known-algorithm"/>
+    <w:bookmarkEnd w:id="42"/>
+    <w:bookmarkStart w:id="43" w:name="exm-no-known-algorithm"/>
     <w:p>
       <w:pPr>
         <w:pStyle w:val="BodyText"/>
@@ -6152,7 +6972,7 @@
           <w:b/>
           <w:bCs/>
         </w:rPr>
-        <w:t xml:space="preserve">Example 4 (A minimizer with no known formula)</w:t>
+        <w:t xml:space="preserve">Example 6 (A minimizer with no known formula)</w:t>
       </w:r>
       <w:r>
         <w:t xml:space="preserve"> </w:t>
@@ -6302,9 +7122,9 @@
         <w:t xml:space="preserve">An algorithm such as bisection approximates it as closely as we like.</w:t>
       </w:r>
     </w:p>
-    <w:bookmarkEnd w:id="33"/>
-    <w:bookmarkEnd w:id="34"/>
-    <w:bookmarkStart w:id="53" w:name="exercises"/>
+    <w:bookmarkEnd w:id="43"/>
+    <w:bookmarkEnd w:id="44"/>
+    <w:bookmarkStart w:id="65" w:name="exercises"/>
     <w:p>
       <w:pPr>
         <w:pStyle w:val="Heading2"/>
@@ -6313,7 +7133,7 @@
         <w:t xml:space="preserve">3 Exercises</w:t>
       </w:r>
     </w:p>
-    <w:bookmarkStart w:id="35" w:name="exr-expression-or-algorithm"/>
+    <w:bookmarkStart w:id="45" w:name="exr-expression-or-algorithm"/>
     <w:p>
       <w:pPr>
         <w:pStyle w:val="FirstParagraph"/>
@@ -6380,8 +7200,8 @@
         <w:t xml:space="preserve">differ?</w:t>
       </w:r>
     </w:p>
-    <w:bookmarkEnd w:id="35"/>
-    <w:bookmarkStart w:id="37" w:name="sol-expression-or-algorithm"/>
+    <w:bookmarkEnd w:id="45"/>
+    <w:bookmarkStart w:id="47" w:name="sol-expression-or-algorithm"/>
     <w:p>
       <w:pPr>
         <w:pStyle w:val="BodyText"/>
@@ -6505,7 +7325,7 @@
       <w:r>
         <w:t xml:space="preserve"> </w:t>
       </w:r>
-      <w:hyperlink r:id="rId36">
+      <w:hyperlink r:id="rId46">
         <w:r>
           <w:rPr>
             <w:rStyle w:val="Hyperlink"/>
@@ -6560,8 +7380,8 @@
         <w:t xml:space="preserve">compute the same one.</w:t>
       </w:r>
     </w:p>
-    <w:bookmarkEnd w:id="37"/>
-    <w:bookmarkStart w:id="38" w:name="exr-expression-or-algorithm-part2"/>
+    <w:bookmarkEnd w:id="47"/>
+    <w:bookmarkStart w:id="48" w:name="exr-expression-or-algorithm-part2"/>
     <w:p>
       <w:pPr>
         <w:pStyle w:val="BodyText"/>
@@ -6694,8 +7514,8 @@
         <w:t xml:space="preserve">?</w:t>
       </w:r>
     </w:p>
-    <w:bookmarkEnd w:id="38"/>
-    <w:bookmarkStart w:id="39" w:name="sol-expression-or-algorithm-part2"/>
+    <w:bookmarkEnd w:id="48"/>
+    <w:bookmarkStart w:id="49" w:name="sol-expression-or-algorithm-part2"/>
     <w:p>
       <w:pPr>
         <w:pStyle w:val="BodyText"/>
@@ -6756,8 +7576,8 @@
         <w:t xml:space="preserve">.</w:t>
       </w:r>
     </w:p>
-    <w:bookmarkEnd w:id="39"/>
-    <w:bookmarkStart w:id="40" w:name="exr-expression-or-algorithm-part3"/>
+    <w:bookmarkEnd w:id="49"/>
+    <w:bookmarkStart w:id="50" w:name="exr-expression-or-algorithm-part3"/>
     <w:p>
       <w:pPr>
         <w:pStyle w:val="BodyText"/>
@@ -6856,8 +7676,8 @@
         <w:t xml:space="preserve">tell you which arithmetic steps to carry out?</w:t>
       </w:r>
     </w:p>
-    <w:bookmarkEnd w:id="40"/>
-    <w:bookmarkStart w:id="41" w:name="sol-expression-or-algorithm-part3"/>
+    <w:bookmarkEnd w:id="50"/>
+    <w:bookmarkStart w:id="51" w:name="sol-expression-or-algorithm-part3"/>
     <w:p>
       <w:pPr>
         <w:pStyle w:val="BodyText"/>
@@ -7024,8 +7844,8 @@
         <w:t xml:space="preserve">.</w:t>
       </w:r>
     </w:p>
-    <w:bookmarkEnd w:id="41"/>
-    <w:bookmarkStart w:id="42" w:name="exr-expression-or-algorithm-part4"/>
+    <w:bookmarkEnd w:id="51"/>
+    <w:bookmarkStart w:id="52" w:name="exr-expression-or-algorithm-part4"/>
     <w:p>
       <w:pPr>
         <w:pStyle w:val="BodyText"/>
@@ -7121,8 +7941,8 @@
         <w:t xml:space="preserve">?</w:t>
       </w:r>
     </w:p>
-    <w:bookmarkEnd w:id="42"/>
-    <w:bookmarkStart w:id="43" w:name="sol-expression-or-algorithm-part4"/>
+    <w:bookmarkEnd w:id="52"/>
+    <w:bookmarkStart w:id="53" w:name="sol-expression-or-algorithm-part4"/>
     <w:p>
       <w:pPr>
         <w:pStyle w:val="BodyText"/>
@@ -7279,8 +8099,8 @@
         <w:t xml:space="preserve">that evaluates it.</w:t>
       </w:r>
     </w:p>
-    <w:bookmarkEnd w:id="43"/>
-    <w:bookmarkStart w:id="44" w:name="exr-expression-or-algorithm-part5"/>
+    <w:bookmarkEnd w:id="53"/>
+    <w:bookmarkStart w:id="54" w:name="exr-expression-or-algorithm-part5"/>
     <w:p>
       <w:pPr>
         <w:pStyle w:val="BodyText"/>
@@ -7419,8 +8239,8 @@
         <w:t xml:space="preserve">and needs fewer multiplications.</w:t>
       </w:r>
     </w:p>
-    <w:bookmarkEnd w:id="44"/>
-    <w:bookmarkStart w:id="45" w:name="sol-expression-or-algorithm-part5"/>
+    <w:bookmarkEnd w:id="54"/>
+    <w:bookmarkStart w:id="55" w:name="sol-expression-or-algorithm-part5"/>
     <w:p>
       <w:pPr>
         <w:pStyle w:val="BodyText"/>
@@ -7592,9 +8412,9 @@
         <w:t xml:space="preserve">.</w:t>
       </w:r>
     </w:p>
-    <w:bookmarkEnd w:id="45"/>
-    <w:bookmarkStart w:id="52" w:name="refs"/>
-    <w:bookmarkStart w:id="47" w:name="ref-wikipedia_expression_mathematics"/>
+    <w:bookmarkEnd w:id="55"/>
+    <w:bookmarkStart w:id="64" w:name="refs"/>
+    <w:bookmarkStart w:id="57" w:name="ref-wikipedia_expression_mathematics"/>
     <w:p>
       <w:pPr>
         <w:pStyle w:val="Bibliography"/>
@@ -7641,7 +8461,7 @@
       <w:r>
         <w:t xml:space="preserve"> </w:t>
       </w:r>
-      <w:hyperlink r:id="rId46">
+      <w:hyperlink r:id="rId56">
         <w:r>
           <w:rPr>
             <w:rStyle w:val="Hyperlink"/>
@@ -7650,8 +8470,8 @@
         </w:r>
       </w:hyperlink>
     </w:p>
-    <w:bookmarkEnd w:id="47"/>
-    <w:bookmarkStart w:id="49" w:name="ref-wikipedia_parse_tree"/>
+    <w:bookmarkEnd w:id="57"/>
+    <w:bookmarkStart w:id="59" w:name="ref-wikipedia_closed_form_expression"/>
     <w:p>
       <w:pPr>
         <w:pStyle w:val="Bibliography"/>
@@ -7672,6 +8492,63 @@
         <w:t xml:space="preserve"> </w:t>
       </w:r>
       <w:r>
+        <w:t xml:space="preserve">“Closed-form expression —</w:t>
+      </w:r>
+      <w:r>
+        <w:t xml:space="preserve"> </w:t>
+      </w:r>
+      <w:r>
+        <w:t xml:space="preserve">Wikipedia</w:t>
+      </w:r>
+      <w:r>
+        <w:t xml:space="preserve">,</w:t>
+      </w:r>
+      <w:r>
+        <w:t xml:space="preserve"> </w:t>
+      </w:r>
+      <w:r>
+        <w:t xml:space="preserve">the free encyclopedia.”</w:t>
+      </w:r>
+      <w:r>
+        <w:t xml:space="preserve"> </w:t>
+      </w:r>
+      <w:r>
+        <w:t xml:space="preserve">2026. Available:</w:t>
+      </w:r>
+      <w:r>
+        <w:t xml:space="preserve"> </w:t>
+      </w:r>
+      <w:hyperlink r:id="rId58">
+        <w:r>
+          <w:rPr>
+            <w:rStyle w:val="Hyperlink"/>
+          </w:rPr>
+          <w:t xml:space="preserve">https://en.wikipedia.org/wiki/Closed-form_expression</w:t>
+        </w:r>
+      </w:hyperlink>
+    </w:p>
+    <w:bookmarkEnd w:id="59"/>
+    <w:bookmarkStart w:id="61" w:name="ref-wikipedia_parse_tree"/>
+    <w:p>
+      <w:pPr>
+        <w:pStyle w:val="Bibliography"/>
+      </w:pPr>
+      <w:r>
+        <w:t xml:space="preserve">[3]</w:t>
+      </w:r>
+      <w:r>
+        <w:t xml:space="preserve"> </w:t>
+      </w:r>
+      <w:r>
+        <w:t xml:space="preserve">	</w:t>
+      </w:r>
+      <w:r>
+        <w:t xml:space="preserve">Wikipedia contributors,</w:t>
+      </w:r>
+      <w:r>
+        <w:t xml:space="preserve"> </w:t>
+      </w:r>
+      <w:r>
         <w:t xml:space="preserve">“Parse tree —</w:t>
       </w:r>
       <w:r>
@@ -7698,7 +8575,7 @@
       <w:r>
         <w:t xml:space="preserve"> </w:t>
       </w:r>
-      <w:hyperlink r:id="rId48">
+      <w:hyperlink r:id="rId60">
         <w:r>
           <w:rPr>
             <w:rStyle w:val="Hyperlink"/>
@@ -7707,14 +8584,14 @@
         </w:r>
       </w:hyperlink>
     </w:p>
-    <w:bookmarkEnd w:id="49"/>
-    <w:bookmarkStart w:id="51" w:name="ref-wikipedia_algorithm"/>
+    <w:bookmarkEnd w:id="61"/>
+    <w:bookmarkStart w:id="63" w:name="ref-wikipedia_algorithm"/>
     <w:p>
       <w:pPr>
         <w:pStyle w:val="Bibliography"/>
       </w:pPr>
       <w:r>
-        <w:t xml:space="preserve">[3]</w:t>
+        <w:t xml:space="preserve">[4]</w:t>
       </w:r>
       <w:r>
         <w:t xml:space="preserve"> </w:t>
@@ -7755,7 +8632,7 @@
       <w:r>
         <w:t xml:space="preserve"> </w:t>
       </w:r>
-      <w:hyperlink r:id="rId50">
+      <w:hyperlink r:id="rId62">
         <w:r>
           <w:rPr>
             <w:rStyle w:val="Hyperlink"/>
@@ -7764,9 +8641,9 @@
         </w:r>
       </w:hyperlink>
     </w:p>
-    <w:bookmarkEnd w:id="51"/>
-    <w:bookmarkEnd w:id="52"/>
-    <w:bookmarkEnd w:id="53"/>
+    <w:bookmarkEnd w:id="63"/>
+    <w:bookmarkEnd w:id="64"/>
+    <w:bookmarkEnd w:id="65"/>
     <w:sectPr>
       <w:footnotePr>
         <w:numRestart w:val="eachSect"/>

</xml_diff>

<commit_message>
Deploying to gh-pages from @ Morrison-Lab/mds@b784e286e0cea97b7e9ceb03622be367e9f4c85c 🚀
</commit_message>
<xml_diff>
--- a/expressions-algorithms.docx
+++ b/expressions-algorithms.docx
@@ -15,7 +15,7 @@
         <w:pStyle w:val="Date"/>
       </w:pPr>
       <w:r>
-        <w:t xml:space="preserve">Last modified: 2026-10-27 01:34:30 (PDT)</w:t>
+        <w:t xml:space="preserve">Last modified: 2026-10-27 09:35:20 (PDT)</w:t>
       </w:r>
     </w:p>
     <w:p>
@@ -6139,7 +6139,24 @@
         <w:t xml:space="preserve"> </w:t>
       </w:r>
       <w:r>
-        <w:t xml:space="preserve">Take the function that</w:t>
+        <w:t xml:space="preserve">Take the</w:t>
+      </w:r>
+      <w:r>
+        <w:t xml:space="preserve"> </w:t>
+      </w:r>
+      <w:hyperlink r:id="rId11">
+        <w:r>
+          <w:rPr>
+            <w:rStyle w:val="Hyperlink"/>
+          </w:rPr>
+          <w:t xml:space="preserve">function</w:t>
+        </w:r>
+      </w:hyperlink>
+      <w:r>
+        <w:t xml:space="preserve"> </w:t>
+      </w:r>
+      <w:r>
+        <w:t xml:space="preserve">that</w:t>
       </w:r>
       <w:r>
         <w:t xml:space="preserve"> </w:t>
@@ -6320,7 +6337,7 @@
         <w:t xml:space="preserve"> </w:t>
       </w:r>
       <w:r>
-        <w:t xml:space="preserve">At</w:t>
+        <w:t xml:space="preserve">We evaluate both forms at</w:t>
       </w:r>
       <w:r>
         <w:t xml:space="preserve"> </w:t>
@@ -6409,119 +6426,957 @@
         </m:r>
       </m:oMath>
       <w:r>
+        <w:t xml:space="preserve">, in R and in Python,</w:t>
+      </w:r>
+      <w:r>
+        <w:t xml:space="preserve"> </w:t>
+      </w:r>
+      <w:r>
+        <w:t xml:space="preserve">and give each intermediate quantity a name.</w:t>
+      </w:r>
+      <w:r>
+        <w:t xml:space="preserve"> </w:t>
+      </w:r>
+      <w:r>
+        <w:t xml:space="preserve">(The code calls</w:t>
+      </w:r>
+      <w:r>
+        <w:t xml:space="preserve"> </w:t>
+      </w:r>
+      <m:oMath>
+        <m:r>
+          <m:t>c</m:t>
+        </m:r>
+      </m:oMath>
+      <w:r>
+        <w:t xml:space="preserve"> </w:t>
+      </w:r>
+      <w:r>
+        <w:rPr>
+          <w:rStyle w:val="VerbatimChar"/>
+        </w:rPr>
+        <w:t xml:space="preserve">c0</w:t>
+      </w:r>
+      <w:r>
         <w:t xml:space="preserve">,</w:t>
       </w:r>
       <w:r>
         <w:t xml:space="preserve"> </w:t>
       </w:r>
       <w:r>
-        <w:t xml:space="preserve">the first algorithm computes</w:t>
-      </w:r>
-      <w:r>
-        <w:t xml:space="preserve"> </w:t>
-      </w:r>
-      <m:oMath>
-        <m:r>
-          <m:t>4.5</m:t>
-        </m:r>
-        <m:r>
-          <m:rPr>
-            <m:sty m:val="p"/>
-          </m:rPr>
-          <m:t>−</m:t>
-        </m:r>
-        <m:r>
-          <m:t>4.5</m:t>
-        </m:r>
-        <m:r>
-          <m:rPr>
-            <m:sty m:val="p"/>
-          </m:rPr>
-          <m:t>+</m:t>
-        </m:r>
-        <m:r>
-          <m:t>5</m:t>
-        </m:r>
-        <m:r>
-          <m:rPr>
-            <m:sty m:val="p"/>
-          </m:rPr>
-          <m:t>=</m:t>
-        </m:r>
-        <m:r>
-          <m:t>5</m:t>
-        </m:r>
-      </m:oMath>
-      <w:r>
-        <w:t xml:space="preserve"> </w:t>
-      </w:r>
-      <w:r>
-        <w:t xml:space="preserve">and the second computes</w:t>
-      </w:r>
-      <w:r>
-        <w:t xml:space="preserve"> </w:t>
-      </w:r>
-      <m:oMath>
-        <m:r>
-          <m:rPr>
-            <m:sty m:val="p"/>
-          </m:rPr>
-          <m:t>(</m:t>
-        </m:r>
-        <m:r>
-          <m:t>3</m:t>
-        </m:r>
-        <m:r>
-          <m:rPr>
-            <m:sty m:val="p"/>
-          </m:rPr>
-          <m:t>−</m:t>
-        </m:r>
-        <m:r>
-          <m:t>3</m:t>
-        </m:r>
-        <m:r>
-          <m:rPr>
-            <m:sty m:val="p"/>
-          </m:rPr>
-          <m:t>)</m:t>
-        </m:r>
-        <m:r>
-          <m:rPr>
-            <m:sty m:val="p"/>
-          </m:rPr>
-          <m:t>⋅</m:t>
-        </m:r>
-        <m:r>
-          <m:t>1.5</m:t>
-        </m:r>
-        <m:r>
-          <m:rPr>
-            <m:sty m:val="p"/>
-          </m:rPr>
-          <m:t>+</m:t>
-        </m:r>
-        <m:r>
-          <m:t>5</m:t>
-        </m:r>
-        <m:r>
-          <m:rPr>
-            <m:sty m:val="p"/>
-          </m:rPr>
-          <m:t>=</m:t>
-        </m:r>
-        <m:r>
-          <m:t>5</m:t>
-        </m:r>
-      </m:oMath>
-      <w:r>
-        <w:t xml:space="preserve">,</w:t>
-      </w:r>
-      <w:r>
-        <w:t xml:space="preserve"> </w:t>
-      </w:r>
-      <w:r>
-        <w:t xml:space="preserve">the same value by different steps.</w:t>
+        <w:t xml:space="preserve">because</w:t>
+      </w:r>
+      <w:r>
+        <w:t xml:space="preserve"> </w:t>
+      </w:r>
+      <w:r>
+        <w:rPr>
+          <w:rStyle w:val="VerbatimChar"/>
+        </w:rPr>
+        <w:t xml:space="preserve">c</w:t>
+      </w:r>
+      <w:r>
+        <w:t xml:space="preserve"> </w:t>
+      </w:r>
+      <w:r>
+        <w:t xml:space="preserve">is a built-in function in R.)</w:t>
+      </w:r>
+      <w:r>
+        <w:t xml:space="preserve"> </w:t>
+      </w:r>
+      <w:r>
+        <w:t xml:space="preserve">The two</w:t>
+      </w:r>
+      <w:r>
+        <w:t xml:space="preserve"> </w:t>
+      </w:r>
+      <w:hyperlink w:anchor="def-algorithm">
+        <w:r>
+          <w:rPr>
+            <w:rStyle w:val="Hyperlink"/>
+          </w:rPr>
+          <w:t xml:space="preserve">algorithms</w:t>
+        </w:r>
+      </w:hyperlink>
+      <w:r>
+        <w:t xml:space="preserve"> </w:t>
+      </w:r>
+      <w:hyperlink w:anchor="def-computes">
+        <w:r>
+          <w:rPr>
+            <w:rStyle w:val="Hyperlink"/>
+          </w:rPr>
+          <w:t xml:space="preserve">compute</w:t>
+        </w:r>
+      </w:hyperlink>
+      <w:r>
+        <w:t xml:space="preserve"> </w:t>
+      </w:r>
+      <w:r>
+        <w:t xml:space="preserve">the same function,</w:t>
+      </w:r>
+      <w:r>
+        <w:t xml:space="preserve"> </w:t>
+      </w:r>
+      <w:r>
+        <w:t xml:space="preserve">so the two</w:t>
+      </w:r>
+      <w:r>
+        <w:t xml:space="preserve"> </w:t>
+      </w:r>
+      <w:hyperlink r:id="rId13">
+        <w:r>
+          <w:rPr>
+            <w:rStyle w:val="Hyperlink"/>
+          </w:rPr>
+          <w:t xml:space="preserve">values</w:t>
+        </w:r>
+      </w:hyperlink>
+      <w:r>
+        <w:t xml:space="preserve"> </w:t>
+      </w:r>
+      <w:r>
+        <w:t xml:space="preserve">must agree.</w:t>
+      </w:r>
+    </w:p>
+    <w:p>
+      <w:pPr>
+        <w:pStyle w:val="Heading3"/>
+      </w:pPr>
+      <w:r>
+        <w:t xml:space="preserve">R</w:t>
+      </w:r>
+    </w:p>
+    <w:p>
+      <w:pPr>
+        <w:pStyle w:val="SourceCode"/>
+      </w:pPr>
+      <w:r>
+        <w:rPr>
+          <w:rStyle w:val="NormalTok"/>
+        </w:rPr>
+        <w:t xml:space="preserve">a </w:t>
+      </w:r>
+      <w:r>
+        <w:rPr>
+          <w:rStyle w:val="OtherTok"/>
+        </w:rPr>
+        <w:t xml:space="preserve">&lt;-</w:t>
+      </w:r>
+      <w:r>
+        <w:rPr>
+          <w:rStyle w:val="NormalTok"/>
+        </w:rPr>
+        <w:t xml:space="preserve"> </w:t>
+      </w:r>
+      <w:r>
+        <w:rPr>
+          <w:rStyle w:val="DecValTok"/>
+        </w:rPr>
+        <w:t xml:space="preserve">2</w:t>
+      </w:r>
+      <w:r>
+        <w:br/>
+      </w:r>
+      <w:r>
+        <w:rPr>
+          <w:rStyle w:val="NormalTok"/>
+        </w:rPr>
+        <w:t xml:space="preserve">b </w:t>
+      </w:r>
+      <w:r>
+        <w:rPr>
+          <w:rStyle w:val="OtherTok"/>
+        </w:rPr>
+        <w:t xml:space="preserve">&lt;-</w:t>
+      </w:r>
+      <w:r>
+        <w:rPr>
+          <w:rStyle w:val="NormalTok"/>
+        </w:rPr>
+        <w:t xml:space="preserve"> </w:t>
+      </w:r>
+      <w:r>
+        <w:rPr>
+          <w:rStyle w:val="SpecialCharTok"/>
+        </w:rPr>
+        <w:t xml:space="preserve">-</w:t>
+      </w:r>
+      <w:r>
+        <w:rPr>
+          <w:rStyle w:val="DecValTok"/>
+        </w:rPr>
+        <w:t xml:space="preserve">3</w:t>
+      </w:r>
+      <w:r>
+        <w:br/>
+      </w:r>
+      <w:r>
+        <w:rPr>
+          <w:rStyle w:val="NormalTok"/>
+        </w:rPr>
+        <w:t xml:space="preserve">c0 </w:t>
+      </w:r>
+      <w:r>
+        <w:rPr>
+          <w:rStyle w:val="OtherTok"/>
+        </w:rPr>
+        <w:t xml:space="preserve">&lt;-</w:t>
+      </w:r>
+      <w:r>
+        <w:rPr>
+          <w:rStyle w:val="NormalTok"/>
+        </w:rPr>
+        <w:t xml:space="preserve"> </w:t>
+      </w:r>
+      <w:r>
+        <w:rPr>
+          <w:rStyle w:val="DecValTok"/>
+        </w:rPr>
+        <w:t xml:space="preserve">5</w:t>
+      </w:r>
+      <w:r>
+        <w:br/>
+      </w:r>
+      <w:r>
+        <w:rPr>
+          <w:rStyle w:val="NormalTok"/>
+        </w:rPr>
+        <w:t xml:space="preserve">x </w:t>
+      </w:r>
+      <w:r>
+        <w:rPr>
+          <w:rStyle w:val="OtherTok"/>
+        </w:rPr>
+        <w:t xml:space="preserve">&lt;-</w:t>
+      </w:r>
+      <w:r>
+        <w:rPr>
+          <w:rStyle w:val="NormalTok"/>
+        </w:rPr>
+        <w:t xml:space="preserve"> </w:t>
+      </w:r>
+      <w:r>
+        <w:rPr>
+          <w:rStyle w:val="FloatTok"/>
+        </w:rPr>
+        <w:t xml:space="preserve">1.5</w:t>
+      </w:r>
+      <w:r>
+        <w:br/>
+      </w:r>
+      <w:r>
+        <w:rPr>
+          <w:rStyle w:val="CommentTok"/>
+        </w:rPr>
+        <w:t xml:space="preserve"># Expanded form: 3 multiplications, 2 additions</w:t>
+      </w:r>
+      <w:r>
+        <w:br/>
+      </w:r>
+      <w:r>
+        <w:rPr>
+          <w:rStyle w:val="NormalTok"/>
+        </w:rPr>
+        <w:t xml:space="preserve">square_term </w:t>
+      </w:r>
+      <w:r>
+        <w:rPr>
+          <w:rStyle w:val="OtherTok"/>
+        </w:rPr>
+        <w:t xml:space="preserve">&lt;-</w:t>
+      </w:r>
+      <w:r>
+        <w:rPr>
+          <w:rStyle w:val="NormalTok"/>
+        </w:rPr>
+        <w:t xml:space="preserve"> a </w:t>
+      </w:r>
+      <w:r>
+        <w:rPr>
+          <w:rStyle w:val="SpecialCharTok"/>
+        </w:rPr>
+        <w:t xml:space="preserve">*</w:t>
+      </w:r>
+      <w:r>
+        <w:rPr>
+          <w:rStyle w:val="NormalTok"/>
+        </w:rPr>
+        <w:t xml:space="preserve"> x </w:t>
+      </w:r>
+      <w:r>
+        <w:rPr>
+          <w:rStyle w:val="SpecialCharTok"/>
+        </w:rPr>
+        <w:t xml:space="preserve">*</w:t>
+      </w:r>
+      <w:r>
+        <w:rPr>
+          <w:rStyle w:val="NormalTok"/>
+        </w:rPr>
+        <w:t xml:space="preserve"> x</w:t>
+      </w:r>
+      <w:r>
+        <w:br/>
+      </w:r>
+      <w:r>
+        <w:rPr>
+          <w:rStyle w:val="NormalTok"/>
+        </w:rPr>
+        <w:t xml:space="preserve">linear_term </w:t>
+      </w:r>
+      <w:r>
+        <w:rPr>
+          <w:rStyle w:val="OtherTok"/>
+        </w:rPr>
+        <w:t xml:space="preserve">&lt;-</w:t>
+      </w:r>
+      <w:r>
+        <w:rPr>
+          <w:rStyle w:val="NormalTok"/>
+        </w:rPr>
+        <w:t xml:space="preserve"> b </w:t>
+      </w:r>
+      <w:r>
+        <w:rPr>
+          <w:rStyle w:val="SpecialCharTok"/>
+        </w:rPr>
+        <w:t xml:space="preserve">*</w:t>
+      </w:r>
+      <w:r>
+        <w:rPr>
+          <w:rStyle w:val="NormalTok"/>
+        </w:rPr>
+        <w:t xml:space="preserve"> x</w:t>
+      </w:r>
+      <w:r>
+        <w:br/>
+      </w:r>
+      <w:r>
+        <w:rPr>
+          <w:rStyle w:val="NormalTok"/>
+        </w:rPr>
+        <w:t xml:space="preserve">expanded </w:t>
+      </w:r>
+      <w:r>
+        <w:rPr>
+          <w:rStyle w:val="OtherTok"/>
+        </w:rPr>
+        <w:t xml:space="preserve">&lt;-</w:t>
+      </w:r>
+      <w:r>
+        <w:rPr>
+          <w:rStyle w:val="NormalTok"/>
+        </w:rPr>
+        <w:t xml:space="preserve"> square_term </w:t>
+      </w:r>
+      <w:r>
+        <w:rPr>
+          <w:rStyle w:val="SpecialCharTok"/>
+        </w:rPr>
+        <w:t xml:space="preserve">+</w:t>
+      </w:r>
+      <w:r>
+        <w:rPr>
+          <w:rStyle w:val="NormalTok"/>
+        </w:rPr>
+        <w:t xml:space="preserve"> linear_term </w:t>
+      </w:r>
+      <w:r>
+        <w:rPr>
+          <w:rStyle w:val="SpecialCharTok"/>
+        </w:rPr>
+        <w:t xml:space="preserve">+</w:t>
+      </w:r>
+      <w:r>
+        <w:rPr>
+          <w:rStyle w:val="NormalTok"/>
+        </w:rPr>
+        <w:t xml:space="preserve"> c0</w:t>
+      </w:r>
+      <w:r>
+        <w:br/>
+      </w:r>
+      <w:r>
+        <w:rPr>
+          <w:rStyle w:val="CommentTok"/>
+        </w:rPr>
+        <w:t xml:space="preserve"># Horner's form: 2 multiplications, 2 additions</w:t>
+      </w:r>
+      <w:r>
+        <w:br/>
+      </w:r>
+      <w:r>
+        <w:rPr>
+          <w:rStyle w:val="NormalTok"/>
+        </w:rPr>
+        <w:t xml:space="preserve">inner </w:t>
+      </w:r>
+      <w:r>
+        <w:rPr>
+          <w:rStyle w:val="OtherTok"/>
+        </w:rPr>
+        <w:t xml:space="preserve">&lt;-</w:t>
+      </w:r>
+      <w:r>
+        <w:rPr>
+          <w:rStyle w:val="NormalTok"/>
+        </w:rPr>
+        <w:t xml:space="preserve"> a </w:t>
+      </w:r>
+      <w:r>
+        <w:rPr>
+          <w:rStyle w:val="SpecialCharTok"/>
+        </w:rPr>
+        <w:t xml:space="preserve">*</w:t>
+      </w:r>
+      <w:r>
+        <w:rPr>
+          <w:rStyle w:val="NormalTok"/>
+        </w:rPr>
+        <w:t xml:space="preserve"> x </w:t>
+      </w:r>
+      <w:r>
+        <w:rPr>
+          <w:rStyle w:val="SpecialCharTok"/>
+        </w:rPr>
+        <w:t xml:space="preserve">+</w:t>
+      </w:r>
+      <w:r>
+        <w:rPr>
+          <w:rStyle w:val="NormalTok"/>
+        </w:rPr>
+        <w:t xml:space="preserve"> b</w:t>
+      </w:r>
+      <w:r>
+        <w:br/>
+      </w:r>
+      <w:r>
+        <w:rPr>
+          <w:rStyle w:val="NormalTok"/>
+        </w:rPr>
+        <w:t xml:space="preserve">horner </w:t>
+      </w:r>
+      <w:r>
+        <w:rPr>
+          <w:rStyle w:val="OtherTok"/>
+        </w:rPr>
+        <w:t xml:space="preserve">&lt;-</w:t>
+      </w:r>
+      <w:r>
+        <w:rPr>
+          <w:rStyle w:val="NormalTok"/>
+        </w:rPr>
+        <w:t xml:space="preserve"> inner </w:t>
+      </w:r>
+      <w:r>
+        <w:rPr>
+          <w:rStyle w:val="SpecialCharTok"/>
+        </w:rPr>
+        <w:t xml:space="preserve">*</w:t>
+      </w:r>
+      <w:r>
+        <w:rPr>
+          <w:rStyle w:val="NormalTok"/>
+        </w:rPr>
+        <w:t xml:space="preserve"> x </w:t>
+      </w:r>
+      <w:r>
+        <w:rPr>
+          <w:rStyle w:val="SpecialCharTok"/>
+        </w:rPr>
+        <w:t xml:space="preserve">+</w:t>
+      </w:r>
+      <w:r>
+        <w:rPr>
+          <w:rStyle w:val="NormalTok"/>
+        </w:rPr>
+        <w:t xml:space="preserve"> c0</w:t>
+      </w:r>
+      <w:r>
+        <w:br/>
+      </w:r>
+      <w:r>
+        <w:rPr>
+          <w:rStyle w:val="FunctionTok"/>
+        </w:rPr>
+        <w:t xml:space="preserve">c</w:t>
+      </w:r>
+      <w:r>
+        <w:rPr>
+          <w:rStyle w:val="NormalTok"/>
+        </w:rPr>
+        <w:t xml:space="preserve">(square_term, linear_term, expanded)</w:t>
+      </w:r>
+      <w:r>
+        <w:br/>
+      </w:r>
+      <w:r>
+        <w:rPr>
+          <w:rStyle w:val="CommentTok"/>
+        </w:rPr>
+        <w:t xml:space="preserve">#&gt; [1]  4.5 -4.5  5.0</w:t>
+      </w:r>
+      <w:r>
+        <w:br/>
+      </w:r>
+      <w:r>
+        <w:rPr>
+          <w:rStyle w:val="FunctionTok"/>
+        </w:rPr>
+        <w:t xml:space="preserve">c</w:t>
+      </w:r>
+      <w:r>
+        <w:rPr>
+          <w:rStyle w:val="NormalTok"/>
+        </w:rPr>
+        <w:t xml:space="preserve">(inner, horner)</w:t>
+      </w:r>
+      <w:r>
+        <w:br/>
+      </w:r>
+      <w:r>
+        <w:rPr>
+          <w:rStyle w:val="CommentTok"/>
+        </w:rPr>
+        <w:t xml:space="preserve">#&gt; [1] 0 5</w:t>
+      </w:r>
+    </w:p>
+    <w:p>
+      <w:pPr>
+        <w:pStyle w:val="Heading3"/>
+      </w:pPr>
+      <w:r>
+        <w:t xml:space="preserve">Python</w:t>
+      </w:r>
+    </w:p>
+    <w:p>
+      <w:pPr>
+        <w:pStyle w:val="SourceCode"/>
+      </w:pPr>
+      <w:r>
+        <w:rPr>
+          <w:rStyle w:val="NormalTok"/>
+        </w:rPr>
+        <w:t xml:space="preserve">a </w:t>
+      </w:r>
+      <w:r>
+        <w:rPr>
+          <w:rStyle w:val="OperatorTok"/>
+        </w:rPr>
+        <w:t xml:space="preserve">=</w:t>
+      </w:r>
+      <w:r>
+        <w:rPr>
+          <w:rStyle w:val="NormalTok"/>
+        </w:rPr>
+        <w:t xml:space="preserve"> </w:t>
+      </w:r>
+      <w:r>
+        <w:rPr>
+          <w:rStyle w:val="DecValTok"/>
+        </w:rPr>
+        <w:t xml:space="preserve">2</w:t>
+      </w:r>
+      <w:r>
+        <w:br/>
+      </w:r>
+      <w:r>
+        <w:rPr>
+          <w:rStyle w:val="NormalTok"/>
+        </w:rPr>
+        <w:t xml:space="preserve">b </w:t>
+      </w:r>
+      <w:r>
+        <w:rPr>
+          <w:rStyle w:val="OperatorTok"/>
+        </w:rPr>
+        <w:t xml:space="preserve">=</w:t>
+      </w:r>
+      <w:r>
+        <w:rPr>
+          <w:rStyle w:val="NormalTok"/>
+        </w:rPr>
+        <w:t xml:space="preserve"> </w:t>
+      </w:r>
+      <w:r>
+        <w:rPr>
+          <w:rStyle w:val="OperatorTok"/>
+        </w:rPr>
+        <w:t xml:space="preserve">-</w:t>
+      </w:r>
+      <w:r>
+        <w:rPr>
+          <w:rStyle w:val="DecValTok"/>
+        </w:rPr>
+        <w:t xml:space="preserve">3</w:t>
+      </w:r>
+      <w:r>
+        <w:br/>
+      </w:r>
+      <w:r>
+        <w:rPr>
+          <w:rStyle w:val="NormalTok"/>
+        </w:rPr>
+        <w:t xml:space="preserve">c0 </w:t>
+      </w:r>
+      <w:r>
+        <w:rPr>
+          <w:rStyle w:val="OperatorTok"/>
+        </w:rPr>
+        <w:t xml:space="preserve">=</w:t>
+      </w:r>
+      <w:r>
+        <w:rPr>
+          <w:rStyle w:val="NormalTok"/>
+        </w:rPr>
+        <w:t xml:space="preserve"> </w:t>
+      </w:r>
+      <w:r>
+        <w:rPr>
+          <w:rStyle w:val="DecValTok"/>
+        </w:rPr>
+        <w:t xml:space="preserve">5</w:t>
+      </w:r>
+      <w:r>
+        <w:br/>
+      </w:r>
+      <w:r>
+        <w:rPr>
+          <w:rStyle w:val="NormalTok"/>
+        </w:rPr>
+        <w:t xml:space="preserve">x </w:t>
+      </w:r>
+      <w:r>
+        <w:rPr>
+          <w:rStyle w:val="OperatorTok"/>
+        </w:rPr>
+        <w:t xml:space="preserve">=</w:t>
+      </w:r>
+      <w:r>
+        <w:rPr>
+          <w:rStyle w:val="NormalTok"/>
+        </w:rPr>
+        <w:t xml:space="preserve"> </w:t>
+      </w:r>
+      <w:r>
+        <w:rPr>
+          <w:rStyle w:val="FloatTok"/>
+        </w:rPr>
+        <w:t xml:space="preserve">1.5</w:t>
+      </w:r>
+      <w:r>
+        <w:br/>
+      </w:r>
+      <w:r>
+        <w:rPr>
+          <w:rStyle w:val="CommentTok"/>
+        </w:rPr>
+        <w:t xml:space="preserve"># Expanded form: 3 multiplications, 2 additions</w:t>
+      </w:r>
+      <w:r>
+        <w:br/>
+      </w:r>
+      <w:r>
+        <w:rPr>
+          <w:rStyle w:val="NormalTok"/>
+        </w:rPr>
+        <w:t xml:space="preserve">square_term </w:t>
+      </w:r>
+      <w:r>
+        <w:rPr>
+          <w:rStyle w:val="OperatorTok"/>
+        </w:rPr>
+        <w:t xml:space="preserve">=</w:t>
+      </w:r>
+      <w:r>
+        <w:rPr>
+          <w:rStyle w:val="NormalTok"/>
+        </w:rPr>
+        <w:t xml:space="preserve"> a </w:t>
+      </w:r>
+      <w:r>
+        <w:rPr>
+          <w:rStyle w:val="OperatorTok"/>
+        </w:rPr>
+        <w:t xml:space="preserve">*</w:t>
+      </w:r>
+      <w:r>
+        <w:rPr>
+          <w:rStyle w:val="NormalTok"/>
+        </w:rPr>
+        <w:t xml:space="preserve"> x </w:t>
+      </w:r>
+      <w:r>
+        <w:rPr>
+          <w:rStyle w:val="OperatorTok"/>
+        </w:rPr>
+        <w:t xml:space="preserve">*</w:t>
+      </w:r>
+      <w:r>
+        <w:rPr>
+          <w:rStyle w:val="NormalTok"/>
+        </w:rPr>
+        <w:t xml:space="preserve"> x</w:t>
+      </w:r>
+      <w:r>
+        <w:br/>
+      </w:r>
+      <w:r>
+        <w:rPr>
+          <w:rStyle w:val="NormalTok"/>
+        </w:rPr>
+        <w:t xml:space="preserve">linear_term </w:t>
+      </w:r>
+      <w:r>
+        <w:rPr>
+          <w:rStyle w:val="OperatorTok"/>
+        </w:rPr>
+        <w:t xml:space="preserve">=</w:t>
+      </w:r>
+      <w:r>
+        <w:rPr>
+          <w:rStyle w:val="NormalTok"/>
+        </w:rPr>
+        <w:t xml:space="preserve"> b </w:t>
+      </w:r>
+      <w:r>
+        <w:rPr>
+          <w:rStyle w:val="OperatorTok"/>
+        </w:rPr>
+        <w:t xml:space="preserve">*</w:t>
+      </w:r>
+      <w:r>
+        <w:rPr>
+          <w:rStyle w:val="NormalTok"/>
+        </w:rPr>
+        <w:t xml:space="preserve"> x</w:t>
+      </w:r>
+      <w:r>
+        <w:br/>
+      </w:r>
+      <w:r>
+        <w:rPr>
+          <w:rStyle w:val="NormalTok"/>
+        </w:rPr>
+        <w:t xml:space="preserve">expanded </w:t>
+      </w:r>
+      <w:r>
+        <w:rPr>
+          <w:rStyle w:val="OperatorTok"/>
+        </w:rPr>
+        <w:t xml:space="preserve">=</w:t>
+      </w:r>
+      <w:r>
+        <w:rPr>
+          <w:rStyle w:val="NormalTok"/>
+        </w:rPr>
+        <w:t xml:space="preserve"> square_term </w:t>
+      </w:r>
+      <w:r>
+        <w:rPr>
+          <w:rStyle w:val="OperatorTok"/>
+        </w:rPr>
+        <w:t xml:space="preserve">+</w:t>
+      </w:r>
+      <w:r>
+        <w:rPr>
+          <w:rStyle w:val="NormalTok"/>
+        </w:rPr>
+        <w:t xml:space="preserve"> linear_term </w:t>
+      </w:r>
+      <w:r>
+        <w:rPr>
+          <w:rStyle w:val="OperatorTok"/>
+        </w:rPr>
+        <w:t xml:space="preserve">+</w:t>
+      </w:r>
+      <w:r>
+        <w:rPr>
+          <w:rStyle w:val="NormalTok"/>
+        </w:rPr>
+        <w:t xml:space="preserve"> c0</w:t>
+      </w:r>
+      <w:r>
+        <w:br/>
+      </w:r>
+      <w:r>
+        <w:rPr>
+          <w:rStyle w:val="CommentTok"/>
+        </w:rPr>
+        <w:t xml:space="preserve"># Horner's form: 2 multiplications, 2 additions</w:t>
+      </w:r>
+      <w:r>
+        <w:br/>
+      </w:r>
+      <w:r>
+        <w:rPr>
+          <w:rStyle w:val="NormalTok"/>
+        </w:rPr>
+        <w:t xml:space="preserve">inner </w:t>
+      </w:r>
+      <w:r>
+        <w:rPr>
+          <w:rStyle w:val="OperatorTok"/>
+        </w:rPr>
+        <w:t xml:space="preserve">=</w:t>
+      </w:r>
+      <w:r>
+        <w:rPr>
+          <w:rStyle w:val="NormalTok"/>
+        </w:rPr>
+        <w:t xml:space="preserve"> a </w:t>
+      </w:r>
+      <w:r>
+        <w:rPr>
+          <w:rStyle w:val="OperatorTok"/>
+        </w:rPr>
+        <w:t xml:space="preserve">*</w:t>
+      </w:r>
+      <w:r>
+        <w:rPr>
+          <w:rStyle w:val="NormalTok"/>
+        </w:rPr>
+        <w:t xml:space="preserve"> x </w:t>
+      </w:r>
+      <w:r>
+        <w:rPr>
+          <w:rStyle w:val="OperatorTok"/>
+        </w:rPr>
+        <w:t xml:space="preserve">+</w:t>
+      </w:r>
+      <w:r>
+        <w:rPr>
+          <w:rStyle w:val="NormalTok"/>
+        </w:rPr>
+        <w:t xml:space="preserve"> b</w:t>
+      </w:r>
+      <w:r>
+        <w:br/>
+      </w:r>
+      <w:r>
+        <w:rPr>
+          <w:rStyle w:val="NormalTok"/>
+        </w:rPr>
+        <w:t xml:space="preserve">horner </w:t>
+      </w:r>
+      <w:r>
+        <w:rPr>
+          <w:rStyle w:val="OperatorTok"/>
+        </w:rPr>
+        <w:t xml:space="preserve">=</w:t>
+      </w:r>
+      <w:r>
+        <w:rPr>
+          <w:rStyle w:val="NormalTok"/>
+        </w:rPr>
+        <w:t xml:space="preserve"> inner </w:t>
+      </w:r>
+      <w:r>
+        <w:rPr>
+          <w:rStyle w:val="OperatorTok"/>
+        </w:rPr>
+        <w:t xml:space="preserve">*</w:t>
+      </w:r>
+      <w:r>
+        <w:rPr>
+          <w:rStyle w:val="NormalTok"/>
+        </w:rPr>
+        <w:t xml:space="preserve"> x </w:t>
+      </w:r>
+      <w:r>
+        <w:rPr>
+          <w:rStyle w:val="OperatorTok"/>
+        </w:rPr>
+        <w:t xml:space="preserve">+</w:t>
+      </w:r>
+      <w:r>
+        <w:rPr>
+          <w:rStyle w:val="NormalTok"/>
+        </w:rPr>
+        <w:t xml:space="preserve"> c0</w:t>
+      </w:r>
+      <w:r>
+        <w:br/>
+      </w:r>
+      <w:r>
+        <w:rPr>
+          <w:rStyle w:val="BuiltInTok"/>
+        </w:rPr>
+        <w:t xml:space="preserve">print</w:t>
+      </w:r>
+      <w:r>
+        <w:rPr>
+          <w:rStyle w:val="NormalTok"/>
+        </w:rPr>
+        <w:t xml:space="preserve">(square_term, linear_term, expanded)</w:t>
+      </w:r>
+      <w:r>
+        <w:br/>
+      </w:r>
+      <w:r>
+        <w:rPr>
+          <w:rStyle w:val="CommentTok"/>
+        </w:rPr>
+        <w:t xml:space="preserve">#&gt; 4.5 -4.5 5.0</w:t>
+      </w:r>
+      <w:r>
+        <w:br/>
+      </w:r>
+      <w:r>
+        <w:rPr>
+          <w:rStyle w:val="BuiltInTok"/>
+        </w:rPr>
+        <w:t xml:space="preserve">print</w:t>
+      </w:r>
+      <w:r>
+        <w:rPr>
+          <w:rStyle w:val="NormalTok"/>
+        </w:rPr>
+        <w:t xml:space="preserve">(inner, horner)</w:t>
+      </w:r>
+      <w:r>
+        <w:br/>
+      </w:r>
+      <w:r>
+        <w:rPr>
+          <w:rStyle w:val="CommentTok"/>
+        </w:rPr>
+        <w:t xml:space="preserve">#&gt; 0.0 5.0</w:t>
+      </w:r>
+    </w:p>
+    <w:p>
+      <w:pPr>
+        <w:pStyle w:val="FirstParagraph"/>
+      </w:pPr>
+      <w:r>
+        <w:t xml:space="preserve">The expanded form adds 4.5, -4.5 and 5 to reach 5.</w:t>
+      </w:r>
+      <w:r>
+        <w:t xml:space="preserve"> </w:t>
+      </w:r>
+      <w:r>
+        <w:t xml:space="preserve">Horner’s form multiplies 0 by 1.5 and adds 5 to reach 5.</w:t>
+      </w:r>
+      <w:r>
+        <w:t xml:space="preserve"> </w:t>
+      </w:r>
+      <w:r>
+        <w:t xml:space="preserve">Different steps give the same</w:t>
+      </w:r>
+      <w:r>
+        <w:t xml:space="preserve"> </w:t>
+      </w:r>
+      <w:hyperlink r:id="rId13">
+        <w:r>
+          <w:rPr>
+            <w:rStyle w:val="Hyperlink"/>
+          </w:rPr>
+          <w:t xml:space="preserve">value</w:t>
+        </w:r>
+      </w:hyperlink>
+      <w:r>
+        <w:t xml:space="preserve">.</w:t>
       </w:r>
     </w:p>
     <w:bookmarkEnd w:id="39"/>

</xml_diff>